<commit_message>
Phase 1.5: appearance themes, light/dark/system & branding
- Admin Settings -> Appearance: app name, default theme, logo/dark logo/favicon
  uploads (reusable Asset upload primitive + /api/asset/[id] serving route)
- Per-user prefs (cookie + persisted to account): language, theme override,
  color mode; 6 theme presets; no-flash inline script honors system pref
- Preferences menu in the top bar; top bar shows configured logo/app name
- Root layout wires lang/dir/data-theme/dark + dynamic title & favicon

Verified: tsc 0, next build clean, html attributes + branding confirmed via curl.

Co-Authored-By: Claude Opus 4.8 <noreply@anthropic.com>
</commit_message>
<xml_diff>
--- a/PDD.docx
+++ b/PDD.docx
@@ -115,6 +115,14 @@
           <w:bCs/>
         </w:rPr>
       </w:pPr>
+    </w:p>
+    <w:p>
+      <w:pPr>
+        <w:rPr>
+          <w:b/>
+          <w:bCs/>
+        </w:rPr>
+      </w:pPr>
       <w:r>
         <w:rPr>
           <w:b/>
@@ -443,12 +451,12 @@
           <w:b/>
           <w:bCs/>
         </w:rPr>
+        <w:lastRenderedPageBreak/>
         <w:t>Categories of modules</w:t>
       </w:r>
     </w:p>
     <w:p>
       <w:r>
-        <w:lastRenderedPageBreak/>
         <w:t>The application consists of 3 main types of modules;</w:t>
       </w:r>
       <w:r>
@@ -518,12 +526,28 @@
           <w:bCs/>
         </w:rPr>
       </w:pPr>
-      <w:r>
-        <w:rPr>
-          <w:b/>
-          <w:bCs/>
-        </w:rPr>
-        <w:t>Users,</w:t>
+      <w:proofErr w:type="gramStart"/>
+      <w:r>
+        <w:rPr>
+          <w:b/>
+          <w:bCs/>
+        </w:rPr>
+        <w:t>Users</w:t>
+      </w:r>
+      <w:proofErr w:type="gramEnd"/>
+      <w:r>
+        <w:rPr>
+          <w:b/>
+          <w:bCs/>
+        </w:rPr>
+        <w:t xml:space="preserve"> categories</w:t>
+      </w:r>
+      <w:r>
+        <w:rPr>
+          <w:b/>
+          <w:bCs/>
+        </w:rPr>
+        <w:t>,</w:t>
       </w:r>
     </w:p>
     <w:p>
@@ -768,6 +792,7 @@
         </w:numPr>
       </w:pPr>
       <w:r>
+        <w:lastRenderedPageBreak/>
         <w:t>Couriers</w:t>
       </w:r>
     </w:p>
@@ -780,155 +805,287 @@
         </w:numPr>
       </w:pPr>
       <w:r>
+        <w:t>Issues</w:t>
+      </w:r>
+    </w:p>
+    <w:p>
+      <w:pPr>
+        <w:pStyle w:val="ListParagraph"/>
+        <w:numPr>
+          <w:ilvl w:val="0"/>
+          <w:numId w:val="5"/>
+        </w:numPr>
+      </w:pPr>
+      <w:r>
+        <w:t>History</w:t>
+      </w:r>
+    </w:p>
+    <w:p>
+      <w:pPr>
+        <w:ind w:left="360"/>
+      </w:pPr>
+      <w:r>
+        <w:t>Administration</w:t>
+      </w:r>
+    </w:p>
+    <w:p>
+      <w:pPr>
+        <w:pStyle w:val="ListParagraph"/>
+        <w:numPr>
+          <w:ilvl w:val="0"/>
+          <w:numId w:val="5"/>
+        </w:numPr>
+      </w:pPr>
+      <w:r>
+        <w:t>Users</w:t>
+      </w:r>
+    </w:p>
+    <w:p>
+      <w:pPr>
+        <w:pStyle w:val="ListParagraph"/>
+        <w:numPr>
+          <w:ilvl w:val="0"/>
+          <w:numId w:val="5"/>
+        </w:numPr>
+      </w:pPr>
+      <w:r>
+        <w:t>Setting</w:t>
+      </w:r>
+    </w:p>
+    <w:p>
+      <w:pPr>
+        <w:rPr>
+          <w:lang w:bidi="ar-EG"/>
+        </w:rPr>
+      </w:pPr>
+    </w:p>
+    <w:p>
+      <w:pPr>
+        <w:rPr>
+          <w:b/>
+          <w:bCs/>
+        </w:rPr>
+      </w:pPr>
+      <w:r>
+        <w:rPr>
+          <w:b/>
+          <w:bCs/>
+        </w:rPr>
+        <w:t>Staff</w:t>
+      </w:r>
+    </w:p>
+    <w:p>
+      <w:r>
+        <w:t xml:space="preserve">Every employee will have a user account that </w:t>
+      </w:r>
+      <w:proofErr w:type="gramStart"/>
+      <w:r>
+        <w:t>have</w:t>
+      </w:r>
+      <w:proofErr w:type="gramEnd"/>
+      <w:r>
+        <w:t xml:space="preserve"> some permissions over some modules</w:t>
+      </w:r>
+    </w:p>
+    <w:p/>
+    <w:p>
+      <w:pPr>
+        <w:rPr>
+          <w:b/>
+          <w:bCs/>
+        </w:rPr>
+      </w:pPr>
+      <w:r>
+        <w:rPr>
+          <w:b/>
+          <w:bCs/>
+        </w:rPr>
+        <w:t>Units</w:t>
+      </w:r>
+    </w:p>
+    <w:p>
+      <w:pPr>
+        <w:rPr>
+          <w:rtl/>
+          <w:lang w:bidi="ar-EG"/>
+        </w:rPr>
+      </w:pPr>
+      <w:r>
+        <w:rPr>
+          <w:lang w:bidi="ar-EG"/>
+        </w:rPr>
+        <w:t xml:space="preserve">Items of </w:t>
+      </w:r>
+      <w:proofErr w:type="gramStart"/>
+      <w:r>
+        <w:rPr>
+          <w:lang w:bidi="ar-EG"/>
+        </w:rPr>
+        <w:t>products, they</w:t>
+      </w:r>
+      <w:proofErr w:type="gramEnd"/>
+      <w:r>
+        <w:rPr>
+          <w:lang w:bidi="ar-EG"/>
+        </w:rPr>
+        <w:t xml:space="preserve"> are the building block of the system while tracking inventory from point to point.</w:t>
+      </w:r>
+    </w:p>
+    <w:p/>
+    <w:p>
+      <w:pPr>
+        <w:rPr>
+          <w:b/>
+          <w:bCs/>
+        </w:rPr>
+      </w:pPr>
+      <w:r>
+        <w:rPr>
+          <w:b/>
+          <w:bCs/>
+        </w:rPr>
+        <w:t>Containers</w:t>
+      </w:r>
+    </w:p>
+    <w:p>
+      <w:r>
+        <w:t>Containers are baskets that carry the items from point to point during their pathway from supplier to customer. Supplier is the starting point, and customer is the ending point. In some cases, the item (product) lifecycle starts with a customer and ends with the customer. This case happens in Special Order – where customer ask us to buy a product for him and we go to supplier and order the product and handle the product from container to container till we reach the customer back.</w:t>
+      </w:r>
+    </w:p>
+    <w:p/>
+    <w:p>
+      <w:pPr>
+        <w:pStyle w:val="ListParagraph"/>
+        <w:numPr>
+          <w:ilvl w:val="0"/>
+          <w:numId w:val="2"/>
+        </w:numPr>
+      </w:pPr>
+      <w:r>
+        <w:t>Supplier</w:t>
+      </w:r>
+    </w:p>
+    <w:p>
+      <w:pPr>
+        <w:pStyle w:val="ListParagraph"/>
+        <w:numPr>
+          <w:ilvl w:val="0"/>
+          <w:numId w:val="2"/>
+        </w:numPr>
+      </w:pPr>
+      <w:r>
+        <w:t>Request</w:t>
+      </w:r>
+    </w:p>
+    <w:p>
+      <w:pPr>
+        <w:pStyle w:val="ListParagraph"/>
+        <w:numPr>
+          <w:ilvl w:val="0"/>
+          <w:numId w:val="2"/>
+        </w:numPr>
+      </w:pPr>
+      <w:r>
+        <w:t>Purchase</w:t>
+      </w:r>
+    </w:p>
+    <w:p>
+      <w:pPr>
+        <w:pStyle w:val="ListParagraph"/>
+        <w:numPr>
+          <w:ilvl w:val="0"/>
+          <w:numId w:val="2"/>
+        </w:numPr>
+      </w:pPr>
+      <w:r>
+        <w:t>Patch</w:t>
+      </w:r>
+    </w:p>
+    <w:p>
+      <w:pPr>
+        <w:pStyle w:val="ListParagraph"/>
+        <w:numPr>
+          <w:ilvl w:val="0"/>
+          <w:numId w:val="2"/>
+        </w:numPr>
+      </w:pPr>
+      <w:r>
+        <w:t>Travel</w:t>
+      </w:r>
+    </w:p>
+    <w:p>
+      <w:pPr>
+        <w:pStyle w:val="ListParagraph"/>
+        <w:numPr>
+          <w:ilvl w:val="0"/>
+          <w:numId w:val="2"/>
+        </w:numPr>
+      </w:pPr>
+      <w:r>
+        <w:t>Trip</w:t>
+      </w:r>
+    </w:p>
+    <w:p>
+      <w:pPr>
+        <w:pStyle w:val="ListParagraph"/>
+        <w:numPr>
+          <w:ilvl w:val="0"/>
+          <w:numId w:val="2"/>
+        </w:numPr>
+      </w:pPr>
+      <w:r>
+        <w:t>Hub – optional</w:t>
+      </w:r>
+    </w:p>
+    <w:p>
+      <w:pPr>
+        <w:pStyle w:val="ListParagraph"/>
+        <w:numPr>
+          <w:ilvl w:val="0"/>
+          <w:numId w:val="2"/>
+        </w:numPr>
+      </w:pPr>
+      <w:r>
+        <w:t>Transfer – optional</w:t>
+      </w:r>
+    </w:p>
+    <w:p>
+      <w:pPr>
+        <w:pStyle w:val="ListParagraph"/>
+        <w:numPr>
+          <w:ilvl w:val="0"/>
+          <w:numId w:val="2"/>
+        </w:numPr>
+      </w:pPr>
+      <w:r>
+        <w:t>Shipment</w:t>
+      </w:r>
+    </w:p>
+    <w:p>
+      <w:pPr>
+        <w:pStyle w:val="ListParagraph"/>
+        <w:numPr>
+          <w:ilvl w:val="0"/>
+          <w:numId w:val="2"/>
+        </w:numPr>
+      </w:pPr>
+      <w:r>
+        <w:t>Office</w:t>
+      </w:r>
+    </w:p>
+    <w:p>
+      <w:pPr>
+        <w:pStyle w:val="ListParagraph"/>
+        <w:numPr>
+          <w:ilvl w:val="0"/>
+          <w:numId w:val="2"/>
+        </w:numPr>
+      </w:pPr>
+      <w:r>
         <w:lastRenderedPageBreak/>
-        <w:t>Issues</w:t>
-      </w:r>
-    </w:p>
-    <w:p>
-      <w:pPr>
-        <w:pStyle w:val="ListParagraph"/>
-        <w:numPr>
-          <w:ilvl w:val="0"/>
-          <w:numId w:val="5"/>
-        </w:numPr>
-      </w:pPr>
-      <w:r>
-        <w:t>History</w:t>
-      </w:r>
-    </w:p>
-    <w:p>
-      <w:pPr>
-        <w:ind w:left="360"/>
-      </w:pPr>
-      <w:r>
-        <w:t>Administration</w:t>
-      </w:r>
-    </w:p>
-    <w:p>
-      <w:pPr>
-        <w:pStyle w:val="ListParagraph"/>
-        <w:numPr>
-          <w:ilvl w:val="0"/>
-          <w:numId w:val="5"/>
-        </w:numPr>
-      </w:pPr>
-      <w:r>
-        <w:t>Users</w:t>
-      </w:r>
-    </w:p>
-    <w:p>
-      <w:pPr>
-        <w:pStyle w:val="ListParagraph"/>
-        <w:numPr>
-          <w:ilvl w:val="0"/>
-          <w:numId w:val="5"/>
-        </w:numPr>
-      </w:pPr>
-      <w:r>
-        <w:t>Setting</w:t>
-      </w:r>
-    </w:p>
-    <w:p>
-      <w:pPr>
-        <w:rPr>
-          <w:lang w:bidi="ar-EG"/>
-        </w:rPr>
-      </w:pPr>
-    </w:p>
-    <w:p>
-      <w:pPr>
-        <w:rPr>
-          <w:b/>
-          <w:bCs/>
-        </w:rPr>
-      </w:pPr>
-      <w:r>
-        <w:rPr>
-          <w:b/>
-          <w:bCs/>
-        </w:rPr>
-        <w:t>Staff</w:t>
-      </w:r>
-    </w:p>
-    <w:p>
-      <w:r>
-        <w:t xml:space="preserve">Every employee will have a user account that </w:t>
-      </w:r>
-      <w:proofErr w:type="gramStart"/>
-      <w:r>
-        <w:t>have</w:t>
-      </w:r>
-      <w:proofErr w:type="gramEnd"/>
-      <w:r>
-        <w:t xml:space="preserve"> some permissions over some modules</w:t>
-      </w:r>
-    </w:p>
-    <w:p/>
-    <w:p>
-      <w:pPr>
-        <w:rPr>
-          <w:b/>
-          <w:bCs/>
-        </w:rPr>
-      </w:pPr>
-      <w:r>
-        <w:rPr>
-          <w:b/>
-          <w:bCs/>
-        </w:rPr>
-        <w:t>Units</w:t>
-      </w:r>
-    </w:p>
-    <w:p>
-      <w:pPr>
-        <w:rPr>
-          <w:rtl/>
-          <w:lang w:bidi="ar-EG"/>
-        </w:rPr>
-      </w:pPr>
-      <w:r>
-        <w:rPr>
-          <w:lang w:bidi="ar-EG"/>
-        </w:rPr>
-        <w:t xml:space="preserve">Items of </w:t>
-      </w:r>
-      <w:proofErr w:type="gramStart"/>
-      <w:r>
-        <w:rPr>
-          <w:lang w:bidi="ar-EG"/>
-        </w:rPr>
-        <w:t>products, they</w:t>
-      </w:r>
-      <w:proofErr w:type="gramEnd"/>
-      <w:r>
-        <w:rPr>
-          <w:lang w:bidi="ar-EG"/>
-        </w:rPr>
-        <w:t xml:space="preserve"> are the building block of the system while tracking inventory from point to point.</w:t>
-      </w:r>
-    </w:p>
-    <w:p/>
-    <w:p>
-      <w:pPr>
-        <w:rPr>
-          <w:b/>
-          <w:bCs/>
-        </w:rPr>
-      </w:pPr>
-      <w:r>
-        <w:rPr>
-          <w:b/>
-          <w:bCs/>
-        </w:rPr>
-        <w:t>Containers</w:t>
-      </w:r>
-    </w:p>
-    <w:p>
-      <w:r>
-        <w:t>Containers are baskets that carry the items from point to point during their pathway from supplier to customer. Supplier is the starting point, and customer is the ending point. In some cases, the item (product) lifecycle starts with a customer and ends with the customer. This case happens in Special Order – where customer ask us to buy a product for him and we go to supplier and order the product and handle the product from container to container till we reach the customer back.</w:t>
-      </w:r>
-    </w:p>
-    <w:p/>
+        <w:t>Website</w:t>
+      </w:r>
+    </w:p>
     <w:p>
       <w:pPr>
         <w:pStyle w:val="ListParagraph"/>
@@ -938,139 +1095,6 @@
         </w:numPr>
       </w:pPr>
       <w:r>
-        <w:t>Supplier</w:t>
-      </w:r>
-    </w:p>
-    <w:p>
-      <w:pPr>
-        <w:pStyle w:val="ListParagraph"/>
-        <w:numPr>
-          <w:ilvl w:val="0"/>
-          <w:numId w:val="2"/>
-        </w:numPr>
-      </w:pPr>
-      <w:r>
-        <w:t>Request</w:t>
-      </w:r>
-    </w:p>
-    <w:p>
-      <w:pPr>
-        <w:pStyle w:val="ListParagraph"/>
-        <w:numPr>
-          <w:ilvl w:val="0"/>
-          <w:numId w:val="2"/>
-        </w:numPr>
-      </w:pPr>
-      <w:r>
-        <w:t>Purchase</w:t>
-      </w:r>
-    </w:p>
-    <w:p>
-      <w:pPr>
-        <w:pStyle w:val="ListParagraph"/>
-        <w:numPr>
-          <w:ilvl w:val="0"/>
-          <w:numId w:val="2"/>
-        </w:numPr>
-      </w:pPr>
-      <w:r>
-        <w:t>Patch</w:t>
-      </w:r>
-    </w:p>
-    <w:p>
-      <w:pPr>
-        <w:pStyle w:val="ListParagraph"/>
-        <w:numPr>
-          <w:ilvl w:val="0"/>
-          <w:numId w:val="2"/>
-        </w:numPr>
-      </w:pPr>
-      <w:r>
-        <w:t>Travel</w:t>
-      </w:r>
-    </w:p>
-    <w:p>
-      <w:pPr>
-        <w:pStyle w:val="ListParagraph"/>
-        <w:numPr>
-          <w:ilvl w:val="0"/>
-          <w:numId w:val="2"/>
-        </w:numPr>
-      </w:pPr>
-      <w:r>
-        <w:t>Trip</w:t>
-      </w:r>
-    </w:p>
-    <w:p>
-      <w:pPr>
-        <w:pStyle w:val="ListParagraph"/>
-        <w:numPr>
-          <w:ilvl w:val="0"/>
-          <w:numId w:val="2"/>
-        </w:numPr>
-      </w:pPr>
-      <w:r>
-        <w:t>Hub – optional</w:t>
-      </w:r>
-    </w:p>
-    <w:p>
-      <w:pPr>
-        <w:pStyle w:val="ListParagraph"/>
-        <w:numPr>
-          <w:ilvl w:val="0"/>
-          <w:numId w:val="2"/>
-        </w:numPr>
-      </w:pPr>
-      <w:r>
-        <w:t>Transfer – optional</w:t>
-      </w:r>
-    </w:p>
-    <w:p>
-      <w:pPr>
-        <w:pStyle w:val="ListParagraph"/>
-        <w:numPr>
-          <w:ilvl w:val="0"/>
-          <w:numId w:val="2"/>
-        </w:numPr>
-      </w:pPr>
-      <w:r>
-        <w:t>Shipment</w:t>
-      </w:r>
-    </w:p>
-    <w:p>
-      <w:pPr>
-        <w:pStyle w:val="ListParagraph"/>
-        <w:numPr>
-          <w:ilvl w:val="0"/>
-          <w:numId w:val="2"/>
-        </w:numPr>
-      </w:pPr>
-      <w:r>
-        <w:t>Office</w:t>
-      </w:r>
-    </w:p>
-    <w:p>
-      <w:pPr>
-        <w:pStyle w:val="ListParagraph"/>
-        <w:numPr>
-          <w:ilvl w:val="0"/>
-          <w:numId w:val="2"/>
-        </w:numPr>
-      </w:pPr>
-      <w:r>
-        <w:t>Website</w:t>
-      </w:r>
-    </w:p>
-    <w:p>
-      <w:pPr>
-        <w:pStyle w:val="ListParagraph"/>
-        <w:numPr>
-          <w:ilvl w:val="0"/>
-          <w:numId w:val="2"/>
-        </w:numPr>
-      </w:pPr>
-      <w:r>
-        <w:lastRenderedPageBreak/>
         <w:t>Order</w:t>
       </w:r>
     </w:p>
@@ -1388,6 +1412,7 @@
         </w:numPr>
       </w:pPr>
       <w:r>
+        <w:lastRenderedPageBreak/>
         <w:t>Started shipping</w:t>
       </w:r>
     </w:p>
@@ -1400,7 +1425,6 @@
         </w:numPr>
       </w:pPr>
       <w:r>
-        <w:lastRenderedPageBreak/>
         <w:t>Completed shipping</w:t>
       </w:r>
     </w:p>
@@ -1831,6 +1855,7 @@
         </w:numPr>
       </w:pPr>
       <w:r>
+        <w:lastRenderedPageBreak/>
         <w:t>Errant</w:t>
       </w:r>
     </w:p>
@@ -1843,7 +1868,6 @@
         </w:numPr>
       </w:pPr>
       <w:r>
-        <w:lastRenderedPageBreak/>
         <w:t>Lost</w:t>
       </w:r>
     </w:p>
@@ -2125,6 +2149,7 @@
         </w:numPr>
       </w:pPr>
       <w:r>
+        <w:lastRenderedPageBreak/>
         <w:t xml:space="preserve">Trip &gt;&gt; Traveler </w:t>
       </w:r>
       <w:proofErr w:type="gramStart"/>
@@ -2145,7 +2170,6 @@
         </w:numPr>
       </w:pPr>
       <w:r>
-        <w:lastRenderedPageBreak/>
         <w:t>Hub – optional &gt;&gt; Hub Name</w:t>
       </w:r>
     </w:p>
@@ -2301,7 +2325,46 @@
     <w:p/>
     <w:p/>
     <w:p/>
+    <w:p>
+      <w:r>
+        <w:rPr>
+          <w:b/>
+          <w:bCs/>
+          <w:color w:val="196B24" w:themeColor="accent3"/>
+        </w:rPr>
+        <w:lastRenderedPageBreak/>
+        <w:t>Expenses Module</w:t>
+      </w:r>
+      <w:r>
+        <w:rPr>
+          <w:b/>
+          <w:bCs/>
+          <w:color w:val="196B24" w:themeColor="accent3"/>
+        </w:rPr>
+        <w:br/>
+      </w:r>
+      <w:r>
+        <w:t>A</w:t>
+      </w:r>
+    </w:p>
     <w:p/>
+    <w:p>
+      <w:pPr>
+        <w:rPr>
+          <w:b/>
+          <w:bCs/>
+          <w:color w:val="196B24" w:themeColor="accent3"/>
+        </w:rPr>
+      </w:pPr>
+      <w:r>
+        <w:rPr>
+          <w:b/>
+          <w:bCs/>
+          <w:color w:val="196B24" w:themeColor="accent3"/>
+        </w:rPr>
+        <w:br w:type="page"/>
+      </w:r>
+    </w:p>
     <w:p>
       <w:pPr>
         <w:rPr>
@@ -3042,25 +3105,7 @@
           <w:lang w:bidi="ar-EG"/>
         </w:rPr>
         <w:lastRenderedPageBreak/>
-        <w:t>Purchase Price</w:t>
-      </w:r>
-      <w:r>
-        <w:rPr>
-          <w:lang w:bidi="ar-EG"/>
-        </w:rPr>
-        <w:t xml:space="preserve"> [symbol in calculation formula ‘</w:t>
-      </w:r>
-      <w:r>
-        <w:rPr>
-          <w:lang w:bidi="ar-EG"/>
-        </w:rPr>
-        <w:t>P</w:t>
-      </w:r>
-      <w:r>
-        <w:rPr>
-          <w:lang w:bidi="ar-EG"/>
-        </w:rPr>
-        <w:t>’]</w:t>
+        <w:t>Purchase Price [symbol in calculation formula ‘P’]</w:t>
       </w:r>
     </w:p>
     <w:p>
@@ -3078,25 +3123,7 @@
         <w:rPr>
           <w:lang w:bidi="ar-EG"/>
         </w:rPr>
-        <w:t>Count</w:t>
-      </w:r>
-      <w:r>
-        <w:rPr>
-          <w:lang w:bidi="ar-EG"/>
-        </w:rPr>
-        <w:t xml:space="preserve"> [symbol in calculation formula ‘</w:t>
-      </w:r>
-      <w:r>
-        <w:rPr>
-          <w:lang w:bidi="ar-EG"/>
-        </w:rPr>
-        <w:t>C</w:t>
-      </w:r>
-      <w:r>
-        <w:rPr>
-          <w:lang w:bidi="ar-EG"/>
-        </w:rPr>
-        <w:t>’]</w:t>
+        <w:t>Count [symbol in calculation formula ‘C’]</w:t>
       </w:r>
     </w:p>
     <w:p>
@@ -3114,25 +3141,7 @@
         <w:rPr>
           <w:lang w:bidi="ar-EG"/>
         </w:rPr>
-        <w:t>Daily Dose</w:t>
-      </w:r>
-      <w:r>
-        <w:rPr>
-          <w:lang w:bidi="ar-EG"/>
-        </w:rPr>
-        <w:t xml:space="preserve"> [symbol in calculation formula ‘</w:t>
-      </w:r>
-      <w:r>
-        <w:rPr>
-          <w:lang w:bidi="ar-EG"/>
-        </w:rPr>
-        <w:t>D</w:t>
-      </w:r>
-      <w:r>
-        <w:rPr>
-          <w:lang w:bidi="ar-EG"/>
-        </w:rPr>
-        <w:t>’]</w:t>
+        <w:t>Daily Dose [symbol in calculation formula ‘D’]</w:t>
       </w:r>
     </w:p>
     <w:p>
@@ -3150,25 +3159,7 @@
         <w:rPr>
           <w:lang w:bidi="ar-EG"/>
         </w:rPr>
-        <w:t>Weight (grams)</w:t>
-      </w:r>
-      <w:r>
-        <w:rPr>
-          <w:lang w:bidi="ar-EG"/>
-        </w:rPr>
-        <w:t xml:space="preserve"> [symbol in calculation formula ‘</w:t>
-      </w:r>
-      <w:r>
-        <w:rPr>
-          <w:lang w:bidi="ar-EG"/>
-        </w:rPr>
-        <w:t>W</w:t>
-      </w:r>
-      <w:r>
-        <w:rPr>
-          <w:lang w:bidi="ar-EG"/>
-        </w:rPr>
-        <w:t>’]</w:t>
+        <w:t>Weight (grams) [symbol in calculation formula ‘W’]</w:t>
       </w:r>
     </w:p>
     <w:p>
@@ -3186,31 +3177,7 @@
         <w:rPr>
           <w:lang w:bidi="ar-EG"/>
         </w:rPr>
-        <w:t>Product shape</w:t>
-      </w:r>
-      <w:r>
-        <w:rPr>
-          <w:lang w:bidi="ar-EG"/>
-        </w:rPr>
-        <w:t xml:space="preserve"> [symbol in calculation formula ‘</w:t>
-      </w:r>
-      <w:r>
-        <w:rPr>
-          <w:lang w:bidi="ar-EG"/>
-        </w:rPr>
-        <w:t>S</w:t>
-      </w:r>
-      <w:r>
-        <w:rPr>
-          <w:lang w:bidi="ar-EG"/>
-        </w:rPr>
-        <w:t>’]</w:t>
-      </w:r>
-      <w:r>
-        <w:rPr>
-          <w:lang w:bidi="ar-EG"/>
-        </w:rPr>
-        <w:t xml:space="preserve"> – select from list (Capsules/Tablets, </w:t>
+        <w:t xml:space="preserve">Product shape [symbol in calculation formula ‘S’] – select from list (Capsules/Tablets, </w:t>
       </w:r>
       <w:proofErr w:type="spellStart"/>
       <w:r>
@@ -3248,13 +3215,7 @@
         <w:rPr>
           <w:lang w:bidi="ar-EG"/>
         </w:rPr>
-        <w:t xml:space="preserve">Packaging Material </w:t>
-      </w:r>
-      <w:r>
-        <w:rPr>
-          <w:lang w:bidi="ar-EG"/>
-        </w:rPr>
-        <w:t>[symbol in calculation formula ‘</w:t>
+        <w:t>Packaging Material [symbol in calculation formula ‘</w:t>
       </w:r>
       <w:r>
         <w:rPr>
@@ -3272,19 +3233,7 @@
         <w:rPr>
           <w:lang w:bidi="ar-EG"/>
         </w:rPr>
-        <w:t xml:space="preserve"> – each </w:t>
-      </w:r>
-      <w:r>
-        <w:rPr>
-          <w:lang w:bidi="ar-EG"/>
-        </w:rPr>
-        <w:t>packaging material</w:t>
-      </w:r>
-      <w:r>
-        <w:rPr>
-          <w:lang w:bidi="ar-EG"/>
-        </w:rPr>
-        <w:t xml:space="preserve"> has multiplier that can be edited in the admin side</w:t>
+        <w:t xml:space="preserve"> – each packaging material has multiplier that can be edited in the admin side</w:t>
       </w:r>
     </w:p>
     <w:p>
@@ -3302,13 +3251,7 @@
         <w:rPr>
           <w:lang w:bidi="ar-EG"/>
         </w:rPr>
-        <w:t xml:space="preserve">Size </w:t>
-      </w:r>
-      <w:r>
-        <w:rPr>
-          <w:lang w:bidi="ar-EG"/>
-        </w:rPr>
-        <w:t>[symbol in calculation formula ‘</w:t>
+        <w:t>Size [symbol in calculation formula ‘</w:t>
       </w:r>
       <w:r>
         <w:rPr>
@@ -3320,7 +3263,13 @@
         <w:rPr>
           <w:lang w:bidi="ar-EG"/>
         </w:rPr>
-        <w:t>’]</w:t>
+        <w:t xml:space="preserve">’] </w:t>
+      </w:r>
+      <w:r>
+        <w:rPr>
+          <w:lang w:bidi="ar-EG"/>
+        </w:rPr>
+        <w:t>–</w:t>
       </w:r>
       <w:r>
         <w:rPr>
@@ -3332,37 +3281,7 @@
         <w:rPr>
           <w:lang w:bidi="ar-EG"/>
         </w:rPr>
-        <w:t>–</w:t>
-      </w:r>
-      <w:r>
-        <w:rPr>
-          <w:lang w:bidi="ar-EG"/>
-        </w:rPr>
-        <w:t xml:space="preserve"> </w:t>
-      </w:r>
-      <w:r>
-        <w:rPr>
-          <w:lang w:bidi="ar-EG"/>
-        </w:rPr>
-        <w:t>select from list; Small, Normal, Big and Huge</w:t>
-      </w:r>
-      <w:r>
-        <w:rPr>
-          <w:lang w:bidi="ar-EG"/>
-        </w:rPr>
-        <w:t xml:space="preserve"> – each </w:t>
-      </w:r>
-      <w:r>
-        <w:rPr>
-          <w:lang w:bidi="ar-EG"/>
-        </w:rPr>
-        <w:t>size</w:t>
-      </w:r>
-      <w:r>
-        <w:rPr>
-          <w:lang w:bidi="ar-EG"/>
-        </w:rPr>
-        <w:t xml:space="preserve"> has multiplier that can be edited in the admin side</w:t>
+        <w:t>select from list; Small, Normal, Big and Huge – each size has multiplier that can be edited in the admin side</w:t>
       </w:r>
     </w:p>
     <w:p>
@@ -3380,13 +3299,7 @@
         <w:rPr>
           <w:lang w:bidi="ar-EG"/>
         </w:rPr>
-        <w:t xml:space="preserve">Male Support </w:t>
-      </w:r>
-      <w:r>
-        <w:rPr>
-          <w:lang w:bidi="ar-EG"/>
-        </w:rPr>
-        <w:t>[symbol in calculation formula ‘</w:t>
+        <w:t>Male Support [symbol in calculation formula ‘</w:t>
       </w:r>
       <w:r>
         <w:rPr>
@@ -3398,13 +3311,7 @@
         <w:rPr>
           <w:lang w:bidi="ar-EG"/>
         </w:rPr>
-        <w:t>’]</w:t>
-      </w:r>
-      <w:r>
-        <w:rPr>
-          <w:lang w:bidi="ar-EG"/>
-        </w:rPr>
-        <w:t xml:space="preserve"> – switch – if yes, </w:t>
+        <w:t xml:space="preserve">’] – switch – if yes, </w:t>
       </w:r>
       <w:r>
         <w:rPr>
@@ -3452,13 +3359,7 @@
         <w:rPr>
           <w:lang w:bidi="ar-EG"/>
         </w:rPr>
-        <w:t>Notes</w:t>
-      </w:r>
-      <w:r>
-        <w:rPr>
-          <w:lang w:bidi="ar-EG"/>
-        </w:rPr>
-        <w:t xml:space="preserve"> – doesn’t affect calculations, but still registered in History</w:t>
+        <w:t>Notes – doesn’t affect calculations, but still registered in History</w:t>
       </w:r>
     </w:p>
     <w:p>
@@ -3548,13 +3449,7 @@
         <w:rPr>
           <w:lang w:bidi="ar-EG"/>
         </w:rPr>
-        <w:t>’]</w:t>
-      </w:r>
-      <w:r>
-        <w:rPr>
-          <w:lang w:bidi="ar-EG"/>
-        </w:rPr>
-        <w:t>; as follows;</w:t>
+        <w:t>’]; as follows;</w:t>
       </w:r>
     </w:p>
     <w:p>
@@ -3590,25 +3485,7 @@
         <w:rPr>
           <w:lang w:bidi="ar-EG"/>
         </w:rPr>
-        <w:t xml:space="preserve">Dosage Cost </w:t>
-      </w:r>
-      <w:r>
-        <w:rPr>
-          <w:lang w:bidi="ar-EG"/>
-        </w:rPr>
-        <w:t>[symbol in calculation formula ‘G</w:t>
-      </w:r>
-      <w:r>
-        <w:rPr>
-          <w:lang w:bidi="ar-EG"/>
-        </w:rPr>
-        <w:t>C</w:t>
-      </w:r>
-      <w:r>
-        <w:rPr>
-          <w:lang w:bidi="ar-EG"/>
-        </w:rPr>
-        <w:t>’]</w:t>
+        <w:t>Dosage Cost [symbol in calculation formula ‘GC’]</w:t>
       </w:r>
     </w:p>
     <w:p>
@@ -3650,13 +3527,7 @@
         <w:rPr>
           <w:lang w:bidi="ar-EG"/>
         </w:rPr>
-        <w:t xml:space="preserve">if G = 1 &gt;&gt; GC = </w:t>
-      </w:r>
-      <w:r>
-        <w:rPr>
-          <w:lang w:bidi="ar-EG"/>
-        </w:rPr>
-        <w:t>31</w:t>
+        <w:t>if G = 1 &gt;&gt; GC = 31</w:t>
       </w:r>
     </w:p>
     <w:p>
@@ -3674,13 +3545,7 @@
         <w:rPr>
           <w:lang w:bidi="ar-EG"/>
         </w:rPr>
-        <w:t xml:space="preserve">if G = 1 &gt;&gt; GC = </w:t>
-      </w:r>
-      <w:r>
-        <w:rPr>
-          <w:lang w:bidi="ar-EG"/>
-        </w:rPr>
-        <w:t>0</w:t>
+        <w:t>if G = 1 &gt;&gt; GC = 0</w:t>
       </w:r>
     </w:p>
     <w:p>
@@ -3814,31 +3679,7 @@
         <w:rPr>
           <w:lang w:bidi="ar-EG"/>
         </w:rPr>
-        <w:t xml:space="preserve">Margin </w:t>
-      </w:r>
-      <w:r>
-        <w:rPr>
-          <w:lang w:bidi="ar-EG"/>
-        </w:rPr>
-        <w:t>[symbol in calculation formula ‘</w:t>
-      </w:r>
-      <w:r>
-        <w:rPr>
-          <w:lang w:bidi="ar-EG"/>
-        </w:rPr>
-        <w:t>M</w:t>
-      </w:r>
-      <w:r>
-        <w:rPr>
-          <w:lang w:bidi="ar-EG"/>
-        </w:rPr>
-        <w:t>]</w:t>
-      </w:r>
-      <w:r>
-        <w:rPr>
-          <w:lang w:bidi="ar-EG"/>
-        </w:rPr>
-        <w:t xml:space="preserve"> – value to be edited in admin panel, current value is 1.2</w:t>
+        <w:t>Margin [symbol in calculation formula ‘M] – value to be edited in admin panel, current value is 1.2</w:t>
       </w:r>
     </w:p>
     <w:p>
@@ -3868,25 +3709,7 @@
         <w:rPr>
           <w:lang w:bidi="ar-EG"/>
         </w:rPr>
-        <w:t>[symbol in calculation formula ‘</w:t>
-      </w:r>
-      <w:r>
-        <w:rPr>
-          <w:lang w:bidi="ar-EG"/>
-        </w:rPr>
-        <w:t>Inf’</w:t>
-      </w:r>
-      <w:r>
-        <w:rPr>
-          <w:lang w:bidi="ar-EG"/>
-        </w:rPr>
-        <w:t>] – value to be edited in admin panel, current value is 1.</w:t>
-      </w:r>
-      <w:r>
-        <w:rPr>
-          <w:lang w:bidi="ar-EG"/>
-        </w:rPr>
-        <w:t>05</w:t>
+        <w:t>[symbol in calculation formula ‘Inf’] – value to be edited in admin panel, current value is 1.05</w:t>
       </w:r>
     </w:p>
     <w:p>
@@ -3905,31 +3728,7 @@
           <w:lang w:bidi="ar-EG"/>
         </w:rPr>
         <w:lastRenderedPageBreak/>
-        <w:t xml:space="preserve">Flat Fees </w:t>
-      </w:r>
-      <w:r>
-        <w:rPr>
-          <w:lang w:bidi="ar-EG"/>
-        </w:rPr>
-        <w:t>[symbol in calculation formula ‘</w:t>
-      </w:r>
-      <w:r>
-        <w:rPr>
-          <w:lang w:bidi="ar-EG"/>
-        </w:rPr>
-        <w:t>FF’</w:t>
-      </w:r>
-      <w:r>
-        <w:rPr>
-          <w:lang w:bidi="ar-EG"/>
-        </w:rPr>
-        <w:t xml:space="preserve">] – value to be edited in admin panel, current value is </w:t>
-      </w:r>
-      <w:r>
-        <w:rPr>
-          <w:lang w:bidi="ar-EG"/>
-        </w:rPr>
-        <w:t>250</w:t>
+        <w:t>Flat Fees [symbol in calculation formula ‘FF’] – value to be edited in admin panel, current value is 250</w:t>
       </w:r>
     </w:p>
     <w:p>
@@ -3947,31 +3746,7 @@
         <w:rPr>
           <w:lang w:bidi="ar-EG"/>
         </w:rPr>
-        <w:t>Foreign Exchange</w:t>
-      </w:r>
-      <w:r>
-        <w:rPr>
-          <w:lang w:bidi="ar-EG"/>
-        </w:rPr>
-        <w:t xml:space="preserve"> [symbol in calculation formula ‘</w:t>
-      </w:r>
-      <w:r>
-        <w:rPr>
-          <w:lang w:bidi="ar-EG"/>
-        </w:rPr>
-        <w:t>FX’</w:t>
-      </w:r>
-      <w:r>
-        <w:rPr>
-          <w:lang w:bidi="ar-EG"/>
-        </w:rPr>
-        <w:t xml:space="preserve">] – value to be edited in admin panel, current value is </w:t>
-      </w:r>
-      <w:r>
-        <w:rPr>
-          <w:lang w:bidi="ar-EG"/>
-        </w:rPr>
-        <w:t>54</w:t>
+        <w:t>Foreign Exchange [symbol in calculation formula ‘FX’] – value to be edited in admin panel, current value is 54</w:t>
       </w:r>
     </w:p>
     <w:p>
@@ -3989,31 +3764,7 @@
         <w:rPr>
           <w:lang w:bidi="ar-EG"/>
         </w:rPr>
-        <w:t>Weigh Factor</w:t>
-      </w:r>
-      <w:r>
-        <w:rPr>
-          <w:lang w:bidi="ar-EG"/>
-        </w:rPr>
-        <w:t xml:space="preserve"> [symbol in calculation formula ‘</w:t>
-      </w:r>
-      <w:r>
-        <w:rPr>
-          <w:lang w:bidi="ar-EG"/>
-        </w:rPr>
-        <w:t>WF’</w:t>
-      </w:r>
-      <w:r>
-        <w:rPr>
-          <w:lang w:bidi="ar-EG"/>
-        </w:rPr>
-        <w:t xml:space="preserve">] – value to be edited in admin panel, current value is </w:t>
-      </w:r>
-      <w:r>
-        <w:rPr>
-          <w:lang w:bidi="ar-EG"/>
-        </w:rPr>
-        <w:t>40</w:t>
+        <w:t>Weigh Factor [symbol in calculation formula ‘WF’] – value to be edited in admin panel, current value is 40</w:t>
       </w:r>
     </w:p>
     <w:p>
@@ -4031,43 +3782,7 @@
         <w:rPr>
           <w:lang w:bidi="ar-EG"/>
         </w:rPr>
-        <w:t xml:space="preserve">Weight Cost </w:t>
-      </w:r>
-      <w:r>
-        <w:rPr>
-          <w:lang w:bidi="ar-EG"/>
-        </w:rPr>
-        <w:t>[symbol in calculation formula ‘</w:t>
-      </w:r>
-      <w:r>
-        <w:rPr>
-          <w:lang w:bidi="ar-EG"/>
-        </w:rPr>
-        <w:t>WC</w:t>
-      </w:r>
-      <w:r>
-        <w:rPr>
-          <w:lang w:bidi="ar-EG"/>
-        </w:rPr>
-        <w:t>]</w:t>
-      </w:r>
-      <w:r>
-        <w:rPr>
-          <w:lang w:bidi="ar-EG"/>
-        </w:rPr>
-        <w:t>,</w:t>
-      </w:r>
-      <w:r>
-        <w:rPr>
-          <w:lang w:bidi="ar-EG"/>
-        </w:rPr>
-        <w:t xml:space="preserve"> </w:t>
-      </w:r>
-      <w:r>
-        <w:rPr>
-          <w:lang w:bidi="ar-EG"/>
-        </w:rPr>
-        <w:t>WC = W * FX * WF / 1000</w:t>
+        <w:t>Weight Cost [symbol in calculation formula ‘WC], WC = W * FX * WF / 1000</w:t>
       </w:r>
     </w:p>
     <w:p>

</xml_diff>

<commit_message>
Phase 3 (UI): Expenses module pages (ported)
- Nav (dashboard/transactions/reports/reconciliation + admin tabs)
- Transactions: list, new (form + recent), detail/edit with edit-window rules,
  image+PDF attachments (reuses upload primitive), per-attachment + tx delete
- Dashboard (month totals, top categories, 6-month trend, latest reconciliation)
- Reports, Reconciliation (traffic-light), Monthly Sales + Bank Collections admin,
  Categories/Accounts CRUD, Audit log
- i18n EN/AR; mapped to 4-level expenses permissions
- Verified: tsc 0, 24/24 tests, next build clean (37 routes), pages render via curl

Co-Authored-By: Claude Opus 4.8 <noreply@anthropic.com>
</commit_message>
<xml_diff>
--- a/PDD.docx
+++ b/PDD.docx
@@ -16,7 +16,6 @@
         </w:rPr>
         <w:t xml:space="preserve">What is </w:t>
       </w:r>
-      <w:proofErr w:type="spellStart"/>
       <w:r>
         <w:rPr>
           <w:b/>
@@ -24,249 +23,248 @@
         </w:rPr>
         <w:t>YeldnIN</w:t>
       </w:r>
-      <w:proofErr w:type="spellEnd"/>
       <w:r>
         <w:rPr>
           <w:b/>
           <w:bCs/>
         </w:rPr>
-        <w:t xml:space="preserve"> </w:t>
-      </w:r>
-      <w:proofErr w:type="gramStart"/>
+        <w:t xml:space="preserve"> app ?</w:t>
+      </w:r>
+    </w:p>
+    <w:p>
+      <w:r>
+        <w:t xml:space="preserve">YeldnIN is the </w:t>
+      </w:r>
       <w:r>
         <w:rPr>
           <w:b/>
           <w:bCs/>
         </w:rPr>
-        <w:t>app ?</w:t>
-      </w:r>
-      <w:proofErr w:type="gramEnd"/>
-    </w:p>
-    <w:p>
-      <w:proofErr w:type="spellStart"/>
-      <w:r>
-        <w:t>YeldnIN</w:t>
-      </w:r>
-      <w:proofErr w:type="spellEnd"/>
-      <w:r>
-        <w:t xml:space="preserve"> is the </w:t>
+        <w:t>internal back-office platform for "Yeldn Health"</w:t>
+      </w:r>
+      <w:r>
+        <w:t xml:space="preserve">, an Egypt-based company that sells vitamins, supplements and health devices (brand: </w:t>
+      </w:r>
+      <w:r>
+        <w:rPr>
+          <w:i/>
+          <w:iCs/>
+        </w:rPr>
+        <w:t>Egypt Vitamins / EGV</w:t>
+      </w:r>
+      <w:r>
+        <w:t xml:space="preserve">) plus a second business line called </w:t>
       </w:r>
       <w:r>
         <w:rPr>
           <w:b/>
           <w:bCs/>
         </w:rPr>
-        <w:t>internal back-office platform for "</w:t>
-      </w:r>
-      <w:proofErr w:type="spellStart"/>
+        <w:t>XOONX</w:t>
+      </w:r>
+      <w:r>
+        <w:t xml:space="preserve"> (a global "order anything from world stores" service). The company sources products from suppliers abroad (USA / UK / EU) and brings them to Egypt mainly by </w:t>
+      </w:r>
       <w:r>
         <w:rPr>
           <w:b/>
           <w:bCs/>
         </w:rPr>
-        <w:t>Yeldn</w:t>
-      </w:r>
-      <w:proofErr w:type="spellEnd"/>
-      <w:r>
+        <w:t>travelers who physically carry items on trips</w:t>
+      </w:r>
+      <w:r>
+        <w:t>, then delivers to customers via its own couriers.</w:t>
+      </w:r>
+    </w:p>
+    <w:p>
+      <w:pPr>
         <w:rPr>
           <w:b/>
           <w:bCs/>
         </w:rPr>
-        <w:t xml:space="preserve"> Health"</w:t>
-      </w:r>
-      <w:r>
-        <w:t xml:space="preserve">, an Egypt-based company that sells vitamins, supplements and health devices (brand: </w:t>
-      </w:r>
-      <w:r>
-        <w:rPr>
-          <w:i/>
-          <w:iCs/>
-        </w:rPr>
-        <w:t>Egypt Vitamins / EGV</w:t>
-      </w:r>
-      <w:r>
-        <w:t xml:space="preserve">) plus a second business line called </w:t>
-      </w:r>
-      <w:r>
+      </w:pPr>
+    </w:p>
+    <w:p>
+      <w:pPr>
         <w:rPr>
           <w:b/>
           <w:bCs/>
         </w:rPr>
-        <w:t>XOONX</w:t>
-      </w:r>
-      <w:r>
-        <w:t xml:space="preserve"> (a global "order anything from world stores" service). The company sources products from suppliers abroad (USA / UK / EU) and brings them to Egypt mainly by </w:t>
-      </w:r>
+      </w:pPr>
       <w:r>
         <w:rPr>
           <w:b/>
           <w:bCs/>
         </w:rPr>
-        <w:t>travelers who physically carry items on trips</w:t>
-      </w:r>
-      <w:r>
-        <w:t>, then delivers to customers via its own couriers.</w:t>
-      </w:r>
-    </w:p>
-    <w:p>
-      <w:pPr>
+        <w:t>Workflow</w:t>
+      </w:r>
+    </w:p>
+    <w:p>
+      <w:r>
+        <w:t xml:space="preserve">Customer wants a product → </w:t>
+      </w:r>
+      <w:r>
         <w:rPr>
           <w:b/>
           <w:bCs/>
         </w:rPr>
-      </w:pPr>
-    </w:p>
-    <w:p>
-      <w:pPr>
+        <w:t>Sales</w:t>
+      </w:r>
+      <w:r>
+        <w:t xml:space="preserve"> logs a </w:t>
+      </w:r>
+      <w:r>
+        <w:t>R</w:t>
+      </w:r>
+      <w:r>
+        <w:t xml:space="preserve">equest → </w:t>
+      </w:r>
+      <w:r>
         <w:rPr>
           <w:b/>
           <w:bCs/>
         </w:rPr>
-      </w:pPr>
+        <w:t>Purchasing</w:t>
+      </w:r>
+      <w:r>
+        <w:t xml:space="preserve"> places supplier </w:t>
+      </w:r>
+      <w:r>
+        <w:t>Purchase</w:t>
+      </w:r>
+      <w:r>
+        <w:t xml:space="preserve"> → items ship to an </w:t>
+      </w:r>
+      <w:r>
+        <w:t xml:space="preserve">destination </w:t>
+      </w:r>
       <w:r>
         <w:rPr>
           <w:b/>
           <w:bCs/>
         </w:rPr>
-        <w:t>Workflow</w:t>
-      </w:r>
-    </w:p>
-    <w:p>
-      <w:r>
-        <w:t xml:space="preserve">Customer wants a product → </w:t>
+        <w:t>Office</w:t>
+      </w:r>
+      <w:r>
+        <w:t xml:space="preserve"> abroad </w:t>
+      </w:r>
+      <w:r>
+        <w:t xml:space="preserve">(to </w:t>
       </w:r>
       <w:r>
         <w:rPr>
           <w:b/>
           <w:bCs/>
         </w:rPr>
-        <w:t>Sales</w:t>
-      </w:r>
-      <w:r>
-        <w:t xml:space="preserve"> logs a </w:t>
-      </w:r>
-      <w:r>
-        <w:t>R</w:t>
-      </w:r>
-      <w:r>
-        <w:t xml:space="preserve">equest → </w:t>
+        <w:t>Transfer</w:t>
+      </w:r>
+      <w:r>
+        <w:t xml:space="preserve"> to a Traveler later) </w:t>
+      </w:r>
+      <w:r>
+        <w:t xml:space="preserve">or to </w:t>
+      </w:r>
+      <w:r>
+        <w:t>destination</w:t>
+      </w:r>
+      <w:r>
+        <w:t xml:space="preserve"> </w:t>
       </w:r>
       <w:r>
         <w:rPr>
           <w:b/>
           <w:bCs/>
         </w:rPr>
-        <w:t>Purchasing</w:t>
-      </w:r>
-      <w:r>
-        <w:t xml:space="preserve"> places supplier </w:t>
-      </w:r>
-      <w:r>
-        <w:t>Purchase</w:t>
-      </w:r>
-      <w:r>
-        <w:t xml:space="preserve"> → items ship to an </w:t>
-      </w:r>
-      <w:r>
-        <w:t xml:space="preserve">destination </w:t>
+        <w:t>Traveler</w:t>
+      </w:r>
+      <w:r>
+        <w:t xml:space="preserve"> (</w:t>
+      </w:r>
+      <w:r>
+        <w:t xml:space="preserve">To ship to Egypt in a </w:t>
       </w:r>
       <w:r>
         <w:rPr>
           <w:b/>
           <w:bCs/>
         </w:rPr>
-        <w:t>Office</w:t>
-      </w:r>
-      <w:r>
-        <w:t xml:space="preserve"> abroad </w:t>
-      </w:r>
-      <w:r>
-        <w:t xml:space="preserve">(to </w:t>
+        <w:t>Trip</w:t>
+      </w:r>
+      <w:r>
+        <w:t xml:space="preserve">) → </w:t>
       </w:r>
       <w:r>
         <w:rPr>
           <w:b/>
           <w:bCs/>
         </w:rPr>
-        <w:t>Transfer</w:t>
-      </w:r>
-      <w:r>
-        <w:t xml:space="preserve"> to a Traveler later) </w:t>
-      </w:r>
-      <w:r>
-        <w:t xml:space="preserve">or to </w:t>
-      </w:r>
-      <w:r>
-        <w:t>destination</w:t>
-      </w:r>
-      <w:r>
-        <w:t xml:space="preserve"> </w:t>
+        <w:t>Logistics</w:t>
+      </w:r>
+      <w:r>
+        <w:t>/</w:t>
       </w:r>
       <w:r>
         <w:rPr>
           <w:b/>
           <w:bCs/>
         </w:rPr>
-        <w:t>Traveler</w:t>
-      </w:r>
-      <w:r>
-        <w:t xml:space="preserve"> (</w:t>
-      </w:r>
-      <w:r>
-        <w:t xml:space="preserve">To ship to Egypt in a </w:t>
+        <w:t>Operations</w:t>
+      </w:r>
+      <w:r>
+        <w:t xml:space="preserve"> receive, </w:t>
+      </w:r>
+      <w:r>
+        <w:t xml:space="preserve">pickup and </w:t>
+      </w:r>
+      <w:r>
+        <w:t xml:space="preserve">photograph the inventory in Egypt → items go "on website" → </w:t>
       </w:r>
       <w:r>
         <w:rPr>
           <w:b/>
           <w:bCs/>
         </w:rPr>
-        <w:t>Trip</w:t>
-      </w:r>
-      <w:r>
-        <w:t xml:space="preserve">) → </w:t>
+        <w:t>Couriers</w:t>
+      </w:r>
+      <w:r>
+        <w:t xml:space="preserve"> deliver to the customer. Around this run </w:t>
       </w:r>
       <w:r>
         <w:rPr>
           <w:b/>
           <w:bCs/>
         </w:rPr>
-        <w:t>Logistics</w:t>
-      </w:r>
-      <w:r>
-        <w:t>/</w:t>
+        <w:t>Pricing</w:t>
+      </w:r>
+      <w:r>
+        <w:t xml:space="preserve">, </w:t>
       </w:r>
       <w:r>
         <w:rPr>
           <w:b/>
           <w:bCs/>
         </w:rPr>
-        <w:t>Operations</w:t>
-      </w:r>
-      <w:r>
-        <w:t xml:space="preserve"> receive, </w:t>
-      </w:r>
-      <w:r>
-        <w:t xml:space="preserve">pickup and </w:t>
-      </w:r>
-      <w:r>
-        <w:t xml:space="preserve">photograph the inventory in Egypt → items go "on website" → </w:t>
+        <w:t>Expenses/Finance</w:t>
+      </w:r>
+      <w:r>
+        <w:t xml:space="preserve">, </w:t>
       </w:r>
       <w:r>
         <w:rPr>
           <w:b/>
           <w:bCs/>
         </w:rPr>
-        <w:t>Couriers</w:t>
-      </w:r>
-      <w:r>
-        <w:t xml:space="preserve"> deliver to the customer. Around this run </w:t>
+        <w:t>Issues &amp; Compensations</w:t>
+      </w:r>
+      <w:r>
+        <w:t xml:space="preserve">, </w:t>
       </w:r>
       <w:r>
         <w:rPr>
           <w:b/>
           <w:bCs/>
         </w:rPr>
-        <w:t>Pricing</w:t>
+        <w:t>History</w:t>
       </w:r>
       <w:r>
         <w:t xml:space="preserve">, </w:t>
@@ -276,91 +274,122 @@
           <w:b/>
           <w:bCs/>
         </w:rPr>
-        <w:t>Expenses/Finance</w:t>
-      </w:r>
-      <w:r>
-        <w:t xml:space="preserve">, </w:t>
+        <w:t>Settings</w:t>
+      </w:r>
+      <w:r>
+        <w:t xml:space="preserve">, and </w:t>
       </w:r>
       <w:r>
         <w:rPr>
           <w:b/>
           <w:bCs/>
         </w:rPr>
-        <w:t>Issues &amp; Compensations</w:t>
-      </w:r>
-      <w:r>
-        <w:t xml:space="preserve">, </w:t>
+        <w:t>Users &amp; Privileges</w:t>
+      </w:r>
+      <w:r>
+        <w:t>.</w:t>
+      </w:r>
+    </w:p>
+    <w:p>
+      <w:r>
+        <w:t xml:space="preserve">It is </w:t>
       </w:r>
       <w:r>
         <w:rPr>
           <w:b/>
           <w:bCs/>
         </w:rPr>
-        <w:t>History</w:t>
-      </w:r>
-      <w:r>
-        <w:t xml:space="preserve">, </w:t>
+        <w:t>bilingual (English + Arabic, full RTL)</w:t>
+      </w:r>
+      <w:r>
+        <w:t xml:space="preserve">, an installable </w:t>
       </w:r>
       <w:r>
         <w:rPr>
           <w:b/>
           <w:bCs/>
         </w:rPr>
-        <w:t>Settings</w:t>
-      </w:r>
-      <w:r>
-        <w:t xml:space="preserve">, and </w:t>
-      </w:r>
-      <w:r>
+        <w:t>PWA</w:t>
+      </w:r>
+      <w:r>
+        <w:t xml:space="preserve"> with web push, and integrates with an external storefront ("Veeey")</w:t>
+      </w:r>
+      <w:r>
+        <w:t xml:space="preserve"> which is a full eCommerce platform</w:t>
+      </w:r>
+      <w:r>
+        <w:t>.</w:t>
+      </w:r>
+    </w:p>
+    <w:p/>
+    <w:p>
+      <w:pPr>
         <w:rPr>
           <w:b/>
           <w:bCs/>
         </w:rPr>
-        <w:t>Users &amp; Privileges</w:t>
-      </w:r>
-      <w:r>
-        <w:t>.</w:t>
-      </w:r>
-    </w:p>
-    <w:p>
-      <w:r>
-        <w:t xml:space="preserve">It is </w:t>
-      </w:r>
+      </w:pPr>
       <w:r>
         <w:rPr>
           <w:b/>
           <w:bCs/>
         </w:rPr>
-        <w:t>bilingual (English + Arabic, full RTL)</w:t>
-      </w:r>
-      <w:r>
-        <w:t xml:space="preserve">, an installable </w:t>
+        <w:t xml:space="preserve">Golden </w:t>
       </w:r>
       <w:r>
         <w:rPr>
           <w:b/>
           <w:bCs/>
         </w:rPr>
-        <w:t>PWA</w:t>
-      </w:r>
-      <w:r>
-        <w:t xml:space="preserve"> with web push, and integrates with an external storefront ("</w:t>
-      </w:r>
-      <w:proofErr w:type="spellStart"/>
-      <w:r>
-        <w:t>Veeey</w:t>
-      </w:r>
-      <w:proofErr w:type="spellEnd"/>
-      <w:r>
-        <w:t>")</w:t>
-      </w:r>
-      <w:r>
-        <w:t xml:space="preserve"> which is a full eCommerce platform</w:t>
-      </w:r>
-      <w:r>
-        <w:t>.</w:t>
-      </w:r>
-    </w:p>
+        <w:t>Conditions that apply throughout the whole applications:</w:t>
+      </w:r>
+    </w:p>
+    <w:p>
+      <w:pPr>
+        <w:pStyle w:val="ListParagraph"/>
+        <w:numPr>
+          <w:ilvl w:val="0"/>
+          <w:numId w:val="19"/>
+        </w:numPr>
+      </w:pPr>
+      <w:r>
+        <w:t>Whenever there is photo attachment to any container or unit, users can add photos by uploading, pasting or drag &amp; drop. Photos should appear as thumbnails on the page and user can click photo to show the big size photo. Users don’t need to download photos to show them. Users can upload multiple photos.</w:t>
+      </w:r>
+    </w:p>
+    <w:p>
+      <w:pPr>
+        <w:pStyle w:val="ListParagraph"/>
+        <w:numPr>
+          <w:ilvl w:val="0"/>
+          <w:numId w:val="19"/>
+        </w:numPr>
+      </w:pPr>
+      <w:r>
+        <w:t>Users in sales team should never have any access to logistics and purchasing. They shouldn’t know anything about Trips or Travelers.</w:t>
+      </w:r>
+    </w:p>
+    <w:p>
+      <w:pPr>
+        <w:pStyle w:val="ListParagraph"/>
+        <w:numPr>
+          <w:ilvl w:val="0"/>
+          <w:numId w:val="19"/>
+        </w:numPr>
+      </w:pPr>
+      <w:r>
+        <w:t xml:space="preserve">Application Unites (containers – from requests to shipments, items - products, and people – users and customers) should be interconnected so that users can click the name of any unit to go to its page. There are links for all connected units that user can click to go to these units. Connected units are units that have connection or relations with the current unit. </w:t>
+      </w:r>
+    </w:p>
+    <w:p>
+      <w:pPr>
+        <w:pStyle w:val="ListParagraph"/>
+        <w:numPr>
+          <w:ilvl w:val="0"/>
+          <w:numId w:val="19"/>
+        </w:numPr>
+      </w:pPr>
+    </w:p>
+    <w:p/>
     <w:p/>
     <w:p>
       <w:pPr>
@@ -374,72 +403,413 @@
           <w:b/>
           <w:bCs/>
         </w:rPr>
-        <w:t xml:space="preserve">Golden </w:t>
-      </w:r>
-      <w:r>
+        <w:lastRenderedPageBreak/>
+        <w:t>Categories of modules</w:t>
+      </w:r>
+    </w:p>
+    <w:p>
+      <w:r>
+        <w:t>The application consists of 3 main types of modules;</w:t>
+      </w:r>
+      <w:r>
+        <w:t xml:space="preserve"> (These categories don’t affect workflow at any time).</w:t>
+      </w:r>
+    </w:p>
+    <w:p>
+      <w:pPr>
+        <w:pStyle w:val="ListParagraph"/>
+        <w:numPr>
+          <w:ilvl w:val="0"/>
+          <w:numId w:val="6"/>
+        </w:numPr>
+      </w:pPr>
+      <w:r>
+        <w:t>Services</w:t>
+      </w:r>
+    </w:p>
+    <w:p>
+      <w:pPr>
+        <w:pStyle w:val="ListParagraph"/>
+        <w:numPr>
+          <w:ilvl w:val="0"/>
+          <w:numId w:val="6"/>
+        </w:numPr>
+      </w:pPr>
+      <w:r>
+        <w:t>Inventory</w:t>
+      </w:r>
+    </w:p>
+    <w:p>
+      <w:pPr>
+        <w:pStyle w:val="ListParagraph"/>
+        <w:numPr>
+          <w:ilvl w:val="0"/>
+          <w:numId w:val="6"/>
+        </w:numPr>
+      </w:pPr>
+      <w:r>
+        <w:t>People</w:t>
+      </w:r>
+    </w:p>
+    <w:p>
+      <w:pPr>
+        <w:pStyle w:val="ListParagraph"/>
+        <w:numPr>
+          <w:ilvl w:val="0"/>
+          <w:numId w:val="6"/>
+        </w:numPr>
+      </w:pPr>
+      <w:r>
+        <w:t>Settings</w:t>
+      </w:r>
+    </w:p>
+    <w:p>
+      <w:pPr>
+        <w:rPr>
+          <w:rtl/>
+          <w:lang w:bidi="ar-EG"/>
+        </w:rPr>
+      </w:pPr>
+    </w:p>
+    <w:p>
+      <w:pPr>
         <w:rPr>
           <w:b/>
           <w:bCs/>
         </w:rPr>
-        <w:t>Conditions that apply throughout the whole applications:</w:t>
-      </w:r>
-    </w:p>
-    <w:p>
-      <w:pPr>
-        <w:pStyle w:val="ListParagraph"/>
-        <w:numPr>
-          <w:ilvl w:val="0"/>
-          <w:numId w:val="19"/>
-        </w:numPr>
-      </w:pPr>
-      <w:r>
-        <w:t>Whenever there is photo attachment to any container or unit, users can add photos by uploading, pasting or drag &amp; drop. Photos should appear as thumbnails on the page and user can click photo to show the big size photo. Users don’t need to download photos to show them. Users can upload multiple photos.</w:t>
-      </w:r>
-    </w:p>
-    <w:p>
-      <w:pPr>
-        <w:pStyle w:val="ListParagraph"/>
-        <w:numPr>
-          <w:ilvl w:val="0"/>
-          <w:numId w:val="19"/>
-        </w:numPr>
-      </w:pPr>
-      <w:r>
-        <w:t>Users in sales team should never have any access to logistics and purchasing. They shouldn’t know anything about Trips or Travelers.</w:t>
-      </w:r>
-    </w:p>
-    <w:p>
-      <w:pPr>
-        <w:pStyle w:val="ListParagraph"/>
-        <w:numPr>
-          <w:ilvl w:val="0"/>
-          <w:numId w:val="19"/>
-        </w:numPr>
-      </w:pPr>
-      <w:r>
-        <w:t xml:space="preserve">Application Unites (containers – from requests to shipments, items - products, and people – users and customers) should be interconnected so that users can click the name of any unit to go to its page. There are links for all connected units that user can click to go to these units. Connected units are units that have </w:t>
-      </w:r>
-      <w:proofErr w:type="gramStart"/>
-      <w:r>
-        <w:t>connection</w:t>
-      </w:r>
-      <w:proofErr w:type="gramEnd"/>
-      <w:r>
-        <w:t xml:space="preserve"> or relations with the current unit. </w:t>
-      </w:r>
-    </w:p>
-    <w:p>
-      <w:pPr>
-        <w:pStyle w:val="ListParagraph"/>
-        <w:numPr>
-          <w:ilvl w:val="0"/>
-          <w:numId w:val="19"/>
-        </w:numPr>
-      </w:pPr>
+      </w:pPr>
+      <w:r>
+        <w:rPr>
+          <w:b/>
+          <w:bCs/>
+        </w:rPr>
+        <w:t>Users</w:t>
+      </w:r>
+      <w:r>
+        <w:rPr>
+          <w:b/>
+          <w:bCs/>
+        </w:rPr>
+        <w:t xml:space="preserve"> categories</w:t>
+      </w:r>
+      <w:r>
+        <w:rPr>
+          <w:b/>
+          <w:bCs/>
+        </w:rPr>
+        <w:t>,</w:t>
+      </w:r>
+    </w:p>
+    <w:p>
+      <w:pPr>
+        <w:pStyle w:val="ListParagraph"/>
+        <w:numPr>
+          <w:ilvl w:val="0"/>
+          <w:numId w:val="4"/>
+        </w:numPr>
+      </w:pPr>
+      <w:r>
+        <w:t>Super Administrators</w:t>
+      </w:r>
+    </w:p>
+    <w:p>
+      <w:pPr>
+        <w:pStyle w:val="ListParagraph"/>
+        <w:numPr>
+          <w:ilvl w:val="0"/>
+          <w:numId w:val="4"/>
+        </w:numPr>
+      </w:pPr>
+      <w:r>
+        <w:t>Administrators</w:t>
+      </w:r>
+    </w:p>
+    <w:p>
+      <w:pPr>
+        <w:pStyle w:val="ListParagraph"/>
+        <w:numPr>
+          <w:ilvl w:val="0"/>
+          <w:numId w:val="4"/>
+        </w:numPr>
+      </w:pPr>
+      <w:r>
+        <w:t>Users</w:t>
+      </w:r>
+    </w:p>
+    <w:p/>
+    <w:p>
+      <w:pPr>
+        <w:rPr>
+          <w:b/>
+          <w:bCs/>
+        </w:rPr>
+      </w:pPr>
+      <w:r>
+        <w:rPr>
+          <w:b/>
+          <w:bCs/>
+        </w:rPr>
+        <w:t>Teams</w:t>
+      </w:r>
+    </w:p>
+    <w:p>
+      <w:pPr>
+        <w:pStyle w:val="ListParagraph"/>
+        <w:numPr>
+          <w:ilvl w:val="0"/>
+          <w:numId w:val="3"/>
+        </w:numPr>
+      </w:pPr>
+      <w:r>
+        <w:t>Sales</w:t>
+      </w:r>
+    </w:p>
+    <w:p>
+      <w:pPr>
+        <w:pStyle w:val="ListParagraph"/>
+        <w:numPr>
+          <w:ilvl w:val="0"/>
+          <w:numId w:val="3"/>
+        </w:numPr>
+      </w:pPr>
+      <w:r>
+        <w:t>XOONX</w:t>
+      </w:r>
+    </w:p>
+    <w:p>
+      <w:pPr>
+        <w:pStyle w:val="ListParagraph"/>
+        <w:numPr>
+          <w:ilvl w:val="0"/>
+          <w:numId w:val="3"/>
+        </w:numPr>
+      </w:pPr>
+      <w:r>
+        <w:t>Purchasing</w:t>
+      </w:r>
+    </w:p>
+    <w:p>
+      <w:pPr>
+        <w:pStyle w:val="ListParagraph"/>
+        <w:numPr>
+          <w:ilvl w:val="0"/>
+          <w:numId w:val="3"/>
+        </w:numPr>
+      </w:pPr>
+      <w:r>
+        <w:t>Logistics</w:t>
+      </w:r>
+    </w:p>
+    <w:p>
+      <w:pPr>
+        <w:pStyle w:val="ListParagraph"/>
+        <w:numPr>
+          <w:ilvl w:val="0"/>
+          <w:numId w:val="3"/>
+        </w:numPr>
+      </w:pPr>
+      <w:r>
+        <w:t>Operations</w:t>
+      </w:r>
+    </w:p>
+    <w:p>
+      <w:pPr>
+        <w:pStyle w:val="ListParagraph"/>
+        <w:numPr>
+          <w:ilvl w:val="0"/>
+          <w:numId w:val="3"/>
+        </w:numPr>
+      </w:pPr>
+      <w:r>
+        <w:t>Couriers</w:t>
+      </w:r>
+    </w:p>
+    <w:p>
+      <w:pPr>
+        <w:pStyle w:val="ListParagraph"/>
+        <w:numPr>
+          <w:ilvl w:val="0"/>
+          <w:numId w:val="3"/>
+        </w:numPr>
+      </w:pPr>
+      <w:r>
+        <w:t>Development</w:t>
+      </w:r>
     </w:p>
     <w:p/>
     <w:p/>
     <w:p>
+      <w:r>
+        <w:t>Modules</w:t>
+      </w:r>
+    </w:p>
+    <w:p>
+      <w:r>
+        <w:tab/>
+        <w:t>Main Modules</w:t>
+      </w:r>
+    </w:p>
+    <w:p>
+      <w:pPr>
+        <w:pStyle w:val="ListParagraph"/>
+        <w:numPr>
+          <w:ilvl w:val="0"/>
+          <w:numId w:val="5"/>
+        </w:numPr>
+      </w:pPr>
+      <w:r>
+        <w:t>Pricing</w:t>
+      </w:r>
+    </w:p>
+    <w:p>
+      <w:pPr>
+        <w:pStyle w:val="ListParagraph"/>
+        <w:numPr>
+          <w:ilvl w:val="0"/>
+          <w:numId w:val="5"/>
+        </w:numPr>
+      </w:pPr>
+      <w:r>
+        <w:t>Expenses</w:t>
+      </w:r>
+    </w:p>
+    <w:p>
+      <w:pPr>
+        <w:pStyle w:val="ListParagraph"/>
+        <w:numPr>
+          <w:ilvl w:val="0"/>
+          <w:numId w:val="5"/>
+        </w:numPr>
+      </w:pPr>
+      <w:r>
+        <w:t>XOONX</w:t>
+      </w:r>
+    </w:p>
+    <w:p>
+      <w:pPr>
+        <w:pStyle w:val="ListParagraph"/>
+        <w:numPr>
+          <w:ilvl w:val="0"/>
+          <w:numId w:val="5"/>
+        </w:numPr>
+      </w:pPr>
+      <w:r>
+        <w:t>Sales</w:t>
+      </w:r>
+    </w:p>
+    <w:p>
+      <w:pPr>
+        <w:pStyle w:val="ListParagraph"/>
+        <w:numPr>
+          <w:ilvl w:val="0"/>
+          <w:numId w:val="5"/>
+        </w:numPr>
+      </w:pPr>
+      <w:r>
+        <w:t>Purchasing</w:t>
+      </w:r>
+    </w:p>
+    <w:p>
+      <w:pPr>
+        <w:pStyle w:val="ListParagraph"/>
+        <w:numPr>
+          <w:ilvl w:val="0"/>
+          <w:numId w:val="5"/>
+        </w:numPr>
+      </w:pPr>
+      <w:r>
+        <w:t>Logistics</w:t>
+      </w:r>
+    </w:p>
+    <w:p>
+      <w:pPr>
+        <w:pStyle w:val="ListParagraph"/>
+        <w:numPr>
+          <w:ilvl w:val="0"/>
+          <w:numId w:val="5"/>
+        </w:numPr>
+      </w:pPr>
+      <w:r>
+        <w:t>Operations</w:t>
+      </w:r>
+    </w:p>
+    <w:p>
+      <w:pPr>
+        <w:pStyle w:val="ListParagraph"/>
+        <w:numPr>
+          <w:ilvl w:val="0"/>
+          <w:numId w:val="5"/>
+        </w:numPr>
+      </w:pPr>
+      <w:r>
+        <w:lastRenderedPageBreak/>
+        <w:t>Couriers</w:t>
+      </w:r>
+    </w:p>
+    <w:p>
+      <w:pPr>
+        <w:pStyle w:val="ListParagraph"/>
+        <w:numPr>
+          <w:ilvl w:val="0"/>
+          <w:numId w:val="5"/>
+        </w:numPr>
+      </w:pPr>
+      <w:r>
+        <w:t>Issues</w:t>
+      </w:r>
+    </w:p>
+    <w:p>
+      <w:pPr>
+        <w:pStyle w:val="ListParagraph"/>
+        <w:numPr>
+          <w:ilvl w:val="0"/>
+          <w:numId w:val="5"/>
+        </w:numPr>
+      </w:pPr>
+      <w:r>
+        <w:t>History</w:t>
+      </w:r>
+    </w:p>
+    <w:p>
+      <w:pPr>
+        <w:ind w:left="360"/>
+      </w:pPr>
+      <w:r>
+        <w:t>Administration</w:t>
+      </w:r>
+    </w:p>
+    <w:p>
+      <w:pPr>
+        <w:pStyle w:val="ListParagraph"/>
+        <w:numPr>
+          <w:ilvl w:val="0"/>
+          <w:numId w:val="5"/>
+        </w:numPr>
+      </w:pPr>
+      <w:r>
+        <w:t>Users</w:t>
+      </w:r>
+    </w:p>
+    <w:p>
+      <w:pPr>
+        <w:pStyle w:val="ListParagraph"/>
+        <w:numPr>
+          <w:ilvl w:val="0"/>
+          <w:numId w:val="5"/>
+        </w:numPr>
+      </w:pPr>
+      <w:r>
+        <w:t>Setting</w:t>
+      </w:r>
+    </w:p>
+    <w:p>
+      <w:pPr>
+        <w:rPr>
+          <w:lang w:bidi="ar-EG"/>
+        </w:rPr>
+      </w:pPr>
+    </w:p>
+    <w:p>
       <w:pPr>
         <w:rPr>
           <w:b/>
@@ -451,74 +821,15 @@
           <w:b/>
           <w:bCs/>
         </w:rPr>
-        <w:lastRenderedPageBreak/>
-        <w:t>Categories of modules</w:t>
-      </w:r>
-    </w:p>
-    <w:p>
-      <w:r>
-        <w:t>The application consists of 3 main types of modules;</w:t>
-      </w:r>
-      <w:r>
-        <w:t xml:space="preserve"> (These categories don’t affect workflow at any time).</w:t>
-      </w:r>
-    </w:p>
-    <w:p>
-      <w:pPr>
-        <w:pStyle w:val="ListParagraph"/>
-        <w:numPr>
-          <w:ilvl w:val="0"/>
-          <w:numId w:val="6"/>
-        </w:numPr>
-      </w:pPr>
-      <w:r>
-        <w:t>Services</w:t>
-      </w:r>
-    </w:p>
-    <w:p>
-      <w:pPr>
-        <w:pStyle w:val="ListParagraph"/>
-        <w:numPr>
-          <w:ilvl w:val="0"/>
-          <w:numId w:val="6"/>
-        </w:numPr>
-      </w:pPr>
-      <w:r>
-        <w:t>Inventory</w:t>
-      </w:r>
-    </w:p>
-    <w:p>
-      <w:pPr>
-        <w:pStyle w:val="ListParagraph"/>
-        <w:numPr>
-          <w:ilvl w:val="0"/>
-          <w:numId w:val="6"/>
-        </w:numPr>
-      </w:pPr>
-      <w:r>
-        <w:t>People</w:t>
-      </w:r>
-    </w:p>
-    <w:p>
-      <w:pPr>
-        <w:pStyle w:val="ListParagraph"/>
-        <w:numPr>
-          <w:ilvl w:val="0"/>
-          <w:numId w:val="6"/>
-        </w:numPr>
-      </w:pPr>
-      <w:r>
-        <w:t>Settings</w:t>
-      </w:r>
-    </w:p>
-    <w:p>
-      <w:pPr>
-        <w:rPr>
-          <w:rtl/>
-          <w:lang w:bidi="ar-EG"/>
-        </w:rPr>
-      </w:pPr>
-    </w:p>
+        <w:t>Staff</w:t>
+      </w:r>
+    </w:p>
+    <w:p>
+      <w:r>
+        <w:t>Every employee will have a user account that have some permissions over some modules</w:t>
+      </w:r>
+    </w:p>
+    <w:p/>
     <w:p>
       <w:pPr>
         <w:rPr>
@@ -526,64 +837,297 @@
           <w:bCs/>
         </w:rPr>
       </w:pPr>
-      <w:proofErr w:type="gramStart"/>
       <w:r>
         <w:rPr>
           <w:b/>
           <w:bCs/>
         </w:rPr>
-        <w:t>Users</w:t>
-      </w:r>
-      <w:proofErr w:type="gramEnd"/>
-      <w:r>
+        <w:t>Units</w:t>
+      </w:r>
+    </w:p>
+    <w:p>
+      <w:pPr>
+        <w:rPr>
+          <w:rtl/>
+          <w:lang w:bidi="ar-EG"/>
+        </w:rPr>
+      </w:pPr>
+      <w:r>
+        <w:rPr>
+          <w:lang w:bidi="ar-EG"/>
+        </w:rPr>
+        <w:t>Items of products, they are the building block of the system while tracking inventory from point to point.</w:t>
+      </w:r>
+    </w:p>
+    <w:p/>
+    <w:p>
+      <w:pPr>
         <w:rPr>
           <w:b/>
           <w:bCs/>
         </w:rPr>
-        <w:t xml:space="preserve"> categories</w:t>
-      </w:r>
+      </w:pPr>
       <w:r>
         <w:rPr>
           <w:b/>
           <w:bCs/>
         </w:rPr>
-        <w:t>,</w:t>
-      </w:r>
-    </w:p>
-    <w:p>
-      <w:pPr>
-        <w:pStyle w:val="ListParagraph"/>
-        <w:numPr>
-          <w:ilvl w:val="0"/>
-          <w:numId w:val="4"/>
-        </w:numPr>
-      </w:pPr>
-      <w:r>
-        <w:t>Super Administrators</w:t>
-      </w:r>
-    </w:p>
-    <w:p>
-      <w:pPr>
-        <w:pStyle w:val="ListParagraph"/>
-        <w:numPr>
-          <w:ilvl w:val="0"/>
-          <w:numId w:val="4"/>
-        </w:numPr>
-      </w:pPr>
-      <w:r>
-        <w:t>Administrators</w:t>
-      </w:r>
-    </w:p>
-    <w:p>
-      <w:pPr>
-        <w:pStyle w:val="ListParagraph"/>
-        <w:numPr>
-          <w:ilvl w:val="0"/>
-          <w:numId w:val="4"/>
-        </w:numPr>
-      </w:pPr>
-      <w:r>
-        <w:t>Users</w:t>
+        <w:t>Containers</w:t>
+      </w:r>
+    </w:p>
+    <w:p>
+      <w:r>
+        <w:t>Containers are baskets that carry the items from point to point during their pathway from supplier to customer. Supplier is the starting point, and customer is the ending point. In some cases, the item (product) lifecycle starts with a customer and ends with the customer. This case happens in Special Order – where customer ask us to buy a product for him and we go to supplier and order the product and handle the product from container to container till we reach the customer back.</w:t>
+      </w:r>
+    </w:p>
+    <w:p/>
+    <w:p>
+      <w:pPr>
+        <w:pStyle w:val="ListParagraph"/>
+      </w:pPr>
+      <w:r>
+        <w:t>Supplier</w:t>
+      </w:r>
+    </w:p>
+    <w:p>
+      <w:pPr>
+        <w:pStyle w:val="ListParagraph"/>
+        <w:numPr>
+          <w:ilvl w:val="0"/>
+          <w:numId w:val="2"/>
+        </w:numPr>
+      </w:pPr>
+      <w:r>
+        <w:t>Request</w:t>
+      </w:r>
+    </w:p>
+    <w:p>
+      <w:pPr>
+        <w:pStyle w:val="ListParagraph"/>
+        <w:numPr>
+          <w:ilvl w:val="0"/>
+          <w:numId w:val="2"/>
+        </w:numPr>
+      </w:pPr>
+      <w:r>
+        <w:t>Purchase</w:t>
+      </w:r>
+    </w:p>
+    <w:p>
+      <w:pPr>
+        <w:pStyle w:val="ListParagraph"/>
+        <w:numPr>
+          <w:ilvl w:val="0"/>
+          <w:numId w:val="2"/>
+        </w:numPr>
+      </w:pPr>
+      <w:r>
+        <w:t>Patch</w:t>
+      </w:r>
+    </w:p>
+    <w:p>
+      <w:pPr>
+        <w:pStyle w:val="ListParagraph"/>
+        <w:numPr>
+          <w:ilvl w:val="0"/>
+          <w:numId w:val="2"/>
+        </w:numPr>
+      </w:pPr>
+      <w:r>
+        <w:t>Travel</w:t>
+      </w:r>
+      <w:r>
+        <w:t>er</w:t>
+      </w:r>
+    </w:p>
+    <w:p>
+      <w:pPr>
+        <w:pStyle w:val="ListParagraph"/>
+        <w:numPr>
+          <w:ilvl w:val="0"/>
+          <w:numId w:val="2"/>
+        </w:numPr>
+      </w:pPr>
+      <w:r>
+        <w:t>Trip</w:t>
+      </w:r>
+    </w:p>
+    <w:p>
+      <w:pPr>
+        <w:pStyle w:val="ListParagraph"/>
+        <w:numPr>
+          <w:ilvl w:val="0"/>
+          <w:numId w:val="2"/>
+        </w:numPr>
+      </w:pPr>
+      <w:r>
+        <w:t>Hub – optional</w:t>
+      </w:r>
+    </w:p>
+    <w:p>
+      <w:pPr>
+        <w:pStyle w:val="ListParagraph"/>
+        <w:numPr>
+          <w:ilvl w:val="0"/>
+          <w:numId w:val="2"/>
+        </w:numPr>
+      </w:pPr>
+      <w:r>
+        <w:t>Transfer – optional</w:t>
+      </w:r>
+    </w:p>
+    <w:p>
+      <w:pPr>
+        <w:pStyle w:val="ListParagraph"/>
+        <w:numPr>
+          <w:ilvl w:val="0"/>
+          <w:numId w:val="2"/>
+        </w:numPr>
+      </w:pPr>
+      <w:r>
+        <w:t>Shipment</w:t>
+      </w:r>
+    </w:p>
+    <w:p>
+      <w:pPr>
+        <w:pStyle w:val="ListParagraph"/>
+        <w:numPr>
+          <w:ilvl w:val="0"/>
+          <w:numId w:val="2"/>
+        </w:numPr>
+      </w:pPr>
+      <w:r>
+        <w:t>Office</w:t>
+      </w:r>
+    </w:p>
+    <w:p>
+      <w:pPr>
+        <w:pStyle w:val="ListParagraph"/>
+      </w:pPr>
+      <w:r>
+        <w:lastRenderedPageBreak/>
+        <w:t>Website</w:t>
+      </w:r>
+    </w:p>
+    <w:p>
+      <w:r>
+        <w:t>Products go from website to customer through these steps;</w:t>
+      </w:r>
+    </w:p>
+    <w:p>
+      <w:pPr>
+        <w:pStyle w:val="ListParagraph"/>
+        <w:numPr>
+          <w:ilvl w:val="0"/>
+          <w:numId w:val="23"/>
+        </w:numPr>
+      </w:pPr>
+      <w:r>
+        <w:t>Order</w:t>
+      </w:r>
+    </w:p>
+    <w:p>
+      <w:pPr>
+        <w:pStyle w:val="ListParagraph"/>
+        <w:numPr>
+          <w:ilvl w:val="0"/>
+          <w:numId w:val="23"/>
+        </w:numPr>
+      </w:pPr>
+      <w:r>
+        <w:t>Delivery</w:t>
+      </w:r>
+    </w:p>
+    <w:p>
+      <w:pPr>
+        <w:pStyle w:val="ListParagraph"/>
+        <w:numPr>
+          <w:ilvl w:val="0"/>
+          <w:numId w:val="23"/>
+        </w:numPr>
+      </w:pPr>
+      <w:r>
+        <w:t>Courier</w:t>
+      </w:r>
+    </w:p>
+    <w:p>
+      <w:pPr>
+        <w:pStyle w:val="ListParagraph"/>
+      </w:pPr>
+      <w:r>
+        <w:t>Customer</w:t>
+      </w:r>
+    </w:p>
+    <w:p>
+      <w:r>
+        <w:t>And 3 other containers</w:t>
+      </w:r>
+    </w:p>
+    <w:p>
+      <w:pPr>
+        <w:pStyle w:val="ListParagraph"/>
+        <w:numPr>
+          <w:ilvl w:val="0"/>
+          <w:numId w:val="24"/>
+        </w:numPr>
+      </w:pPr>
+      <w:r>
+        <w:t>Lost</w:t>
+      </w:r>
+    </w:p>
+    <w:p>
+      <w:pPr>
+        <w:pStyle w:val="ListParagraph"/>
+        <w:numPr>
+          <w:ilvl w:val="0"/>
+          <w:numId w:val="24"/>
+        </w:numPr>
+      </w:pPr>
+      <w:r>
+        <w:t>Damaged</w:t>
+      </w:r>
+    </w:p>
+    <w:p>
+      <w:pPr>
+        <w:pStyle w:val="ListParagraph"/>
+        <w:numPr>
+          <w:ilvl w:val="0"/>
+          <w:numId w:val="24"/>
+        </w:numPr>
+      </w:pPr>
+      <w:r>
+        <w:t>Errant</w:t>
+      </w:r>
+    </w:p>
+    <w:p>
+      <w:r>
+        <w:t>And flags;</w:t>
+      </w:r>
+    </w:p>
+    <w:p>
+      <w:pPr>
+        <w:pStyle w:val="ListParagraph"/>
+        <w:numPr>
+          <w:ilvl w:val="0"/>
+          <w:numId w:val="25"/>
+        </w:numPr>
+      </w:pPr>
+      <w:r>
+        <w:t>Delay</w:t>
+      </w:r>
+    </w:p>
+    <w:p/>
+    <w:p>
+      <w:r>
+        <w:t>Statuses</w:t>
+      </w:r>
+    </w:p>
+    <w:p>
+      <w:pPr>
+        <w:ind w:firstLine="720"/>
+      </w:pPr>
+      <w:r>
+        <w:t>Sales Side</w:t>
       </w:r>
     </w:p>
     <w:p/>
@@ -599,1477 +1143,864 @@
           <w:b/>
           <w:bCs/>
         </w:rPr>
-        <w:t>Teams</w:t>
-      </w:r>
-    </w:p>
-    <w:p>
-      <w:pPr>
-        <w:pStyle w:val="ListParagraph"/>
-        <w:numPr>
-          <w:ilvl w:val="0"/>
-          <w:numId w:val="3"/>
-        </w:numPr>
-      </w:pPr>
-      <w:r>
-        <w:t>Sales</w:t>
-      </w:r>
-    </w:p>
-    <w:p>
-      <w:pPr>
-        <w:pStyle w:val="ListParagraph"/>
-        <w:numPr>
-          <w:ilvl w:val="0"/>
-          <w:numId w:val="3"/>
-        </w:numPr>
-      </w:pPr>
-      <w:r>
-        <w:t>XOONX</w:t>
-      </w:r>
-    </w:p>
-    <w:p>
-      <w:pPr>
-        <w:pStyle w:val="ListParagraph"/>
-        <w:numPr>
-          <w:ilvl w:val="0"/>
-          <w:numId w:val="3"/>
-        </w:numPr>
-      </w:pPr>
-      <w:r>
-        <w:t>Purchasing</w:t>
-      </w:r>
-    </w:p>
-    <w:p>
-      <w:pPr>
-        <w:pStyle w:val="ListParagraph"/>
-        <w:numPr>
-          <w:ilvl w:val="0"/>
-          <w:numId w:val="3"/>
-        </w:numPr>
-      </w:pPr>
-      <w:r>
-        <w:t>Logistics</w:t>
-      </w:r>
-    </w:p>
-    <w:p>
-      <w:pPr>
-        <w:pStyle w:val="ListParagraph"/>
-        <w:numPr>
-          <w:ilvl w:val="0"/>
-          <w:numId w:val="3"/>
-        </w:numPr>
-      </w:pPr>
-      <w:r>
-        <w:t>Operations</w:t>
-      </w:r>
-    </w:p>
-    <w:p>
-      <w:pPr>
-        <w:pStyle w:val="ListParagraph"/>
-        <w:numPr>
-          <w:ilvl w:val="0"/>
-          <w:numId w:val="3"/>
-        </w:numPr>
-      </w:pPr>
-      <w:r>
-        <w:t>Couriers</w:t>
-      </w:r>
-    </w:p>
-    <w:p>
-      <w:pPr>
-        <w:pStyle w:val="ListParagraph"/>
-        <w:numPr>
-          <w:ilvl w:val="0"/>
-          <w:numId w:val="3"/>
-        </w:numPr>
-      </w:pPr>
-      <w:r>
-        <w:t>Development</w:t>
+        <w:t>Items</w:t>
+      </w:r>
+    </w:p>
+    <w:p>
+      <w:pPr>
+        <w:pStyle w:val="ListParagraph"/>
+        <w:numPr>
+          <w:ilvl w:val="0"/>
+          <w:numId w:val="12"/>
+        </w:numPr>
+      </w:pPr>
+      <w:r>
+        <w:t>Requested</w:t>
+      </w:r>
+    </w:p>
+    <w:p>
+      <w:pPr>
+        <w:pStyle w:val="ListParagraph"/>
+        <w:numPr>
+          <w:ilvl w:val="0"/>
+          <w:numId w:val="12"/>
+        </w:numPr>
+      </w:pPr>
+      <w:r>
+        <w:t>Purchased</w:t>
+      </w:r>
+    </w:p>
+    <w:p>
+      <w:pPr>
+        <w:pStyle w:val="ListParagraph"/>
+        <w:numPr>
+          <w:ilvl w:val="0"/>
+          <w:numId w:val="12"/>
+        </w:numPr>
+      </w:pPr>
+      <w:r>
+        <w:t>Dispatched</w:t>
+      </w:r>
+    </w:p>
+    <w:p>
+      <w:pPr>
+        <w:pStyle w:val="ListParagraph"/>
+        <w:numPr>
+          <w:ilvl w:val="0"/>
+          <w:numId w:val="12"/>
+        </w:numPr>
+      </w:pPr>
+      <w:r>
+        <w:t>Delivered</w:t>
+      </w:r>
+    </w:p>
+    <w:p>
+      <w:pPr>
+        <w:pStyle w:val="ListParagraph"/>
+        <w:numPr>
+          <w:ilvl w:val="0"/>
+          <w:numId w:val="12"/>
+        </w:numPr>
+      </w:pPr>
+      <w:r>
+        <w:t>Received</w:t>
+      </w:r>
+    </w:p>
+    <w:p>
+      <w:pPr>
+        <w:pStyle w:val="ListParagraph"/>
+        <w:numPr>
+          <w:ilvl w:val="0"/>
+          <w:numId w:val="12"/>
+        </w:numPr>
+      </w:pPr>
+      <w:r>
+        <w:t>Hub</w:t>
+      </w:r>
+    </w:p>
+    <w:p>
+      <w:pPr>
+        <w:pStyle w:val="ListParagraph"/>
+        <w:numPr>
+          <w:ilvl w:val="0"/>
+          <w:numId w:val="12"/>
+        </w:numPr>
+      </w:pPr>
+      <w:r>
+        <w:t>Transit</w:t>
+      </w:r>
+    </w:p>
+    <w:p>
+      <w:pPr>
+        <w:pStyle w:val="ListParagraph"/>
+        <w:numPr>
+          <w:ilvl w:val="0"/>
+          <w:numId w:val="12"/>
+        </w:numPr>
+      </w:pPr>
+      <w:r>
+        <w:t>Customs</w:t>
+      </w:r>
+    </w:p>
+    <w:p>
+      <w:pPr>
+        <w:pStyle w:val="ListParagraph"/>
+        <w:numPr>
+          <w:ilvl w:val="0"/>
+          <w:numId w:val="12"/>
+        </w:numPr>
+      </w:pPr>
+      <w:r>
+        <w:t>Out for delivery</w:t>
+      </w:r>
+    </w:p>
+    <w:p>
+      <w:pPr>
+        <w:pStyle w:val="ListParagraph"/>
+        <w:numPr>
+          <w:ilvl w:val="0"/>
+          <w:numId w:val="12"/>
+        </w:numPr>
+      </w:pPr>
+      <w:r>
+        <w:t>Office</w:t>
+      </w:r>
+    </w:p>
+    <w:p>
+      <w:pPr>
+        <w:pStyle w:val="ListParagraph"/>
+        <w:numPr>
+          <w:ilvl w:val="0"/>
+          <w:numId w:val="12"/>
+        </w:numPr>
+      </w:pPr>
+      <w:r>
+        <w:t>Photos sent</w:t>
+      </w:r>
+    </w:p>
+    <w:p>
+      <w:pPr>
+        <w:pStyle w:val="ListParagraph"/>
+        <w:numPr>
+          <w:ilvl w:val="0"/>
+          <w:numId w:val="12"/>
+        </w:numPr>
+      </w:pPr>
+    </w:p>
+    <w:p/>
+    <w:p>
+      <w:pPr>
+        <w:rPr>
+          <w:b/>
+          <w:bCs/>
+        </w:rPr>
+      </w:pPr>
+      <w:r>
+        <w:rPr>
+          <w:b/>
+          <w:bCs/>
+        </w:rPr>
+        <w:t>Trips</w:t>
+      </w:r>
+    </w:p>
+    <w:p>
+      <w:pPr>
+        <w:rPr>
+          <w:b/>
+          <w:bCs/>
+        </w:rPr>
+      </w:pPr>
+      <w:r>
+        <w:rPr>
+          <w:b/>
+          <w:bCs/>
+        </w:rPr>
+        <w:lastRenderedPageBreak/>
+        <w:tab/>
+        <w:t>Statuses</w:t>
+      </w:r>
+    </w:p>
+    <w:p>
+      <w:pPr>
+        <w:pStyle w:val="ListParagraph"/>
+        <w:numPr>
+          <w:ilvl w:val="0"/>
+          <w:numId w:val="9"/>
+        </w:numPr>
+      </w:pPr>
+      <w:r>
+        <w:t>New</w:t>
+      </w:r>
+    </w:p>
+    <w:p>
+      <w:pPr>
+        <w:pStyle w:val="ListParagraph"/>
+        <w:numPr>
+          <w:ilvl w:val="0"/>
+          <w:numId w:val="9"/>
+        </w:numPr>
+      </w:pPr>
+      <w:r>
+        <w:t>Approved</w:t>
+      </w:r>
+    </w:p>
+    <w:p>
+      <w:pPr>
+        <w:pStyle w:val="ListParagraph"/>
+        <w:numPr>
+          <w:ilvl w:val="0"/>
+          <w:numId w:val="9"/>
+        </w:numPr>
+      </w:pPr>
+      <w:r>
+        <w:t>Started shipping</w:t>
+      </w:r>
+    </w:p>
+    <w:p>
+      <w:pPr>
+        <w:pStyle w:val="ListParagraph"/>
+        <w:numPr>
+          <w:ilvl w:val="0"/>
+          <w:numId w:val="9"/>
+        </w:numPr>
+      </w:pPr>
+      <w:r>
+        <w:t>Completed shipping</w:t>
+      </w:r>
+    </w:p>
+    <w:p>
+      <w:pPr>
+        <w:pStyle w:val="ListParagraph"/>
+        <w:numPr>
+          <w:ilvl w:val="0"/>
+          <w:numId w:val="9"/>
+        </w:numPr>
+      </w:pPr>
+      <w:r>
+        <w:t>Completed Receiving</w:t>
+      </w:r>
+    </w:p>
+    <w:p>
+      <w:pPr>
+        <w:pStyle w:val="ListParagraph"/>
+        <w:numPr>
+          <w:ilvl w:val="0"/>
+          <w:numId w:val="9"/>
+        </w:numPr>
+      </w:pPr>
+      <w:r>
+        <w:t>Waiting trip</w:t>
+      </w:r>
+    </w:p>
+    <w:p>
+      <w:pPr>
+        <w:pStyle w:val="ListParagraph"/>
+        <w:numPr>
+          <w:ilvl w:val="0"/>
+          <w:numId w:val="9"/>
+        </w:numPr>
+      </w:pPr>
+      <w:r>
+        <w:t>Traveling</w:t>
+      </w:r>
+    </w:p>
+    <w:p>
+      <w:pPr>
+        <w:pStyle w:val="ListParagraph"/>
+        <w:numPr>
+          <w:ilvl w:val="0"/>
+          <w:numId w:val="9"/>
+        </w:numPr>
+      </w:pPr>
+      <w:r>
+        <w:t>In Egypt</w:t>
+      </w:r>
+    </w:p>
+    <w:p>
+      <w:pPr>
+        <w:pStyle w:val="ListParagraph"/>
+        <w:numPr>
+          <w:ilvl w:val="0"/>
+          <w:numId w:val="9"/>
+        </w:numPr>
+      </w:pPr>
+      <w:r>
+        <w:t>Ready to pick up</w:t>
+      </w:r>
+    </w:p>
+    <w:p>
+      <w:pPr>
+        <w:pStyle w:val="ListParagraph"/>
+        <w:numPr>
+          <w:ilvl w:val="0"/>
+          <w:numId w:val="9"/>
+        </w:numPr>
+      </w:pPr>
+      <w:r>
+        <w:t>Picked up</w:t>
+      </w:r>
+    </w:p>
+    <w:p>
+      <w:pPr>
+        <w:pStyle w:val="ListParagraph"/>
+        <w:numPr>
+          <w:ilvl w:val="0"/>
+          <w:numId w:val="9"/>
+        </w:numPr>
+      </w:pPr>
+      <w:r>
+        <w:t>Photos sent</w:t>
+      </w:r>
+    </w:p>
+    <w:p>
+      <w:pPr>
+        <w:pStyle w:val="ListParagraph"/>
+        <w:numPr>
+          <w:ilvl w:val="0"/>
+          <w:numId w:val="9"/>
+        </w:numPr>
+      </w:pPr>
+      <w:r>
+        <w:t>On website – Complete</w:t>
+      </w:r>
+    </w:p>
+    <w:p>
+      <w:pPr>
+        <w:pStyle w:val="ListParagraph"/>
+        <w:numPr>
+          <w:ilvl w:val="0"/>
+          <w:numId w:val="9"/>
+        </w:numPr>
+      </w:pPr>
+      <w:r>
+        <w:t>Cancelled</w:t>
+      </w:r>
+    </w:p>
+    <w:p>
+      <w:pPr>
+        <w:ind w:left="360"/>
+        <w:rPr>
+          <w:b/>
+          <w:bCs/>
+        </w:rPr>
+      </w:pPr>
+      <w:r>
+        <w:rPr>
+          <w:b/>
+          <w:bCs/>
+        </w:rPr>
+        <w:t>Flags</w:t>
+      </w:r>
+      <w:r>
+        <w:rPr>
+          <w:b/>
+          <w:bCs/>
+        </w:rPr>
+        <w:t xml:space="preserve"> (Totally </w:t>
+      </w:r>
+      <w:r>
+        <w:t>– all inventory of the trip or</w:t>
+      </w:r>
+      <w:r>
+        <w:rPr>
+          <w:b/>
+          <w:bCs/>
+        </w:rPr>
+        <w:t xml:space="preserve"> Partially</w:t>
+      </w:r>
+      <w:r>
+        <w:t xml:space="preserve"> – some items in the trip</w:t>
+      </w:r>
+      <w:r>
+        <w:rPr>
+          <w:b/>
+          <w:bCs/>
+        </w:rPr>
+        <w:t>)</w:t>
+      </w:r>
+    </w:p>
+    <w:p>
+      <w:pPr>
+        <w:pStyle w:val="ListParagraph"/>
+        <w:numPr>
+          <w:ilvl w:val="0"/>
+          <w:numId w:val="11"/>
+        </w:numPr>
+      </w:pPr>
+      <w:r>
+        <w:t>Delayed</w:t>
+      </w:r>
+    </w:p>
+    <w:p>
+      <w:pPr>
+        <w:pStyle w:val="ListParagraph"/>
+        <w:numPr>
+          <w:ilvl w:val="0"/>
+          <w:numId w:val="11"/>
+        </w:numPr>
+      </w:pPr>
+      <w:r>
+        <w:t>Errant</w:t>
+      </w:r>
+    </w:p>
+    <w:p>
+      <w:pPr>
+        <w:pStyle w:val="ListParagraph"/>
+        <w:numPr>
+          <w:ilvl w:val="0"/>
+          <w:numId w:val="11"/>
+        </w:numPr>
+      </w:pPr>
+      <w:r>
+        <w:t>Lost</w:t>
+      </w:r>
+    </w:p>
+    <w:p>
+      <w:pPr>
+        <w:pStyle w:val="ListParagraph"/>
+        <w:numPr>
+          <w:ilvl w:val="0"/>
+          <w:numId w:val="11"/>
+        </w:numPr>
+      </w:pPr>
+      <w:r>
+        <w:t>Damaged</w:t>
+      </w:r>
+    </w:p>
+    <w:p>
+      <w:pPr>
+        <w:ind w:left="360"/>
+      </w:pPr>
+    </w:p>
+    <w:p/>
+    <w:p>
+      <w:r>
+        <w:rPr>
+          <w:b/>
+          <w:bCs/>
+        </w:rPr>
+        <w:t>Shipment</w:t>
+      </w:r>
+      <w:r>
+        <w:t xml:space="preserve"> (a trip with status Ready to pick up or advanced)</w:t>
+      </w:r>
+    </w:p>
+    <w:p>
+      <w:pPr>
+        <w:pStyle w:val="ListParagraph"/>
+        <w:numPr>
+          <w:ilvl w:val="0"/>
+          <w:numId w:val="13"/>
+        </w:numPr>
+      </w:pPr>
+      <w:r>
+        <w:t>Out for Delivery = Ready to pick up</w:t>
+      </w:r>
+    </w:p>
+    <w:p>
+      <w:pPr>
+        <w:pStyle w:val="ListParagraph"/>
+        <w:numPr>
+          <w:ilvl w:val="0"/>
+          <w:numId w:val="13"/>
+        </w:numPr>
+      </w:pPr>
+      <w:r>
+        <w:t>Received = Picked up</w:t>
+      </w:r>
+    </w:p>
+    <w:p>
+      <w:pPr>
+        <w:pStyle w:val="ListParagraph"/>
+        <w:numPr>
+          <w:ilvl w:val="0"/>
+          <w:numId w:val="13"/>
+        </w:numPr>
+      </w:pPr>
+      <w:r>
+        <w:t>Photos sent</w:t>
+      </w:r>
+    </w:p>
+    <w:p/>
+    <w:p>
+      <w:pPr>
+        <w:rPr>
+          <w:b/>
+          <w:bCs/>
+        </w:rPr>
+      </w:pPr>
+      <w:r>
+        <w:rPr>
+          <w:b/>
+          <w:bCs/>
+        </w:rPr>
+        <w:t>Order</w:t>
+      </w:r>
+    </w:p>
+    <w:p>
+      <w:pPr>
+        <w:rPr>
+          <w:b/>
+          <w:bCs/>
+        </w:rPr>
+      </w:pPr>
+      <w:r>
+        <w:rPr>
+          <w:b/>
+          <w:bCs/>
+        </w:rPr>
+        <w:tab/>
+        <w:t>Statuses</w:t>
+      </w:r>
+    </w:p>
+    <w:p>
+      <w:pPr>
+        <w:pStyle w:val="ListParagraph"/>
+        <w:numPr>
+          <w:ilvl w:val="0"/>
+          <w:numId w:val="14"/>
+        </w:numPr>
+      </w:pPr>
+      <w:r>
+        <w:t>Ordered</w:t>
+      </w:r>
+    </w:p>
+    <w:p>
+      <w:pPr>
+        <w:pStyle w:val="ListParagraph"/>
+        <w:numPr>
+          <w:ilvl w:val="0"/>
+          <w:numId w:val="14"/>
+        </w:numPr>
+      </w:pPr>
+      <w:r>
+        <w:t>Dispatched</w:t>
+      </w:r>
+    </w:p>
+    <w:p>
+      <w:pPr>
+        <w:pStyle w:val="ListParagraph"/>
+        <w:numPr>
+          <w:ilvl w:val="0"/>
+          <w:numId w:val="14"/>
+        </w:numPr>
+      </w:pPr>
+      <w:r>
+        <w:t>Delivered</w:t>
+      </w:r>
+    </w:p>
+    <w:p>
+      <w:pPr>
+        <w:pStyle w:val="ListParagraph"/>
+        <w:numPr>
+          <w:ilvl w:val="0"/>
+          <w:numId w:val="14"/>
+        </w:numPr>
+      </w:pPr>
+      <w:r>
+        <w:t>Received</w:t>
+      </w:r>
+    </w:p>
+    <w:p>
+      <w:pPr>
+        <w:ind w:firstLine="720"/>
+      </w:pPr>
+      <w:r>
+        <w:rPr>
+          <w:b/>
+          <w:bCs/>
+        </w:rPr>
+        <w:lastRenderedPageBreak/>
+        <w:t>Flags</w:t>
+      </w:r>
+    </w:p>
+    <w:p>
+      <w:pPr>
+        <w:ind w:left="360"/>
+        <w:rPr>
+          <w:b/>
+          <w:bCs/>
+        </w:rPr>
+      </w:pPr>
+      <w:r>
+        <w:rPr>
+          <w:b/>
+          <w:bCs/>
+        </w:rPr>
+        <w:t>Flags</w:t>
+      </w:r>
+      <w:r>
+        <w:rPr>
+          <w:b/>
+          <w:bCs/>
+        </w:rPr>
+        <w:t xml:space="preserve"> (Totally </w:t>
+      </w:r>
+      <w:r>
+        <w:t>– all inventory of the trip or</w:t>
+      </w:r>
+      <w:r>
+        <w:rPr>
+          <w:b/>
+          <w:bCs/>
+        </w:rPr>
+        <w:t xml:space="preserve"> Partially</w:t>
+      </w:r>
+      <w:r>
+        <w:t xml:space="preserve"> – some items in the trip</w:t>
+      </w:r>
+      <w:r>
+        <w:rPr>
+          <w:b/>
+          <w:bCs/>
+        </w:rPr>
+        <w:t>)</w:t>
+      </w:r>
+    </w:p>
+    <w:p>
+      <w:pPr>
+        <w:pStyle w:val="ListParagraph"/>
+        <w:numPr>
+          <w:ilvl w:val="0"/>
+          <w:numId w:val="16"/>
+        </w:numPr>
+      </w:pPr>
+      <w:r>
+        <w:t>Delayed</w:t>
+      </w:r>
+    </w:p>
+    <w:p>
+      <w:pPr>
+        <w:pStyle w:val="ListParagraph"/>
+        <w:numPr>
+          <w:ilvl w:val="0"/>
+          <w:numId w:val="16"/>
+        </w:numPr>
+      </w:pPr>
+      <w:r>
+        <w:t>Errant</w:t>
+      </w:r>
+    </w:p>
+    <w:p>
+      <w:pPr>
+        <w:pStyle w:val="ListParagraph"/>
+        <w:numPr>
+          <w:ilvl w:val="0"/>
+          <w:numId w:val="16"/>
+        </w:numPr>
+      </w:pPr>
+      <w:r>
+        <w:t>Lost</w:t>
+      </w:r>
+    </w:p>
+    <w:p>
+      <w:pPr>
+        <w:pStyle w:val="ListParagraph"/>
+        <w:numPr>
+          <w:ilvl w:val="0"/>
+          <w:numId w:val="16"/>
+        </w:numPr>
+      </w:pPr>
+      <w:r>
+        <w:t>Damaged</w:t>
+      </w:r>
+    </w:p>
+    <w:p>
+      <w:pPr>
+        <w:pStyle w:val="ListParagraph"/>
+      </w:pPr>
+    </w:p>
+    <w:p>
+      <w:pPr>
+        <w:pStyle w:val="ListParagraph"/>
+      </w:pPr>
+    </w:p>
+    <w:p>
+      <w:pPr>
+        <w:pStyle w:val="ListParagraph"/>
+      </w:pPr>
+    </w:p>
+    <w:p>
+      <w:pPr>
+        <w:pStyle w:val="ListParagraph"/>
+        <w:ind w:left="0"/>
+      </w:pPr>
+      <w:r>
+        <w:t>Flags</w:t>
+      </w:r>
+    </w:p>
+    <w:p>
+      <w:pPr>
+        <w:pStyle w:val="ListParagraph"/>
+        <w:numPr>
+          <w:ilvl w:val="0"/>
+          <w:numId w:val="17"/>
+        </w:numPr>
+      </w:pPr>
+      <w:r>
+        <w:t>Flags for Items – this reflect on Partial flag for the container</w:t>
+      </w:r>
+    </w:p>
+    <w:p>
+      <w:pPr>
+        <w:pStyle w:val="ListParagraph"/>
+        <w:numPr>
+          <w:ilvl w:val="1"/>
+          <w:numId w:val="17"/>
+        </w:numPr>
+      </w:pPr>
+      <w:r>
+        <w:t>Delayed</w:t>
+      </w:r>
+    </w:p>
+    <w:p>
+      <w:pPr>
+        <w:pStyle w:val="ListParagraph"/>
+        <w:numPr>
+          <w:ilvl w:val="1"/>
+          <w:numId w:val="17"/>
+        </w:numPr>
+      </w:pPr>
+      <w:r>
+        <w:t>Errant</w:t>
+      </w:r>
+    </w:p>
+    <w:p>
+      <w:pPr>
+        <w:pStyle w:val="ListParagraph"/>
+        <w:numPr>
+          <w:ilvl w:val="1"/>
+          <w:numId w:val="17"/>
+        </w:numPr>
+      </w:pPr>
+      <w:r>
+        <w:t>Lost</w:t>
+      </w:r>
+    </w:p>
+    <w:p>
+      <w:pPr>
+        <w:pStyle w:val="ListParagraph"/>
+        <w:numPr>
+          <w:ilvl w:val="1"/>
+          <w:numId w:val="17"/>
+        </w:numPr>
+      </w:pPr>
+      <w:r>
+        <w:t>Damaged</w:t>
+      </w:r>
+    </w:p>
+    <w:p>
+      <w:pPr>
+        <w:pStyle w:val="ListParagraph"/>
+        <w:numPr>
+          <w:ilvl w:val="0"/>
+          <w:numId w:val="17"/>
+        </w:numPr>
+      </w:pPr>
+      <w:r>
+        <w:t>Flags for Containers – this reflect on flags of all items in the container</w:t>
+      </w:r>
+    </w:p>
+    <w:p>
+      <w:pPr>
+        <w:pStyle w:val="ListParagraph"/>
+        <w:numPr>
+          <w:ilvl w:val="1"/>
+          <w:numId w:val="17"/>
+        </w:numPr>
+      </w:pPr>
+      <w:r>
+        <w:t>Delayed</w:t>
+      </w:r>
+    </w:p>
+    <w:p>
+      <w:pPr>
+        <w:pStyle w:val="ListParagraph"/>
+        <w:numPr>
+          <w:ilvl w:val="1"/>
+          <w:numId w:val="17"/>
+        </w:numPr>
+      </w:pPr>
+      <w:r>
+        <w:t>Errant</w:t>
+      </w:r>
+    </w:p>
+    <w:p>
+      <w:pPr>
+        <w:pStyle w:val="ListParagraph"/>
+        <w:numPr>
+          <w:ilvl w:val="1"/>
+          <w:numId w:val="17"/>
+        </w:numPr>
+      </w:pPr>
+      <w:r>
+        <w:t>Lost</w:t>
+      </w:r>
+    </w:p>
+    <w:p>
+      <w:pPr>
+        <w:pStyle w:val="ListParagraph"/>
+        <w:numPr>
+          <w:ilvl w:val="1"/>
+          <w:numId w:val="17"/>
+        </w:numPr>
+      </w:pPr>
+      <w:r>
+        <w:t>Damaged</w:t>
+      </w:r>
+    </w:p>
+    <w:p/>
+    <w:p>
+      <w:r>
+        <w:t>Compensations</w:t>
       </w:r>
     </w:p>
     <w:p/>
     <w:p/>
     <w:p>
       <w:r>
-        <w:t>Modules</w:t>
-      </w:r>
-    </w:p>
-    <w:p>
-      <w:r>
-        <w:tab/>
-        <w:t>Main Modules</w:t>
-      </w:r>
-    </w:p>
-    <w:p>
-      <w:pPr>
-        <w:pStyle w:val="ListParagraph"/>
-        <w:numPr>
-          <w:ilvl w:val="0"/>
-          <w:numId w:val="5"/>
-        </w:numPr>
-      </w:pPr>
-      <w:r>
-        <w:t>Pricing</w:t>
-      </w:r>
-    </w:p>
-    <w:p>
-      <w:pPr>
-        <w:pStyle w:val="ListParagraph"/>
-        <w:numPr>
-          <w:ilvl w:val="0"/>
-          <w:numId w:val="5"/>
-        </w:numPr>
-      </w:pPr>
-      <w:r>
-        <w:t>Expenses</w:t>
-      </w:r>
-    </w:p>
-    <w:p>
-      <w:pPr>
-        <w:pStyle w:val="ListParagraph"/>
-        <w:numPr>
-          <w:ilvl w:val="0"/>
-          <w:numId w:val="5"/>
-        </w:numPr>
-      </w:pPr>
-      <w:r>
-        <w:t>XOONX</w:t>
-      </w:r>
-    </w:p>
-    <w:p>
-      <w:pPr>
-        <w:pStyle w:val="ListParagraph"/>
-        <w:numPr>
-          <w:ilvl w:val="0"/>
-          <w:numId w:val="5"/>
-        </w:numPr>
-      </w:pPr>
-      <w:r>
-        <w:t>Sales</w:t>
-      </w:r>
-    </w:p>
-    <w:p>
-      <w:pPr>
-        <w:pStyle w:val="ListParagraph"/>
-        <w:numPr>
-          <w:ilvl w:val="0"/>
-          <w:numId w:val="5"/>
-        </w:numPr>
-      </w:pPr>
-      <w:r>
-        <w:t>Purchasing</w:t>
-      </w:r>
-    </w:p>
-    <w:p>
-      <w:pPr>
-        <w:pStyle w:val="ListParagraph"/>
-        <w:numPr>
-          <w:ilvl w:val="0"/>
-          <w:numId w:val="5"/>
-        </w:numPr>
-      </w:pPr>
-      <w:r>
-        <w:t>Logistics</w:t>
-      </w:r>
-    </w:p>
-    <w:p>
-      <w:pPr>
-        <w:pStyle w:val="ListParagraph"/>
-        <w:numPr>
-          <w:ilvl w:val="0"/>
-          <w:numId w:val="5"/>
-        </w:numPr>
-      </w:pPr>
-      <w:r>
-        <w:t>Operations</w:t>
-      </w:r>
-    </w:p>
-    <w:p>
-      <w:pPr>
-        <w:pStyle w:val="ListParagraph"/>
-        <w:numPr>
-          <w:ilvl w:val="0"/>
-          <w:numId w:val="5"/>
+        <w:t>Gifts</w:t>
+      </w:r>
+    </w:p>
+    <w:p>
+      <w:r>
+        <w:t xml:space="preserve">Gifts are items sent with </w:t>
+      </w:r>
+    </w:p>
+    <w:p/>
+    <w:p>
+      <w:r>
+        <w:t>Friendly Names</w:t>
+      </w:r>
+    </w:p>
+    <w:p>
+      <w:r>
+        <w:t>All containers should be viewed in the application with Friendly Names, as follows;</w:t>
+      </w:r>
+    </w:p>
+    <w:p>
+      <w:pPr>
+        <w:pStyle w:val="ListParagraph"/>
+        <w:numPr>
+          <w:ilvl w:val="0"/>
+          <w:numId w:val="18"/>
+        </w:numPr>
+      </w:pPr>
+      <w:r>
+        <w:t>Supplier &gt;&gt; Suppler Name</w:t>
+      </w:r>
+    </w:p>
+    <w:p>
+      <w:pPr>
+        <w:pStyle w:val="ListParagraph"/>
+        <w:numPr>
+          <w:ilvl w:val="0"/>
+          <w:numId w:val="18"/>
         </w:numPr>
       </w:pPr>
       <w:r>
         <w:lastRenderedPageBreak/>
-        <w:t>Couriers</w:t>
-      </w:r>
-    </w:p>
-    <w:p>
-      <w:pPr>
-        <w:pStyle w:val="ListParagraph"/>
-        <w:numPr>
-          <w:ilvl w:val="0"/>
-          <w:numId w:val="5"/>
-        </w:numPr>
-      </w:pPr>
-      <w:r>
-        <w:t>Issues</w:t>
-      </w:r>
-    </w:p>
-    <w:p>
-      <w:pPr>
-        <w:pStyle w:val="ListParagraph"/>
-        <w:numPr>
-          <w:ilvl w:val="0"/>
-          <w:numId w:val="5"/>
-        </w:numPr>
-      </w:pPr>
-      <w:r>
-        <w:t>History</w:t>
-      </w:r>
-    </w:p>
-    <w:p>
-      <w:pPr>
-        <w:ind w:left="360"/>
-      </w:pPr>
-      <w:r>
-        <w:t>Administration</w:t>
-      </w:r>
-    </w:p>
-    <w:p>
-      <w:pPr>
-        <w:pStyle w:val="ListParagraph"/>
-        <w:numPr>
-          <w:ilvl w:val="0"/>
-          <w:numId w:val="5"/>
-        </w:numPr>
-      </w:pPr>
-      <w:r>
-        <w:t>Users</w:t>
-      </w:r>
-    </w:p>
-    <w:p>
-      <w:pPr>
-        <w:pStyle w:val="ListParagraph"/>
-        <w:numPr>
-          <w:ilvl w:val="0"/>
-          <w:numId w:val="5"/>
-        </w:numPr>
-      </w:pPr>
-      <w:r>
-        <w:t>Setting</w:t>
-      </w:r>
-    </w:p>
-    <w:p>
-      <w:pPr>
-        <w:rPr>
-          <w:lang w:bidi="ar-EG"/>
-        </w:rPr>
-      </w:pPr>
-    </w:p>
-    <w:p>
-      <w:pPr>
-        <w:rPr>
-          <w:b/>
-          <w:bCs/>
-        </w:rPr>
-      </w:pPr>
-      <w:r>
-        <w:rPr>
-          <w:b/>
-          <w:bCs/>
-        </w:rPr>
-        <w:t>Staff</w:t>
-      </w:r>
-    </w:p>
-    <w:p>
-      <w:r>
-        <w:t xml:space="preserve">Every employee will have a user account that </w:t>
-      </w:r>
-      <w:proofErr w:type="gramStart"/>
-      <w:r>
-        <w:t>have</w:t>
-      </w:r>
-      <w:proofErr w:type="gramEnd"/>
-      <w:r>
-        <w:t xml:space="preserve"> some permissions over some modules</w:t>
-      </w:r>
-    </w:p>
-    <w:p/>
-    <w:p>
-      <w:pPr>
-        <w:rPr>
-          <w:b/>
-          <w:bCs/>
-        </w:rPr>
-      </w:pPr>
-      <w:r>
-        <w:rPr>
-          <w:b/>
-          <w:bCs/>
-        </w:rPr>
-        <w:t>Units</w:t>
-      </w:r>
-    </w:p>
-    <w:p>
-      <w:pPr>
-        <w:rPr>
-          <w:rtl/>
-          <w:lang w:bidi="ar-EG"/>
-        </w:rPr>
-      </w:pPr>
-      <w:r>
-        <w:rPr>
-          <w:lang w:bidi="ar-EG"/>
-        </w:rPr>
-        <w:t xml:space="preserve">Items of </w:t>
-      </w:r>
-      <w:proofErr w:type="gramStart"/>
-      <w:r>
-        <w:rPr>
-          <w:lang w:bidi="ar-EG"/>
-        </w:rPr>
-        <w:t>products, they</w:t>
-      </w:r>
-      <w:proofErr w:type="gramEnd"/>
-      <w:r>
-        <w:rPr>
-          <w:lang w:bidi="ar-EG"/>
-        </w:rPr>
-        <w:t xml:space="preserve"> are the building block of the system while tracking inventory from point to point.</w:t>
-      </w:r>
-    </w:p>
-    <w:p/>
-    <w:p>
-      <w:pPr>
-        <w:rPr>
-          <w:b/>
-          <w:bCs/>
-        </w:rPr>
-      </w:pPr>
-      <w:r>
-        <w:rPr>
-          <w:b/>
-          <w:bCs/>
-        </w:rPr>
-        <w:t>Containers</w:t>
-      </w:r>
-    </w:p>
-    <w:p>
-      <w:r>
-        <w:t>Containers are baskets that carry the items from point to point during their pathway from supplier to customer. Supplier is the starting point, and customer is the ending point. In some cases, the item (product) lifecycle starts with a customer and ends with the customer. This case happens in Special Order – where customer ask us to buy a product for him and we go to supplier and order the product and handle the product from container to container till we reach the customer back.</w:t>
-      </w:r>
-    </w:p>
-    <w:p/>
-    <w:p>
-      <w:pPr>
-        <w:pStyle w:val="ListParagraph"/>
-        <w:numPr>
-          <w:ilvl w:val="0"/>
-          <w:numId w:val="2"/>
-        </w:numPr>
-      </w:pPr>
-      <w:r>
-        <w:t>Supplier</w:t>
-      </w:r>
-    </w:p>
-    <w:p>
-      <w:pPr>
-        <w:pStyle w:val="ListParagraph"/>
-        <w:numPr>
-          <w:ilvl w:val="0"/>
-          <w:numId w:val="2"/>
-        </w:numPr>
-      </w:pPr>
-      <w:r>
-        <w:t>Request</w:t>
-      </w:r>
-    </w:p>
-    <w:p>
-      <w:pPr>
-        <w:pStyle w:val="ListParagraph"/>
-        <w:numPr>
-          <w:ilvl w:val="0"/>
-          <w:numId w:val="2"/>
-        </w:numPr>
-      </w:pPr>
-      <w:r>
-        <w:t>Purchase</w:t>
-      </w:r>
-    </w:p>
-    <w:p>
-      <w:pPr>
-        <w:pStyle w:val="ListParagraph"/>
-        <w:numPr>
-          <w:ilvl w:val="0"/>
-          <w:numId w:val="2"/>
-        </w:numPr>
-      </w:pPr>
-      <w:r>
-        <w:t>Patch</w:t>
-      </w:r>
-    </w:p>
-    <w:p>
-      <w:pPr>
-        <w:pStyle w:val="ListParagraph"/>
-        <w:numPr>
-          <w:ilvl w:val="0"/>
-          <w:numId w:val="2"/>
-        </w:numPr>
-      </w:pPr>
-      <w:r>
-        <w:t>Travel</w:t>
-      </w:r>
-    </w:p>
-    <w:p>
-      <w:pPr>
-        <w:pStyle w:val="ListParagraph"/>
-        <w:numPr>
-          <w:ilvl w:val="0"/>
-          <w:numId w:val="2"/>
-        </w:numPr>
-      </w:pPr>
-      <w:r>
-        <w:t>Trip</w:t>
-      </w:r>
-    </w:p>
-    <w:p>
-      <w:pPr>
-        <w:pStyle w:val="ListParagraph"/>
-        <w:numPr>
-          <w:ilvl w:val="0"/>
-          <w:numId w:val="2"/>
-        </w:numPr>
-      </w:pPr>
-      <w:r>
-        <w:t>Hub – optional</w:t>
-      </w:r>
-    </w:p>
-    <w:p>
-      <w:pPr>
-        <w:pStyle w:val="ListParagraph"/>
-        <w:numPr>
-          <w:ilvl w:val="0"/>
-          <w:numId w:val="2"/>
-        </w:numPr>
-      </w:pPr>
-      <w:r>
-        <w:t>Transfer – optional</w:t>
-      </w:r>
-    </w:p>
-    <w:p>
-      <w:pPr>
-        <w:pStyle w:val="ListParagraph"/>
-        <w:numPr>
-          <w:ilvl w:val="0"/>
-          <w:numId w:val="2"/>
-        </w:numPr>
-      </w:pPr>
-      <w:r>
-        <w:t>Shipment</w:t>
-      </w:r>
-    </w:p>
-    <w:p>
-      <w:pPr>
-        <w:pStyle w:val="ListParagraph"/>
-        <w:numPr>
-          <w:ilvl w:val="0"/>
-          <w:numId w:val="2"/>
-        </w:numPr>
-      </w:pPr>
-      <w:r>
-        <w:t>Office</w:t>
-      </w:r>
-    </w:p>
-    <w:p>
-      <w:pPr>
-        <w:pStyle w:val="ListParagraph"/>
-        <w:numPr>
-          <w:ilvl w:val="0"/>
-          <w:numId w:val="2"/>
-        </w:numPr>
-      </w:pPr>
-      <w:r>
-        <w:lastRenderedPageBreak/>
-        <w:t>Website</w:t>
-      </w:r>
-    </w:p>
-    <w:p>
-      <w:pPr>
-        <w:pStyle w:val="ListParagraph"/>
-        <w:numPr>
-          <w:ilvl w:val="0"/>
-          <w:numId w:val="2"/>
-        </w:numPr>
-      </w:pPr>
-      <w:r>
-        <w:t>Order</w:t>
-      </w:r>
-    </w:p>
-    <w:p>
-      <w:pPr>
-        <w:pStyle w:val="ListParagraph"/>
-        <w:numPr>
-          <w:ilvl w:val="0"/>
-          <w:numId w:val="2"/>
-        </w:numPr>
-      </w:pPr>
-      <w:r>
-        <w:t>Delivery</w:t>
-      </w:r>
-    </w:p>
-    <w:p>
-      <w:pPr>
-        <w:pStyle w:val="ListParagraph"/>
-        <w:numPr>
-          <w:ilvl w:val="0"/>
-          <w:numId w:val="2"/>
-        </w:numPr>
-      </w:pPr>
-      <w:r>
-        <w:t>Courier</w:t>
-      </w:r>
-    </w:p>
-    <w:p>
-      <w:pPr>
-        <w:pStyle w:val="ListParagraph"/>
-        <w:numPr>
-          <w:ilvl w:val="0"/>
-          <w:numId w:val="2"/>
-        </w:numPr>
-      </w:pPr>
-      <w:r>
-        <w:t>Customer</w:t>
-      </w:r>
-    </w:p>
-    <w:p>
-      <w:r>
-        <w:t>And 3 other containers</w:t>
-      </w:r>
-    </w:p>
-    <w:p>
-      <w:pPr>
-        <w:pStyle w:val="ListParagraph"/>
-        <w:numPr>
-          <w:ilvl w:val="0"/>
-          <w:numId w:val="2"/>
-        </w:numPr>
-      </w:pPr>
-      <w:r>
-        <w:t>Lost</w:t>
-      </w:r>
-    </w:p>
-    <w:p>
-      <w:pPr>
-        <w:pStyle w:val="ListParagraph"/>
-        <w:numPr>
-          <w:ilvl w:val="0"/>
-          <w:numId w:val="2"/>
-        </w:numPr>
-      </w:pPr>
-      <w:r>
-        <w:t>Damaged</w:t>
-      </w:r>
-    </w:p>
-    <w:p>
-      <w:pPr>
-        <w:pStyle w:val="ListParagraph"/>
-        <w:numPr>
-          <w:ilvl w:val="0"/>
-          <w:numId w:val="2"/>
-        </w:numPr>
-      </w:pPr>
-      <w:r>
-        <w:t>Errant</w:t>
-      </w:r>
-    </w:p>
-    <w:p/>
-    <w:p/>
-    <w:p>
-      <w:r>
-        <w:t>Statuses</w:t>
-      </w:r>
-    </w:p>
-    <w:p>
-      <w:pPr>
-        <w:ind w:firstLine="720"/>
-      </w:pPr>
-      <w:r>
-        <w:t>Sales Side</w:t>
-      </w:r>
-    </w:p>
-    <w:p/>
-    <w:p>
-      <w:pPr>
-        <w:rPr>
-          <w:b/>
-          <w:bCs/>
-        </w:rPr>
-      </w:pPr>
-      <w:r>
-        <w:rPr>
-          <w:b/>
-          <w:bCs/>
-        </w:rPr>
-        <w:t>Items</w:t>
-      </w:r>
-    </w:p>
-    <w:p>
-      <w:pPr>
-        <w:pStyle w:val="ListParagraph"/>
-        <w:numPr>
-          <w:ilvl w:val="0"/>
-          <w:numId w:val="12"/>
-        </w:numPr>
-      </w:pPr>
-      <w:r>
-        <w:t>Requested</w:t>
-      </w:r>
-    </w:p>
-    <w:p>
-      <w:pPr>
-        <w:pStyle w:val="ListParagraph"/>
-        <w:numPr>
-          <w:ilvl w:val="0"/>
-          <w:numId w:val="12"/>
-        </w:numPr>
-      </w:pPr>
-      <w:r>
-        <w:t>Purchased</w:t>
-      </w:r>
-    </w:p>
-    <w:p>
-      <w:pPr>
-        <w:pStyle w:val="ListParagraph"/>
-        <w:numPr>
-          <w:ilvl w:val="0"/>
-          <w:numId w:val="12"/>
-        </w:numPr>
-      </w:pPr>
-      <w:r>
-        <w:t>Dispatched</w:t>
-      </w:r>
-    </w:p>
-    <w:p>
-      <w:pPr>
-        <w:pStyle w:val="ListParagraph"/>
-        <w:numPr>
-          <w:ilvl w:val="0"/>
-          <w:numId w:val="12"/>
-        </w:numPr>
-      </w:pPr>
-      <w:r>
-        <w:t>Delivered</w:t>
-      </w:r>
-    </w:p>
-    <w:p>
-      <w:pPr>
-        <w:pStyle w:val="ListParagraph"/>
-        <w:numPr>
-          <w:ilvl w:val="0"/>
-          <w:numId w:val="12"/>
-        </w:numPr>
-      </w:pPr>
-      <w:r>
-        <w:t>Received</w:t>
-      </w:r>
-    </w:p>
-    <w:p>
-      <w:pPr>
-        <w:pStyle w:val="ListParagraph"/>
-        <w:numPr>
-          <w:ilvl w:val="0"/>
-          <w:numId w:val="12"/>
-        </w:numPr>
-      </w:pPr>
-      <w:r>
-        <w:t>Hub</w:t>
-      </w:r>
-    </w:p>
-    <w:p>
-      <w:pPr>
-        <w:pStyle w:val="ListParagraph"/>
-        <w:numPr>
-          <w:ilvl w:val="0"/>
-          <w:numId w:val="12"/>
-        </w:numPr>
-      </w:pPr>
-      <w:r>
-        <w:t>Transit</w:t>
-      </w:r>
-    </w:p>
-    <w:p>
-      <w:pPr>
-        <w:pStyle w:val="ListParagraph"/>
-        <w:numPr>
-          <w:ilvl w:val="0"/>
-          <w:numId w:val="12"/>
-        </w:numPr>
-      </w:pPr>
-      <w:r>
-        <w:t>Customs</w:t>
-      </w:r>
-    </w:p>
-    <w:p>
-      <w:pPr>
-        <w:pStyle w:val="ListParagraph"/>
-        <w:numPr>
-          <w:ilvl w:val="0"/>
-          <w:numId w:val="12"/>
-        </w:numPr>
-      </w:pPr>
-      <w:r>
-        <w:t>Out for delivery</w:t>
-      </w:r>
-    </w:p>
-    <w:p>
-      <w:pPr>
-        <w:pStyle w:val="ListParagraph"/>
-        <w:numPr>
-          <w:ilvl w:val="0"/>
-          <w:numId w:val="12"/>
-        </w:numPr>
-      </w:pPr>
-      <w:r>
-        <w:t>Office</w:t>
-      </w:r>
-    </w:p>
-    <w:p>
-      <w:pPr>
-        <w:pStyle w:val="ListParagraph"/>
-        <w:numPr>
-          <w:ilvl w:val="0"/>
-          <w:numId w:val="12"/>
-        </w:numPr>
-      </w:pPr>
-      <w:r>
-        <w:t>Photos sent</w:t>
-      </w:r>
-    </w:p>
-    <w:p>
-      <w:pPr>
-        <w:pStyle w:val="ListParagraph"/>
-        <w:numPr>
-          <w:ilvl w:val="0"/>
-          <w:numId w:val="12"/>
-        </w:numPr>
-      </w:pPr>
-    </w:p>
-    <w:p/>
-    <w:p>
-      <w:pPr>
-        <w:rPr>
-          <w:b/>
-          <w:bCs/>
-        </w:rPr>
-      </w:pPr>
-      <w:r>
-        <w:rPr>
-          <w:b/>
-          <w:bCs/>
-        </w:rPr>
-        <w:t>Trips</w:t>
-      </w:r>
-    </w:p>
-    <w:p>
-      <w:pPr>
-        <w:rPr>
-          <w:b/>
-          <w:bCs/>
-        </w:rPr>
-      </w:pPr>
-      <w:r>
-        <w:rPr>
-          <w:b/>
-          <w:bCs/>
-        </w:rPr>
-        <w:tab/>
-        <w:t>Statuses</w:t>
-      </w:r>
-    </w:p>
-    <w:p>
-      <w:pPr>
-        <w:pStyle w:val="ListParagraph"/>
-        <w:numPr>
-          <w:ilvl w:val="0"/>
-          <w:numId w:val="9"/>
-        </w:numPr>
-      </w:pPr>
-      <w:r>
-        <w:t>New</w:t>
-      </w:r>
-    </w:p>
-    <w:p>
-      <w:pPr>
-        <w:pStyle w:val="ListParagraph"/>
-        <w:numPr>
-          <w:ilvl w:val="0"/>
-          <w:numId w:val="9"/>
-        </w:numPr>
-      </w:pPr>
-      <w:r>
-        <w:t>Approved</w:t>
-      </w:r>
-    </w:p>
-    <w:p>
-      <w:pPr>
-        <w:pStyle w:val="ListParagraph"/>
-        <w:numPr>
-          <w:ilvl w:val="0"/>
-          <w:numId w:val="9"/>
-        </w:numPr>
-      </w:pPr>
-      <w:r>
-        <w:lastRenderedPageBreak/>
-        <w:t>Started shipping</w:t>
-      </w:r>
-    </w:p>
-    <w:p>
-      <w:pPr>
-        <w:pStyle w:val="ListParagraph"/>
-        <w:numPr>
-          <w:ilvl w:val="0"/>
-          <w:numId w:val="9"/>
-        </w:numPr>
-      </w:pPr>
-      <w:r>
-        <w:t>Completed shipping</w:t>
-      </w:r>
-    </w:p>
-    <w:p>
-      <w:pPr>
-        <w:pStyle w:val="ListParagraph"/>
-        <w:numPr>
-          <w:ilvl w:val="0"/>
-          <w:numId w:val="9"/>
-        </w:numPr>
-      </w:pPr>
-      <w:r>
-        <w:t>Completed Receiving</w:t>
-      </w:r>
-    </w:p>
-    <w:p>
-      <w:pPr>
-        <w:pStyle w:val="ListParagraph"/>
-        <w:numPr>
-          <w:ilvl w:val="0"/>
-          <w:numId w:val="9"/>
-        </w:numPr>
-      </w:pPr>
-      <w:r>
-        <w:t>Waiting trip</w:t>
-      </w:r>
-    </w:p>
-    <w:p>
-      <w:pPr>
-        <w:pStyle w:val="ListParagraph"/>
-        <w:numPr>
-          <w:ilvl w:val="0"/>
-          <w:numId w:val="9"/>
-        </w:numPr>
-      </w:pPr>
-      <w:r>
-        <w:t>Traveling</w:t>
-      </w:r>
-    </w:p>
-    <w:p>
-      <w:pPr>
-        <w:pStyle w:val="ListParagraph"/>
-        <w:numPr>
-          <w:ilvl w:val="0"/>
-          <w:numId w:val="9"/>
-        </w:numPr>
-      </w:pPr>
-      <w:r>
-        <w:t>In Egypt</w:t>
-      </w:r>
-    </w:p>
-    <w:p>
-      <w:pPr>
-        <w:pStyle w:val="ListParagraph"/>
-        <w:numPr>
-          <w:ilvl w:val="0"/>
-          <w:numId w:val="9"/>
-        </w:numPr>
-      </w:pPr>
-      <w:r>
-        <w:t>Ready to pick up</w:t>
-      </w:r>
-    </w:p>
-    <w:p>
-      <w:pPr>
-        <w:pStyle w:val="ListParagraph"/>
-        <w:numPr>
-          <w:ilvl w:val="0"/>
-          <w:numId w:val="9"/>
-        </w:numPr>
-      </w:pPr>
-      <w:r>
-        <w:t>Picked up</w:t>
-      </w:r>
-    </w:p>
-    <w:p>
-      <w:pPr>
-        <w:pStyle w:val="ListParagraph"/>
-        <w:numPr>
-          <w:ilvl w:val="0"/>
-          <w:numId w:val="9"/>
-        </w:numPr>
-      </w:pPr>
-      <w:r>
-        <w:t>Photos sent</w:t>
-      </w:r>
-    </w:p>
-    <w:p>
-      <w:pPr>
-        <w:pStyle w:val="ListParagraph"/>
-        <w:numPr>
-          <w:ilvl w:val="0"/>
-          <w:numId w:val="9"/>
-        </w:numPr>
-      </w:pPr>
-      <w:r>
-        <w:t>On website – Complete</w:t>
-      </w:r>
-    </w:p>
-    <w:p>
-      <w:pPr>
-        <w:pStyle w:val="ListParagraph"/>
-        <w:numPr>
-          <w:ilvl w:val="0"/>
-          <w:numId w:val="9"/>
-        </w:numPr>
-      </w:pPr>
-      <w:r>
-        <w:t>Cancelled</w:t>
-      </w:r>
-    </w:p>
-    <w:p>
-      <w:pPr>
-        <w:ind w:left="360"/>
-        <w:rPr>
-          <w:b/>
-          <w:bCs/>
-        </w:rPr>
-      </w:pPr>
-      <w:r>
-        <w:rPr>
-          <w:b/>
-          <w:bCs/>
-        </w:rPr>
-        <w:t>Flags</w:t>
-      </w:r>
-      <w:r>
-        <w:rPr>
-          <w:b/>
-          <w:bCs/>
-        </w:rPr>
-        <w:t xml:space="preserve"> (Totally </w:t>
-      </w:r>
-      <w:r>
-        <w:t>– all inventory of the trip or</w:t>
-      </w:r>
-      <w:r>
-        <w:rPr>
-          <w:b/>
-          <w:bCs/>
-        </w:rPr>
-        <w:t xml:space="preserve"> </w:t>
-      </w:r>
-      <w:proofErr w:type="gramStart"/>
-      <w:r>
-        <w:rPr>
-          <w:b/>
-          <w:bCs/>
-        </w:rPr>
-        <w:t>Partially</w:t>
-      </w:r>
-      <w:proofErr w:type="gramEnd"/>
-      <w:r>
-        <w:t xml:space="preserve"> – some items in the trip</w:t>
-      </w:r>
-      <w:r>
-        <w:rPr>
-          <w:b/>
-          <w:bCs/>
-        </w:rPr>
-        <w:t>)</w:t>
-      </w:r>
-    </w:p>
-    <w:p>
-      <w:pPr>
-        <w:pStyle w:val="ListParagraph"/>
-        <w:numPr>
-          <w:ilvl w:val="0"/>
-          <w:numId w:val="11"/>
-        </w:numPr>
-      </w:pPr>
-      <w:r>
-        <w:t>Delayed</w:t>
-      </w:r>
-    </w:p>
-    <w:p>
-      <w:pPr>
-        <w:pStyle w:val="ListParagraph"/>
-        <w:numPr>
-          <w:ilvl w:val="0"/>
-          <w:numId w:val="11"/>
-        </w:numPr>
-      </w:pPr>
-      <w:r>
-        <w:t>Errant</w:t>
-      </w:r>
-    </w:p>
-    <w:p>
-      <w:pPr>
-        <w:pStyle w:val="ListParagraph"/>
-        <w:numPr>
-          <w:ilvl w:val="0"/>
-          <w:numId w:val="11"/>
-        </w:numPr>
-      </w:pPr>
-      <w:r>
-        <w:t>Lost</w:t>
-      </w:r>
-    </w:p>
-    <w:p>
-      <w:pPr>
-        <w:pStyle w:val="ListParagraph"/>
-        <w:numPr>
-          <w:ilvl w:val="0"/>
-          <w:numId w:val="11"/>
-        </w:numPr>
-      </w:pPr>
-      <w:r>
-        <w:t>Damaged</w:t>
-      </w:r>
-    </w:p>
-    <w:p>
-      <w:pPr>
-        <w:ind w:left="360"/>
-      </w:pPr>
-    </w:p>
-    <w:p/>
-    <w:p>
-      <w:r>
-        <w:rPr>
-          <w:b/>
-          <w:bCs/>
-        </w:rPr>
-        <w:t>Shipment</w:t>
-      </w:r>
-      <w:r>
-        <w:t xml:space="preserve"> (a trip with status Ready to pick up or advanced)</w:t>
-      </w:r>
-    </w:p>
-    <w:p>
-      <w:pPr>
-        <w:pStyle w:val="ListParagraph"/>
-        <w:numPr>
-          <w:ilvl w:val="0"/>
-          <w:numId w:val="13"/>
-        </w:numPr>
-      </w:pPr>
-      <w:r>
-        <w:t>Out for Delivery = Ready to pick up</w:t>
-      </w:r>
-    </w:p>
-    <w:p>
-      <w:pPr>
-        <w:pStyle w:val="ListParagraph"/>
-        <w:numPr>
-          <w:ilvl w:val="0"/>
-          <w:numId w:val="13"/>
-        </w:numPr>
-      </w:pPr>
-      <w:r>
-        <w:t>Received = Picked up</w:t>
-      </w:r>
-    </w:p>
-    <w:p>
-      <w:pPr>
-        <w:pStyle w:val="ListParagraph"/>
-        <w:numPr>
-          <w:ilvl w:val="0"/>
-          <w:numId w:val="13"/>
-        </w:numPr>
-      </w:pPr>
-      <w:r>
-        <w:t>Photos sent</w:t>
-      </w:r>
-    </w:p>
-    <w:p/>
-    <w:p>
-      <w:pPr>
-        <w:rPr>
-          <w:b/>
-          <w:bCs/>
-        </w:rPr>
-      </w:pPr>
-      <w:r>
-        <w:rPr>
-          <w:b/>
-          <w:bCs/>
-        </w:rPr>
-        <w:t>Order</w:t>
-      </w:r>
-    </w:p>
-    <w:p>
-      <w:pPr>
-        <w:rPr>
-          <w:b/>
-          <w:bCs/>
-        </w:rPr>
-      </w:pPr>
-      <w:r>
-        <w:rPr>
-          <w:b/>
-          <w:bCs/>
-        </w:rPr>
-        <w:tab/>
-        <w:t>Statuses</w:t>
-      </w:r>
-    </w:p>
-    <w:p>
-      <w:pPr>
-        <w:pStyle w:val="ListParagraph"/>
-        <w:numPr>
-          <w:ilvl w:val="0"/>
-          <w:numId w:val="14"/>
-        </w:numPr>
-      </w:pPr>
-      <w:r>
-        <w:t>Ordered</w:t>
-      </w:r>
-    </w:p>
-    <w:p>
-      <w:pPr>
-        <w:pStyle w:val="ListParagraph"/>
-        <w:numPr>
-          <w:ilvl w:val="0"/>
-          <w:numId w:val="14"/>
-        </w:numPr>
-      </w:pPr>
-      <w:r>
-        <w:t>Dispatched</w:t>
-      </w:r>
-    </w:p>
-    <w:p>
-      <w:pPr>
-        <w:pStyle w:val="ListParagraph"/>
-        <w:numPr>
-          <w:ilvl w:val="0"/>
-          <w:numId w:val="14"/>
-        </w:numPr>
-      </w:pPr>
-      <w:r>
-        <w:t>Delivered</w:t>
-      </w:r>
-    </w:p>
-    <w:p>
-      <w:pPr>
-        <w:pStyle w:val="ListParagraph"/>
-        <w:numPr>
-          <w:ilvl w:val="0"/>
-          <w:numId w:val="14"/>
-        </w:numPr>
-      </w:pPr>
-      <w:r>
-        <w:t>Received</w:t>
-      </w:r>
-    </w:p>
-    <w:p>
-      <w:pPr>
-        <w:ind w:firstLine="720"/>
-      </w:pPr>
-      <w:r>
-        <w:rPr>
-          <w:b/>
-          <w:bCs/>
-        </w:rPr>
-        <w:t>Flags</w:t>
-      </w:r>
-    </w:p>
-    <w:p>
-      <w:pPr>
-        <w:ind w:left="360"/>
-        <w:rPr>
-          <w:b/>
-          <w:bCs/>
-        </w:rPr>
-      </w:pPr>
-      <w:r>
-        <w:rPr>
-          <w:b/>
-          <w:bCs/>
-        </w:rPr>
-        <w:t>Flags</w:t>
-      </w:r>
-      <w:r>
-        <w:rPr>
-          <w:b/>
-          <w:bCs/>
-        </w:rPr>
-        <w:t xml:space="preserve"> (Totally </w:t>
-      </w:r>
-      <w:r>
-        <w:t>– all inventory of the trip or</w:t>
-      </w:r>
-      <w:r>
-        <w:rPr>
-          <w:b/>
-          <w:bCs/>
-        </w:rPr>
-        <w:t xml:space="preserve"> </w:t>
-      </w:r>
-      <w:proofErr w:type="gramStart"/>
-      <w:r>
-        <w:rPr>
-          <w:b/>
-          <w:bCs/>
-        </w:rPr>
-        <w:t>Partially</w:t>
-      </w:r>
-      <w:proofErr w:type="gramEnd"/>
-      <w:r>
-        <w:t xml:space="preserve"> – some items in the trip</w:t>
-      </w:r>
-      <w:r>
-        <w:rPr>
-          <w:b/>
-          <w:bCs/>
-        </w:rPr>
-        <w:t>)</w:t>
-      </w:r>
-    </w:p>
-    <w:p>
-      <w:pPr>
-        <w:pStyle w:val="ListParagraph"/>
-        <w:numPr>
-          <w:ilvl w:val="0"/>
-          <w:numId w:val="16"/>
-        </w:numPr>
-      </w:pPr>
-      <w:r>
-        <w:t>Delayed</w:t>
-      </w:r>
-    </w:p>
-    <w:p>
-      <w:pPr>
-        <w:pStyle w:val="ListParagraph"/>
-        <w:numPr>
-          <w:ilvl w:val="0"/>
-          <w:numId w:val="16"/>
-        </w:numPr>
-      </w:pPr>
-      <w:r>
-        <w:lastRenderedPageBreak/>
-        <w:t>Errant</w:t>
-      </w:r>
-    </w:p>
-    <w:p>
-      <w:pPr>
-        <w:pStyle w:val="ListParagraph"/>
-        <w:numPr>
-          <w:ilvl w:val="0"/>
-          <w:numId w:val="16"/>
-        </w:numPr>
-      </w:pPr>
-      <w:r>
-        <w:t>Lost</w:t>
-      </w:r>
-    </w:p>
-    <w:p>
-      <w:pPr>
-        <w:pStyle w:val="ListParagraph"/>
-        <w:numPr>
-          <w:ilvl w:val="0"/>
-          <w:numId w:val="16"/>
-        </w:numPr>
-      </w:pPr>
-      <w:r>
-        <w:t>Damaged</w:t>
-      </w:r>
-    </w:p>
-    <w:p>
-      <w:pPr>
-        <w:pStyle w:val="ListParagraph"/>
-      </w:pPr>
-    </w:p>
-    <w:p>
-      <w:pPr>
-        <w:pStyle w:val="ListParagraph"/>
-      </w:pPr>
-    </w:p>
-    <w:p>
-      <w:pPr>
-        <w:pStyle w:val="ListParagraph"/>
-      </w:pPr>
-    </w:p>
-    <w:p>
-      <w:pPr>
-        <w:pStyle w:val="ListParagraph"/>
-        <w:ind w:left="0"/>
-      </w:pPr>
-      <w:r>
-        <w:t>Flags</w:t>
-      </w:r>
-    </w:p>
-    <w:p>
-      <w:pPr>
-        <w:pStyle w:val="ListParagraph"/>
-        <w:numPr>
-          <w:ilvl w:val="0"/>
-          <w:numId w:val="17"/>
-        </w:numPr>
-      </w:pPr>
-      <w:r>
-        <w:t xml:space="preserve">Flags for Items – this </w:t>
-      </w:r>
-      <w:proofErr w:type="gramStart"/>
-      <w:r>
-        <w:t>reflect</w:t>
-      </w:r>
-      <w:proofErr w:type="gramEnd"/>
-      <w:r>
-        <w:t xml:space="preserve"> on Partial flag for the container</w:t>
-      </w:r>
-    </w:p>
-    <w:p>
-      <w:pPr>
-        <w:pStyle w:val="ListParagraph"/>
-        <w:numPr>
-          <w:ilvl w:val="1"/>
-          <w:numId w:val="17"/>
-        </w:numPr>
-      </w:pPr>
-      <w:r>
-        <w:t>Delayed</w:t>
-      </w:r>
-    </w:p>
-    <w:p>
-      <w:pPr>
-        <w:pStyle w:val="ListParagraph"/>
-        <w:numPr>
-          <w:ilvl w:val="1"/>
-          <w:numId w:val="17"/>
-        </w:numPr>
-      </w:pPr>
-      <w:r>
-        <w:t>Errant</w:t>
-      </w:r>
-    </w:p>
-    <w:p>
-      <w:pPr>
-        <w:pStyle w:val="ListParagraph"/>
-        <w:numPr>
-          <w:ilvl w:val="1"/>
-          <w:numId w:val="17"/>
-        </w:numPr>
-      </w:pPr>
-      <w:r>
-        <w:t>Lost</w:t>
-      </w:r>
-    </w:p>
-    <w:p>
-      <w:pPr>
-        <w:pStyle w:val="ListParagraph"/>
-        <w:numPr>
-          <w:ilvl w:val="1"/>
-          <w:numId w:val="17"/>
-        </w:numPr>
-      </w:pPr>
-      <w:r>
-        <w:t>Damaged</w:t>
-      </w:r>
-    </w:p>
-    <w:p>
-      <w:pPr>
-        <w:pStyle w:val="ListParagraph"/>
-        <w:numPr>
-          <w:ilvl w:val="0"/>
-          <w:numId w:val="17"/>
-        </w:numPr>
-      </w:pPr>
-      <w:r>
-        <w:t xml:space="preserve">Flags for Containers – this </w:t>
-      </w:r>
-      <w:proofErr w:type="gramStart"/>
-      <w:r>
-        <w:t>reflect</w:t>
-      </w:r>
-      <w:proofErr w:type="gramEnd"/>
-      <w:r>
-        <w:t xml:space="preserve"> on flags of all items in the container</w:t>
-      </w:r>
-    </w:p>
-    <w:p>
-      <w:pPr>
-        <w:pStyle w:val="ListParagraph"/>
-        <w:numPr>
-          <w:ilvl w:val="1"/>
-          <w:numId w:val="17"/>
-        </w:numPr>
-      </w:pPr>
-      <w:r>
-        <w:t>Delayed</w:t>
-      </w:r>
-    </w:p>
-    <w:p>
-      <w:pPr>
-        <w:pStyle w:val="ListParagraph"/>
-        <w:numPr>
-          <w:ilvl w:val="1"/>
-          <w:numId w:val="17"/>
-        </w:numPr>
-      </w:pPr>
-      <w:r>
-        <w:t>Errant</w:t>
-      </w:r>
-    </w:p>
-    <w:p>
-      <w:pPr>
-        <w:pStyle w:val="ListParagraph"/>
-        <w:numPr>
-          <w:ilvl w:val="1"/>
-          <w:numId w:val="17"/>
-        </w:numPr>
-      </w:pPr>
-      <w:r>
-        <w:t>Lost</w:t>
-      </w:r>
-    </w:p>
-    <w:p>
-      <w:pPr>
-        <w:pStyle w:val="ListParagraph"/>
-        <w:numPr>
-          <w:ilvl w:val="1"/>
-          <w:numId w:val="17"/>
-        </w:numPr>
-      </w:pPr>
-      <w:r>
-        <w:t>Damaged</w:t>
-      </w:r>
-    </w:p>
-    <w:p/>
-    <w:p>
-      <w:r>
-        <w:t>Compensations</w:t>
-      </w:r>
-    </w:p>
-    <w:p/>
-    <w:p/>
-    <w:p>
-      <w:r>
-        <w:t>Gifts</w:t>
-      </w:r>
-    </w:p>
-    <w:p>
-      <w:r>
-        <w:t xml:space="preserve">Gifts are items sent with </w:t>
-      </w:r>
-    </w:p>
-    <w:p/>
-    <w:p>
-      <w:r>
-        <w:t>Friendly Names</w:t>
-      </w:r>
-    </w:p>
-    <w:p>
-      <w:r>
-        <w:t>All containers should be viewed in the application with Friendly Names, as follows;</w:t>
+        <w:t>Request &gt;&gt; In case of Special Order; 3 X Requested from Supplier to Customer by Sales User, In case of non-Special Order &gt;&gt; 3 X Requested from Supplier by Sales User</w:t>
       </w:r>
     </w:p>
     <w:p>
@@ -2081,7 +2012,7 @@
         </w:numPr>
       </w:pPr>
       <w:r>
-        <w:t>Supplier &gt;&gt; Suppler Name</w:t>
+        <w:t>Purchase &gt;&gt; 3 X Purchased from Supplier to Destination</w:t>
       </w:r>
     </w:p>
     <w:p>
@@ -2093,15 +2024,7 @@
         </w:numPr>
       </w:pPr>
       <w:r>
-        <w:t xml:space="preserve">Request &gt;&gt; In case of Special Order; 3 X Requested from Supplier to Customer by Sales User, </w:t>
-      </w:r>
-      <w:proofErr w:type="gramStart"/>
-      <w:r>
-        <w:t>In</w:t>
-      </w:r>
-      <w:proofErr w:type="gramEnd"/>
-      <w:r>
-        <w:t xml:space="preserve"> case of non-Special Order &gt;&gt; 3 X Requested from Supplier by Sales User</w:t>
+        <w:t>Patch &gt;&gt; 3 X Shipped from Supplier to Destination</w:t>
       </w:r>
     </w:p>
     <w:p>
@@ -2113,7 +2036,7 @@
         </w:numPr>
       </w:pPr>
       <w:r>
-        <w:t>Purchase &gt;&gt; 3 X Purchased from Supplier to Destination</w:t>
+        <w:t>Traveler &gt;&gt; Traveler Name</w:t>
       </w:r>
     </w:p>
     <w:p>
@@ -2125,40 +2048,7 @@
         </w:numPr>
       </w:pPr>
       <w:r>
-        <w:t>Patch &gt;&gt; 3 X Shipped from Supplier to Destination</w:t>
-      </w:r>
-    </w:p>
-    <w:p>
-      <w:pPr>
-        <w:pStyle w:val="ListParagraph"/>
-        <w:numPr>
-          <w:ilvl w:val="0"/>
-          <w:numId w:val="18"/>
-        </w:numPr>
-      </w:pPr>
-      <w:r>
-        <w:t>Traveler &gt;&gt; Traveler Name</w:t>
-      </w:r>
-    </w:p>
-    <w:p>
-      <w:pPr>
-        <w:pStyle w:val="ListParagraph"/>
-        <w:numPr>
-          <w:ilvl w:val="0"/>
-          <w:numId w:val="18"/>
-        </w:numPr>
-      </w:pPr>
-      <w:r>
-        <w:lastRenderedPageBreak/>
-        <w:t xml:space="preserve">Trip &gt;&gt; Traveler </w:t>
-      </w:r>
-      <w:proofErr w:type="gramStart"/>
-      <w:r>
-        <w:t>name .</w:t>
-      </w:r>
-      <w:proofErr w:type="gramEnd"/>
-      <w:r>
-        <w:t xml:space="preserve"> Date (which is Last Receiving Date)</w:t>
+        <w:t>Trip &gt;&gt; Traveler name . Date (which is Last Receiving Date)</w:t>
       </w:r>
     </w:p>
     <w:p>
@@ -2332,7 +2222,6 @@
           <w:bCs/>
           <w:color w:val="196B24" w:themeColor="accent3"/>
         </w:rPr>
-        <w:lastRenderedPageBreak/>
         <w:t>Expenses Module</w:t>
       </w:r>
       <w:r>
@@ -2610,23 +2499,7 @@
           <w:color w:val="196B24" w:themeColor="accent3"/>
           <w:lang w:bidi="ar-EG"/>
         </w:rPr>
-        <w:t xml:space="preserve">Product shape [symbol in calculation formula ‘S’] – select from list (Capsules/Tablets, </w:t>
-      </w:r>
-      <w:proofErr w:type="spellStart"/>
-      <w:r>
-        <w:rPr>
-          <w:color w:val="196B24" w:themeColor="accent3"/>
-          <w:lang w:bidi="ar-EG"/>
-        </w:rPr>
-        <w:t>Softgels</w:t>
-      </w:r>
-      <w:proofErr w:type="spellEnd"/>
-      <w:r>
-        <w:rPr>
-          <w:color w:val="196B24" w:themeColor="accent3"/>
-          <w:lang w:bidi="ar-EG"/>
-        </w:rPr>
-        <w:t>/Chews, Powder/Creamy, Gummies, Liquid, Injection) – each product shape has multiplier that can be edited in the admin side</w:t>
+        <w:t>Product shape [symbol in calculation formula ‘S’] – select from list (Capsules/Tablets, Softgels/Chews, Powder/Creamy, Gummies, Liquid, Injection) – each product shape has multiplier that can be edited in the admin side</w:t>
       </w:r>
     </w:p>
     <w:p>
@@ -2777,16 +2650,8 @@
         <w:rPr>
           <w:color w:val="196B24" w:themeColor="accent3"/>
         </w:rPr>
-        <w:t xml:space="preserve">with a </w:t>
-      </w:r>
-      <w:proofErr w:type="gramStart"/>
-      <w:r>
-        <w:rPr>
-          <w:color w:val="196B24" w:themeColor="accent3"/>
-        </w:rPr>
-        <w:t>little different calculations</w:t>
-      </w:r>
-      <w:proofErr w:type="gramEnd"/>
+        <w:t>with a little different calculations</w:t>
+      </w:r>
     </w:p>
     <w:p>
       <w:pPr>
@@ -3177,21 +3042,7 @@
         <w:rPr>
           <w:lang w:bidi="ar-EG"/>
         </w:rPr>
-        <w:t xml:space="preserve">Product shape [symbol in calculation formula ‘S’] – select from list (Capsules/Tablets, </w:t>
-      </w:r>
-      <w:proofErr w:type="spellStart"/>
-      <w:r>
-        <w:rPr>
-          <w:lang w:bidi="ar-EG"/>
-        </w:rPr>
-        <w:t>Softgels</w:t>
-      </w:r>
-      <w:proofErr w:type="spellEnd"/>
-      <w:r>
-        <w:rPr>
-          <w:lang w:bidi="ar-EG"/>
-        </w:rPr>
-        <w:t>/Chews, Powder/Creamy, Gummies, Liquid, Injection)</w:t>
+        <w:t>Product shape [symbol in calculation formula ‘S’] – select from list (Capsules/Tablets, Softgels/Chews, Powder/Creamy, Gummies, Liquid, Injection)</w:t>
       </w:r>
       <w:r>
         <w:rPr>
@@ -3623,14 +3474,7 @@
         <w:rPr>
           <w:lang w:bidi="ar-EG"/>
         </w:rPr>
-        <w:t>[</w:t>
-      </w:r>
-      <w:proofErr w:type="spellStart"/>
-      <w:r>
-        <w:rPr>
-          <w:lang w:bidi="ar-EG"/>
-        </w:rPr>
-        <w:t>I</w:t>
+        <w:t>[I</w:t>
       </w:r>
       <w:r>
         <w:rPr>
@@ -3638,7 +3482,6 @@
         </w:rPr>
         <w:t>c</w:t>
       </w:r>
-      <w:proofErr w:type="spellEnd"/>
       <w:r>
         <w:rPr>
           <w:lang w:bidi="ar-EG"/>
@@ -3808,19 +3651,11 @@
           <w:lang w:bidi="ar-EG"/>
         </w:rPr>
       </w:pPr>
-      <w:proofErr w:type="spellStart"/>
-      <w:r>
-        <w:rPr>
-          <w:lang w:bidi="ar-EG"/>
-        </w:rPr>
-        <w:t>Fx</w:t>
-      </w:r>
-      <w:proofErr w:type="spellEnd"/>
-      <w:r>
-        <w:rPr>
-          <w:lang w:bidi="ar-EG"/>
-        </w:rPr>
-        <w:t xml:space="preserve"> = 54 – editable in admin side</w:t>
+      <w:r>
+        <w:rPr>
+          <w:lang w:bidi="ar-EG"/>
+        </w:rPr>
+        <w:t>Fx = 54 – editable in admin side</w:t>
       </w:r>
     </w:p>
     <w:p>
@@ -4057,21 +3892,7 @@
         <w:rPr>
           <w:lang w:bidi="ar-EG"/>
         </w:rPr>
-        <w:t xml:space="preserve">if days equal 1 to </w:t>
-      </w:r>
-      <w:proofErr w:type="gramStart"/>
-      <w:r>
-        <w:rPr>
-          <w:lang w:bidi="ar-EG"/>
-        </w:rPr>
-        <w:t>30 ,</w:t>
-      </w:r>
-      <w:proofErr w:type="gramEnd"/>
-      <w:r>
-        <w:rPr>
-          <w:lang w:bidi="ar-EG"/>
-        </w:rPr>
-        <w:t xml:space="preserve"> then G = 3 then GC=0</w:t>
+        <w:t>if days equal 1 to 30 , then G = 3 then GC=0</w:t>
       </w:r>
     </w:p>
     <w:p>
@@ -4089,21 +3910,7 @@
         <w:rPr>
           <w:lang w:bidi="ar-EG"/>
         </w:rPr>
-        <w:t xml:space="preserve">if days equal 31 to </w:t>
-      </w:r>
-      <w:proofErr w:type="gramStart"/>
-      <w:r>
-        <w:rPr>
-          <w:lang w:bidi="ar-EG"/>
-        </w:rPr>
-        <w:t>60 ,</w:t>
-      </w:r>
-      <w:proofErr w:type="gramEnd"/>
-      <w:r>
-        <w:rPr>
-          <w:lang w:bidi="ar-EG"/>
-        </w:rPr>
-        <w:t xml:space="preserve"> then G = 2</w:t>
+        <w:t>if days equal 31 to 60 , then G = 2</w:t>
       </w:r>
       <w:r>
         <w:rPr>
@@ -4133,21 +3940,7 @@
         <w:rPr>
           <w:lang w:bidi="ar-EG"/>
         </w:rPr>
-        <w:t xml:space="preserve">if days more than </w:t>
-      </w:r>
-      <w:proofErr w:type="gramStart"/>
-      <w:r>
-        <w:rPr>
-          <w:lang w:bidi="ar-EG"/>
-        </w:rPr>
-        <w:t>60 ,</w:t>
-      </w:r>
-      <w:proofErr w:type="gramEnd"/>
-      <w:r>
-        <w:rPr>
-          <w:lang w:bidi="ar-EG"/>
-        </w:rPr>
-        <w:t xml:space="preserve"> then G = 1</w:t>
+        <w:t>if days more than 60 , then G = 1</w:t>
       </w:r>
       <w:r>
         <w:rPr>
@@ -4620,6 +4413,119 @@
     </w:lvl>
   </w:abstractNum>
   <w:abstractNum w:abstractNumId="4" w15:restartNumberingAfterBreak="0">
+    <w:nsid w:val="185C30FA"/>
+    <w:multiLevelType w:val="hybridMultilevel"/>
+    <w:tmpl w:val="8EE696F2"/>
+    <w:lvl w:ilvl="0" w:tplc="FFFFFFFF">
+      <w:start w:val="1"/>
+      <w:numFmt w:val="decimal"/>
+      <w:lvlText w:val="%1."/>
+      <w:lvlJc w:val="left"/>
+      <w:pPr>
+        <w:ind w:left="720" w:hanging="360"/>
+      </w:pPr>
+      <w:rPr>
+        <w:rFonts w:hint="default"/>
+      </w:rPr>
+    </w:lvl>
+    <w:lvl w:ilvl="1" w:tplc="FFFFFFFF" w:tentative="1">
+      <w:start w:val="1"/>
+      <w:numFmt w:val="bullet"/>
+      <w:lvlText w:val="o"/>
+      <w:lvlJc w:val="left"/>
+      <w:pPr>
+        <w:ind w:left="1440" w:hanging="360"/>
+      </w:pPr>
+      <w:rPr>
+        <w:rFonts w:ascii="Courier New" w:hAnsi="Courier New" w:cs="Courier New" w:hint="default"/>
+      </w:rPr>
+    </w:lvl>
+    <w:lvl w:ilvl="2" w:tplc="FFFFFFFF" w:tentative="1">
+      <w:start w:val="1"/>
+      <w:numFmt w:val="bullet"/>
+      <w:lvlText w:val=""/>
+      <w:lvlJc w:val="left"/>
+      <w:pPr>
+        <w:ind w:left="2160" w:hanging="360"/>
+      </w:pPr>
+      <w:rPr>
+        <w:rFonts w:ascii="Wingdings" w:hAnsi="Wingdings" w:hint="default"/>
+      </w:rPr>
+    </w:lvl>
+    <w:lvl w:ilvl="3" w:tplc="FFFFFFFF" w:tentative="1">
+      <w:start w:val="1"/>
+      <w:numFmt w:val="bullet"/>
+      <w:lvlText w:val=""/>
+      <w:lvlJc w:val="left"/>
+      <w:pPr>
+        <w:ind w:left="2880" w:hanging="360"/>
+      </w:pPr>
+      <w:rPr>
+        <w:rFonts w:ascii="Symbol" w:hAnsi="Symbol" w:hint="default"/>
+      </w:rPr>
+    </w:lvl>
+    <w:lvl w:ilvl="4" w:tplc="FFFFFFFF" w:tentative="1">
+      <w:start w:val="1"/>
+      <w:numFmt w:val="bullet"/>
+      <w:lvlText w:val="o"/>
+      <w:lvlJc w:val="left"/>
+      <w:pPr>
+        <w:ind w:left="3600" w:hanging="360"/>
+      </w:pPr>
+      <w:rPr>
+        <w:rFonts w:ascii="Courier New" w:hAnsi="Courier New" w:cs="Courier New" w:hint="default"/>
+      </w:rPr>
+    </w:lvl>
+    <w:lvl w:ilvl="5" w:tplc="FFFFFFFF" w:tentative="1">
+      <w:start w:val="1"/>
+      <w:numFmt w:val="bullet"/>
+      <w:lvlText w:val=""/>
+      <w:lvlJc w:val="left"/>
+      <w:pPr>
+        <w:ind w:left="4320" w:hanging="360"/>
+      </w:pPr>
+      <w:rPr>
+        <w:rFonts w:ascii="Wingdings" w:hAnsi="Wingdings" w:hint="default"/>
+      </w:rPr>
+    </w:lvl>
+    <w:lvl w:ilvl="6" w:tplc="FFFFFFFF" w:tentative="1">
+      <w:start w:val="1"/>
+      <w:numFmt w:val="bullet"/>
+      <w:lvlText w:val=""/>
+      <w:lvlJc w:val="left"/>
+      <w:pPr>
+        <w:ind w:left="5040" w:hanging="360"/>
+      </w:pPr>
+      <w:rPr>
+        <w:rFonts w:ascii="Symbol" w:hAnsi="Symbol" w:hint="default"/>
+      </w:rPr>
+    </w:lvl>
+    <w:lvl w:ilvl="7" w:tplc="FFFFFFFF" w:tentative="1">
+      <w:start w:val="1"/>
+      <w:numFmt w:val="bullet"/>
+      <w:lvlText w:val="o"/>
+      <w:lvlJc w:val="left"/>
+      <w:pPr>
+        <w:ind w:left="5760" w:hanging="360"/>
+      </w:pPr>
+      <w:rPr>
+        <w:rFonts w:ascii="Courier New" w:hAnsi="Courier New" w:cs="Courier New" w:hint="default"/>
+      </w:rPr>
+    </w:lvl>
+    <w:lvl w:ilvl="8" w:tplc="FFFFFFFF" w:tentative="1">
+      <w:start w:val="1"/>
+      <w:numFmt w:val="bullet"/>
+      <w:lvlText w:val=""/>
+      <w:lvlJc w:val="left"/>
+      <w:pPr>
+        <w:ind w:left="6480" w:hanging="360"/>
+      </w:pPr>
+      <w:rPr>
+        <w:rFonts w:ascii="Wingdings" w:hAnsi="Wingdings" w:hint="default"/>
+      </w:rPr>
+    </w:lvl>
+  </w:abstractNum>
+  <w:abstractNum w:abstractNumId="5" w15:restartNumberingAfterBreak="0">
     <w:nsid w:val="18DD7DB1"/>
     <w:multiLevelType w:val="hybridMultilevel"/>
     <w:tmpl w:val="26C6C6FA"/>
@@ -4708,7 +4614,7 @@
       </w:pPr>
     </w:lvl>
   </w:abstractNum>
-  <w:abstractNum w:abstractNumId="5" w15:restartNumberingAfterBreak="0">
+  <w:abstractNum w:abstractNumId="6" w15:restartNumberingAfterBreak="0">
     <w:nsid w:val="23FA5BD3"/>
     <w:multiLevelType w:val="hybridMultilevel"/>
     <w:tmpl w:val="AC06FC4A"/>
@@ -4797,7 +4703,7 @@
       </w:pPr>
     </w:lvl>
   </w:abstractNum>
-  <w:abstractNum w:abstractNumId="6" w15:restartNumberingAfterBreak="0">
+  <w:abstractNum w:abstractNumId="7" w15:restartNumberingAfterBreak="0">
     <w:nsid w:val="27291644"/>
     <w:multiLevelType w:val="hybridMultilevel"/>
     <w:tmpl w:val="461ADAC4"/>
@@ -4910,7 +4816,7 @@
       </w:rPr>
     </w:lvl>
   </w:abstractNum>
-  <w:abstractNum w:abstractNumId="7" w15:restartNumberingAfterBreak="0">
+  <w:abstractNum w:abstractNumId="8" w15:restartNumberingAfterBreak="0">
     <w:nsid w:val="29642790"/>
     <w:multiLevelType w:val="hybridMultilevel"/>
     <w:tmpl w:val="C1B6FEFC"/>
@@ -4999,7 +4905,7 @@
       </w:pPr>
     </w:lvl>
   </w:abstractNum>
-  <w:abstractNum w:abstractNumId="8" w15:restartNumberingAfterBreak="0">
+  <w:abstractNum w:abstractNumId="9" w15:restartNumberingAfterBreak="0">
     <w:nsid w:val="326176B3"/>
     <w:multiLevelType w:val="hybridMultilevel"/>
     <w:tmpl w:val="29D8BB8A"/>
@@ -5085,7 +4991,7 @@
       </w:pPr>
     </w:lvl>
   </w:abstractNum>
-  <w:abstractNum w:abstractNumId="9" w15:restartNumberingAfterBreak="0">
+  <w:abstractNum w:abstractNumId="10" w15:restartNumberingAfterBreak="0">
     <w:nsid w:val="33B97F5D"/>
     <w:multiLevelType w:val="hybridMultilevel"/>
     <w:tmpl w:val="03367ED8"/>
@@ -5174,7 +5080,7 @@
       </w:pPr>
     </w:lvl>
   </w:abstractNum>
-  <w:abstractNum w:abstractNumId="10" w15:restartNumberingAfterBreak="0">
+  <w:abstractNum w:abstractNumId="11" w15:restartNumberingAfterBreak="0">
     <w:nsid w:val="3BAD0B6B"/>
     <w:multiLevelType w:val="hybridMultilevel"/>
     <w:tmpl w:val="A0928DC6"/>
@@ -5287,7 +5193,96 @@
       </w:rPr>
     </w:lvl>
   </w:abstractNum>
-  <w:abstractNum w:abstractNumId="11" w15:restartNumberingAfterBreak="0">
+  <w:abstractNum w:abstractNumId="12" w15:restartNumberingAfterBreak="0">
+    <w:nsid w:val="3FF54E8A"/>
+    <w:multiLevelType w:val="hybridMultilevel"/>
+    <w:tmpl w:val="5E344400"/>
+    <w:lvl w:ilvl="0" w:tplc="0409000F">
+      <w:start w:val="1"/>
+      <w:numFmt w:val="decimal"/>
+      <w:lvlText w:val="%1."/>
+      <w:lvlJc w:val="left"/>
+      <w:pPr>
+        <w:ind w:left="720" w:hanging="360"/>
+      </w:pPr>
+      <w:rPr>
+        <w:rFonts w:hint="default"/>
+      </w:rPr>
+    </w:lvl>
+    <w:lvl w:ilvl="1" w:tplc="04090019" w:tentative="1">
+      <w:start w:val="1"/>
+      <w:numFmt w:val="lowerLetter"/>
+      <w:lvlText w:val="%2."/>
+      <w:lvlJc w:val="left"/>
+      <w:pPr>
+        <w:ind w:left="1440" w:hanging="360"/>
+      </w:pPr>
+    </w:lvl>
+    <w:lvl w:ilvl="2" w:tplc="0409001B" w:tentative="1">
+      <w:start w:val="1"/>
+      <w:numFmt w:val="lowerRoman"/>
+      <w:lvlText w:val="%3."/>
+      <w:lvlJc w:val="right"/>
+      <w:pPr>
+        <w:ind w:left="2160" w:hanging="180"/>
+      </w:pPr>
+    </w:lvl>
+    <w:lvl w:ilvl="3" w:tplc="0409000F" w:tentative="1">
+      <w:start w:val="1"/>
+      <w:numFmt w:val="decimal"/>
+      <w:lvlText w:val="%4."/>
+      <w:lvlJc w:val="left"/>
+      <w:pPr>
+        <w:ind w:left="2880" w:hanging="360"/>
+      </w:pPr>
+    </w:lvl>
+    <w:lvl w:ilvl="4" w:tplc="04090019" w:tentative="1">
+      <w:start w:val="1"/>
+      <w:numFmt w:val="lowerLetter"/>
+      <w:lvlText w:val="%5."/>
+      <w:lvlJc w:val="left"/>
+      <w:pPr>
+        <w:ind w:left="3600" w:hanging="360"/>
+      </w:pPr>
+    </w:lvl>
+    <w:lvl w:ilvl="5" w:tplc="0409001B" w:tentative="1">
+      <w:start w:val="1"/>
+      <w:numFmt w:val="lowerRoman"/>
+      <w:lvlText w:val="%6."/>
+      <w:lvlJc w:val="right"/>
+      <w:pPr>
+        <w:ind w:left="4320" w:hanging="180"/>
+      </w:pPr>
+    </w:lvl>
+    <w:lvl w:ilvl="6" w:tplc="0409000F" w:tentative="1">
+      <w:start w:val="1"/>
+      <w:numFmt w:val="decimal"/>
+      <w:lvlText w:val="%7."/>
+      <w:lvlJc w:val="left"/>
+      <w:pPr>
+        <w:ind w:left="5040" w:hanging="360"/>
+      </w:pPr>
+    </w:lvl>
+    <w:lvl w:ilvl="7" w:tplc="04090019" w:tentative="1">
+      <w:start w:val="1"/>
+      <w:numFmt w:val="lowerLetter"/>
+      <w:lvlText w:val="%8."/>
+      <w:lvlJc w:val="left"/>
+      <w:pPr>
+        <w:ind w:left="5760" w:hanging="360"/>
+      </w:pPr>
+    </w:lvl>
+    <w:lvl w:ilvl="8" w:tplc="0409001B" w:tentative="1">
+      <w:start w:val="1"/>
+      <w:numFmt w:val="lowerRoman"/>
+      <w:lvlText w:val="%9."/>
+      <w:lvlJc w:val="right"/>
+      <w:pPr>
+        <w:ind w:left="6480" w:hanging="180"/>
+      </w:pPr>
+    </w:lvl>
+  </w:abstractNum>
+  <w:abstractNum w:abstractNumId="13" w15:restartNumberingAfterBreak="0">
     <w:nsid w:val="42CF3E2F"/>
     <w:multiLevelType w:val="hybridMultilevel"/>
     <w:tmpl w:val="E6D65468"/>
@@ -5400,7 +5395,7 @@
       </w:rPr>
     </w:lvl>
   </w:abstractNum>
-  <w:abstractNum w:abstractNumId="12" w15:restartNumberingAfterBreak="0">
+  <w:abstractNum w:abstractNumId="14" w15:restartNumberingAfterBreak="0">
     <w:nsid w:val="45EC2CC5"/>
     <w:multiLevelType w:val="hybridMultilevel"/>
     <w:tmpl w:val="978C5BB8"/>
@@ -5489,7 +5484,7 @@
       </w:pPr>
     </w:lvl>
   </w:abstractNum>
-  <w:abstractNum w:abstractNumId="13" w15:restartNumberingAfterBreak="0">
+  <w:abstractNum w:abstractNumId="15" w15:restartNumberingAfterBreak="0">
     <w:nsid w:val="48732311"/>
     <w:multiLevelType w:val="hybridMultilevel"/>
     <w:tmpl w:val="03565E9C"/>
@@ -5602,7 +5597,7 @@
       </w:rPr>
     </w:lvl>
   </w:abstractNum>
-  <w:abstractNum w:abstractNumId="14" w15:restartNumberingAfterBreak="0">
+  <w:abstractNum w:abstractNumId="16" w15:restartNumberingAfterBreak="0">
     <w:nsid w:val="54395ECA"/>
     <w:multiLevelType w:val="hybridMultilevel"/>
     <w:tmpl w:val="4DB6B126"/>
@@ -5691,7 +5686,7 @@
       </w:pPr>
     </w:lvl>
   </w:abstractNum>
-  <w:abstractNum w:abstractNumId="15" w15:restartNumberingAfterBreak="0">
+  <w:abstractNum w:abstractNumId="17" w15:restartNumberingAfterBreak="0">
     <w:nsid w:val="5EC321D4"/>
     <w:multiLevelType w:val="hybridMultilevel"/>
     <w:tmpl w:val="6E3ED2EA"/>
@@ -5780,7 +5775,7 @@
       </w:pPr>
     </w:lvl>
   </w:abstractNum>
-  <w:abstractNum w:abstractNumId="16" w15:restartNumberingAfterBreak="0">
+  <w:abstractNum w:abstractNumId="18" w15:restartNumberingAfterBreak="0">
     <w:nsid w:val="5F517413"/>
     <w:multiLevelType w:val="hybridMultilevel"/>
     <w:tmpl w:val="7CB0D35A"/>
@@ -5893,7 +5888,7 @@
       </w:rPr>
     </w:lvl>
   </w:abstractNum>
-  <w:abstractNum w:abstractNumId="17" w15:restartNumberingAfterBreak="0">
+  <w:abstractNum w:abstractNumId="19" w15:restartNumberingAfterBreak="0">
     <w:nsid w:val="5F772985"/>
     <w:multiLevelType w:val="hybridMultilevel"/>
     <w:tmpl w:val="20525B26"/>
@@ -5979,7 +5974,7 @@
       </w:pPr>
     </w:lvl>
   </w:abstractNum>
-  <w:abstractNum w:abstractNumId="18" w15:restartNumberingAfterBreak="0">
+  <w:abstractNum w:abstractNumId="20" w15:restartNumberingAfterBreak="0">
     <w:nsid w:val="64B413BB"/>
     <w:multiLevelType w:val="hybridMultilevel"/>
     <w:tmpl w:val="96A6D232"/>
@@ -6068,7 +6063,7 @@
       </w:pPr>
     </w:lvl>
   </w:abstractNum>
-  <w:abstractNum w:abstractNumId="19" w15:restartNumberingAfterBreak="0">
+  <w:abstractNum w:abstractNumId="21" w15:restartNumberingAfterBreak="0">
     <w:nsid w:val="6A7C5CB3"/>
     <w:multiLevelType w:val="hybridMultilevel"/>
     <w:tmpl w:val="5C9C4FC4"/>
@@ -6180,7 +6175,7 @@
       </w:rPr>
     </w:lvl>
   </w:abstractNum>
-  <w:abstractNum w:abstractNumId="20" w15:restartNumberingAfterBreak="0">
+  <w:abstractNum w:abstractNumId="22" w15:restartNumberingAfterBreak="0">
     <w:nsid w:val="702E6DD6"/>
     <w:multiLevelType w:val="hybridMultilevel"/>
     <w:tmpl w:val="04B4B522"/>
@@ -6269,7 +6264,120 @@
       </w:pPr>
     </w:lvl>
   </w:abstractNum>
-  <w:abstractNum w:abstractNumId="21" w15:restartNumberingAfterBreak="0">
+  <w:abstractNum w:abstractNumId="23" w15:restartNumberingAfterBreak="0">
+    <w:nsid w:val="71173C80"/>
+    <w:multiLevelType w:val="hybridMultilevel"/>
+    <w:tmpl w:val="8EE696F2"/>
+    <w:lvl w:ilvl="0" w:tplc="FFFFFFFF">
+      <w:start w:val="1"/>
+      <w:numFmt w:val="decimal"/>
+      <w:lvlText w:val="%1."/>
+      <w:lvlJc w:val="left"/>
+      <w:pPr>
+        <w:ind w:left="720" w:hanging="360"/>
+      </w:pPr>
+      <w:rPr>
+        <w:rFonts w:hint="default"/>
+      </w:rPr>
+    </w:lvl>
+    <w:lvl w:ilvl="1" w:tplc="FFFFFFFF" w:tentative="1">
+      <w:start w:val="1"/>
+      <w:numFmt w:val="bullet"/>
+      <w:lvlText w:val="o"/>
+      <w:lvlJc w:val="left"/>
+      <w:pPr>
+        <w:ind w:left="1440" w:hanging="360"/>
+      </w:pPr>
+      <w:rPr>
+        <w:rFonts w:ascii="Courier New" w:hAnsi="Courier New" w:cs="Courier New" w:hint="default"/>
+      </w:rPr>
+    </w:lvl>
+    <w:lvl w:ilvl="2" w:tplc="FFFFFFFF" w:tentative="1">
+      <w:start w:val="1"/>
+      <w:numFmt w:val="bullet"/>
+      <w:lvlText w:val=""/>
+      <w:lvlJc w:val="left"/>
+      <w:pPr>
+        <w:ind w:left="2160" w:hanging="360"/>
+      </w:pPr>
+      <w:rPr>
+        <w:rFonts w:ascii="Wingdings" w:hAnsi="Wingdings" w:hint="default"/>
+      </w:rPr>
+    </w:lvl>
+    <w:lvl w:ilvl="3" w:tplc="FFFFFFFF" w:tentative="1">
+      <w:start w:val="1"/>
+      <w:numFmt w:val="bullet"/>
+      <w:lvlText w:val=""/>
+      <w:lvlJc w:val="left"/>
+      <w:pPr>
+        <w:ind w:left="2880" w:hanging="360"/>
+      </w:pPr>
+      <w:rPr>
+        <w:rFonts w:ascii="Symbol" w:hAnsi="Symbol" w:hint="default"/>
+      </w:rPr>
+    </w:lvl>
+    <w:lvl w:ilvl="4" w:tplc="FFFFFFFF" w:tentative="1">
+      <w:start w:val="1"/>
+      <w:numFmt w:val="bullet"/>
+      <w:lvlText w:val="o"/>
+      <w:lvlJc w:val="left"/>
+      <w:pPr>
+        <w:ind w:left="3600" w:hanging="360"/>
+      </w:pPr>
+      <w:rPr>
+        <w:rFonts w:ascii="Courier New" w:hAnsi="Courier New" w:cs="Courier New" w:hint="default"/>
+      </w:rPr>
+    </w:lvl>
+    <w:lvl w:ilvl="5" w:tplc="FFFFFFFF" w:tentative="1">
+      <w:start w:val="1"/>
+      <w:numFmt w:val="bullet"/>
+      <w:lvlText w:val=""/>
+      <w:lvlJc w:val="left"/>
+      <w:pPr>
+        <w:ind w:left="4320" w:hanging="360"/>
+      </w:pPr>
+      <w:rPr>
+        <w:rFonts w:ascii="Wingdings" w:hAnsi="Wingdings" w:hint="default"/>
+      </w:rPr>
+    </w:lvl>
+    <w:lvl w:ilvl="6" w:tplc="FFFFFFFF" w:tentative="1">
+      <w:start w:val="1"/>
+      <w:numFmt w:val="bullet"/>
+      <w:lvlText w:val=""/>
+      <w:lvlJc w:val="left"/>
+      <w:pPr>
+        <w:ind w:left="5040" w:hanging="360"/>
+      </w:pPr>
+      <w:rPr>
+        <w:rFonts w:ascii="Symbol" w:hAnsi="Symbol" w:hint="default"/>
+      </w:rPr>
+    </w:lvl>
+    <w:lvl w:ilvl="7" w:tplc="FFFFFFFF" w:tentative="1">
+      <w:start w:val="1"/>
+      <w:numFmt w:val="bullet"/>
+      <w:lvlText w:val="o"/>
+      <w:lvlJc w:val="left"/>
+      <w:pPr>
+        <w:ind w:left="5760" w:hanging="360"/>
+      </w:pPr>
+      <w:rPr>
+        <w:rFonts w:ascii="Courier New" w:hAnsi="Courier New" w:cs="Courier New" w:hint="default"/>
+      </w:rPr>
+    </w:lvl>
+    <w:lvl w:ilvl="8" w:tplc="FFFFFFFF" w:tentative="1">
+      <w:start w:val="1"/>
+      <w:numFmt w:val="bullet"/>
+      <w:lvlText w:val=""/>
+      <w:lvlJc w:val="left"/>
+      <w:pPr>
+        <w:ind w:left="6480" w:hanging="360"/>
+      </w:pPr>
+      <w:rPr>
+        <w:rFonts w:ascii="Wingdings" w:hAnsi="Wingdings" w:hint="default"/>
+      </w:rPr>
+    </w:lvl>
+  </w:abstractNum>
+  <w:abstractNum w:abstractNumId="24" w15:restartNumberingAfterBreak="0">
     <w:nsid w:val="7D9D3417"/>
     <w:multiLevelType w:val="hybridMultilevel"/>
     <w:tmpl w:val="03367ED8"/>
@@ -6359,7 +6467,7 @@
     </w:lvl>
   </w:abstractNum>
   <w:num w:numId="1" w16cid:durableId="1193694031">
-    <w:abstractNumId w:val="19"/>
+    <w:abstractNumId w:val="21"/>
   </w:num>
   <w:num w:numId="2" w16cid:durableId="1230458739">
     <w:abstractNumId w:val="1"/>
@@ -6368,61 +6476,70 @@
     <w:abstractNumId w:val="2"/>
   </w:num>
   <w:num w:numId="4" w16cid:durableId="878856215">
-    <w:abstractNumId w:val="17"/>
+    <w:abstractNumId w:val="19"/>
   </w:num>
   <w:num w:numId="5" w16cid:durableId="1894077811">
+    <w:abstractNumId w:val="6"/>
+  </w:num>
+  <w:num w:numId="6" w16cid:durableId="1035351593">
     <w:abstractNumId w:val="5"/>
   </w:num>
-  <w:num w:numId="6" w16cid:durableId="1035351593">
-    <w:abstractNumId w:val="4"/>
-  </w:num>
   <w:num w:numId="7" w16cid:durableId="1913928248">
-    <w:abstractNumId w:val="16"/>
+    <w:abstractNumId w:val="18"/>
   </w:num>
   <w:num w:numId="8" w16cid:durableId="1499349636">
-    <w:abstractNumId w:val="11"/>
+    <w:abstractNumId w:val="13"/>
   </w:num>
   <w:num w:numId="9" w16cid:durableId="1114789797">
     <w:abstractNumId w:val="0"/>
   </w:num>
   <w:num w:numId="10" w16cid:durableId="1153989169">
-    <w:abstractNumId w:val="6"/>
+    <w:abstractNumId w:val="7"/>
   </w:num>
   <w:num w:numId="11" w16cid:durableId="854884316">
-    <w:abstractNumId w:val="9"/>
+    <w:abstractNumId w:val="10"/>
   </w:num>
   <w:num w:numId="12" w16cid:durableId="2131852888">
-    <w:abstractNumId w:val="18"/>
+    <w:abstractNumId w:val="20"/>
   </w:num>
   <w:num w:numId="13" w16cid:durableId="2088113893">
-    <w:abstractNumId w:val="13"/>
+    <w:abstractNumId w:val="15"/>
   </w:num>
   <w:num w:numId="14" w16cid:durableId="848449906">
-    <w:abstractNumId w:val="10"/>
+    <w:abstractNumId w:val="11"/>
   </w:num>
   <w:num w:numId="15" w16cid:durableId="1511139773">
-    <w:abstractNumId w:val="20"/>
+    <w:abstractNumId w:val="22"/>
   </w:num>
   <w:num w:numId="16" w16cid:durableId="148637161">
-    <w:abstractNumId w:val="21"/>
+    <w:abstractNumId w:val="24"/>
   </w:num>
   <w:num w:numId="17" w16cid:durableId="1011494376">
-    <w:abstractNumId w:val="12"/>
+    <w:abstractNumId w:val="14"/>
   </w:num>
   <w:num w:numId="18" w16cid:durableId="1846704498">
     <w:abstractNumId w:val="3"/>
   </w:num>
   <w:num w:numId="19" w16cid:durableId="1249265432">
-    <w:abstractNumId w:val="15"/>
+    <w:abstractNumId w:val="17"/>
   </w:num>
   <w:num w:numId="20" w16cid:durableId="1135560392">
+    <w:abstractNumId w:val="9"/>
+  </w:num>
+  <w:num w:numId="21" w16cid:durableId="1421294308">
+    <w:abstractNumId w:val="16"/>
+  </w:num>
+  <w:num w:numId="22" w16cid:durableId="44064616">
     <w:abstractNumId w:val="8"/>
   </w:num>
-  <w:num w:numId="21" w16cid:durableId="1421294308">
-    <w:abstractNumId w:val="14"/>
+  <w:num w:numId="23" w16cid:durableId="763112585">
+    <w:abstractNumId w:val="23"/>
   </w:num>
-  <w:num w:numId="22" w16cid:durableId="44064616">
-    <w:abstractNumId w:val="7"/>
+  <w:num w:numId="24" w16cid:durableId="492573669">
+    <w:abstractNumId w:val="4"/>
+  </w:num>
+  <w:num w:numId="25" w16cid:durableId="1278292986">
+    <w:abstractNumId w:val="12"/>
   </w:num>
 </w:numbering>
 </file>

</xml_diff>

<commit_message>
Batch 2: centralize module settings + Save All
- Settings module now has a two-level sidebar (General/Pricing/Expenses/Logistics);
  each group gated by its owning module's MANAGE (canAccessSettings helper); the
  dashboard + module switcher show Settings for any settings-area manager.
- Moved Pricing Variables -> /settings/pricing/variables and Expenses
  Categories/Accounts -> /settings/expenses/* (removed from their own sidebars;
  Monthly Sales/Bank Collections/Audit stay in Expenses).
- Suppliers, Categories, Accounts rebuilt with the 'Save All' pattern: one form,
  all rows batched in a transaction (+ remove checkbox + trailing add row).
- Sidebar gains grouped rendering. Verified: tsc 0, build clean, routes/old-404s.

Co-Authored-By: Claude Opus 4.8 <noreply@anthropic.com>
</commit_message>
<xml_diff>
--- a/PDD.docx
+++ b/PDD.docx
@@ -16,6 +16,7 @@
         </w:rPr>
         <w:t xml:space="preserve">What is </w:t>
       </w:r>
+      <w:proofErr w:type="spellStart"/>
       <w:r>
         <w:rPr>
           <w:b/>
@@ -23,24 +24,55 @@
         </w:rPr>
         <w:t>YeldnIN</w:t>
       </w:r>
-      <w:r>
-        <w:rPr>
-          <w:b/>
-          <w:bCs/>
-        </w:rPr>
-        <w:t xml:space="preserve"> app ?</w:t>
-      </w:r>
-    </w:p>
-    <w:p>
-      <w:r>
-        <w:t xml:space="preserve">YeldnIN is the </w:t>
-      </w:r>
-      <w:r>
-        <w:rPr>
-          <w:b/>
-          <w:bCs/>
-        </w:rPr>
-        <w:t>internal back-office platform for "Yeldn Health"</w:t>
+      <w:proofErr w:type="spellEnd"/>
+      <w:r>
+        <w:rPr>
+          <w:b/>
+          <w:bCs/>
+        </w:rPr>
+        <w:t xml:space="preserve"> </w:t>
+      </w:r>
+      <w:proofErr w:type="gramStart"/>
+      <w:r>
+        <w:rPr>
+          <w:b/>
+          <w:bCs/>
+        </w:rPr>
+        <w:t>app ?</w:t>
+      </w:r>
+      <w:proofErr w:type="gramEnd"/>
+    </w:p>
+    <w:p>
+      <w:proofErr w:type="spellStart"/>
+      <w:r>
+        <w:t>YeldnIN</w:t>
+      </w:r>
+      <w:proofErr w:type="spellEnd"/>
+      <w:r>
+        <w:t xml:space="preserve"> is the </w:t>
+      </w:r>
+      <w:r>
+        <w:rPr>
+          <w:b/>
+          <w:bCs/>
+        </w:rPr>
+        <w:t>internal back-office platform for "</w:t>
+      </w:r>
+      <w:proofErr w:type="spellStart"/>
+      <w:r>
+        <w:rPr>
+          <w:b/>
+          <w:bCs/>
+        </w:rPr>
+        <w:t>Yeldn</w:t>
+      </w:r>
+      <w:proofErr w:type="spellEnd"/>
+      <w:r>
+        <w:rPr>
+          <w:b/>
+          <w:bCs/>
+        </w:rPr>
+        <w:t xml:space="preserve"> Health"</w:t>
       </w:r>
       <w:r>
         <w:t xml:space="preserve">, an Egypt-based company that sells vitamins, supplements and health devices (brand: </w:t>
@@ -312,7 +344,15 @@
         <w:t>PWA</w:t>
       </w:r>
       <w:r>
-        <w:t xml:space="preserve"> with web push, and integrates with an external storefront ("Veeey")</w:t>
+        <w:t xml:space="preserve"> with web push, and integrates with an external storefront ("</w:t>
+      </w:r>
+      <w:proofErr w:type="spellStart"/>
+      <w:r>
+        <w:t>Veeey</w:t>
+      </w:r>
+      <w:proofErr w:type="spellEnd"/>
+      <w:r>
+        <w:t>")</w:t>
       </w:r>
       <w:r>
         <w:t xml:space="preserve"> which is a full eCommerce platform</w:t>
@@ -377,7 +417,15 @@
         </w:numPr>
       </w:pPr>
       <w:r>
-        <w:t xml:space="preserve">Application Unites (containers – from requests to shipments, items - products, and people – users and customers) should be interconnected so that users can click the name of any unit to go to its page. There are links for all connected units that user can click to go to these units. Connected units are units that have connection or relations with the current unit. </w:t>
+        <w:t xml:space="preserve">Application Unites (containers – from requests to shipments, items - products, and people – users and customers) should be interconnected so that users can click the name of any unit to go to its page. There are links for all connected units that user can click to go to these units. Connected units are units that have </w:t>
+      </w:r>
+      <w:proofErr w:type="gramStart"/>
+      <w:r>
+        <w:t>connection</w:t>
+      </w:r>
+      <w:proofErr w:type="gramEnd"/>
+      <w:r>
+        <w:t xml:space="preserve"> or relations with the current unit. </w:t>
       </w:r>
     </w:p>
     <w:p>
@@ -478,6 +526,7 @@
           <w:bCs/>
         </w:rPr>
       </w:pPr>
+      <w:proofErr w:type="gramStart"/>
       <w:r>
         <w:rPr>
           <w:b/>
@@ -485,6 +534,7 @@
         </w:rPr>
         <w:t>Users</w:t>
       </w:r>
+      <w:proofErr w:type="gramEnd"/>
       <w:r>
         <w:rPr>
           <w:b/>
@@ -826,7 +876,15 @@
     </w:p>
     <w:p>
       <w:r>
-        <w:t>Every employee will have a user account that have some permissions over some modules</w:t>
+        <w:t xml:space="preserve">Every employee will have a user account that </w:t>
+      </w:r>
+      <w:proofErr w:type="gramStart"/>
+      <w:r>
+        <w:t>have</w:t>
+      </w:r>
+      <w:proofErr w:type="gramEnd"/>
+      <w:r>
+        <w:t xml:space="preserve"> some permissions over some modules</w:t>
       </w:r>
     </w:p>
     <w:p/>
@@ -856,7 +914,21 @@
         <w:rPr>
           <w:lang w:bidi="ar-EG"/>
         </w:rPr>
-        <w:t>Items of products, they are the building block of the system while tracking inventory from point to point.</w:t>
+        <w:t xml:space="preserve">Items of </w:t>
+      </w:r>
+      <w:proofErr w:type="gramStart"/>
+      <w:r>
+        <w:rPr>
+          <w:lang w:bidi="ar-EG"/>
+        </w:rPr>
+        <w:t>products, they</w:t>
+      </w:r>
+      <w:proofErr w:type="gramEnd"/>
+      <w:r>
+        <w:rPr>
+          <w:lang w:bidi="ar-EG"/>
+        </w:rPr>
+        <w:t xml:space="preserve"> are the building block of the system while tracking inventory from point to point.</w:t>
       </w:r>
     </w:p>
     <w:p/>
@@ -1115,6 +1187,9 @@
       <w:r>
         <w:t>Delay</w:t>
       </w:r>
+      <w:r>
+        <w:t xml:space="preserve"> – this flag can be added manually or automatically through some predefined conditions</w:t>
+      </w:r>
     </w:p>
     <w:p/>
     <w:p>
@@ -1300,6 +1375,7 @@
           <w:b/>
           <w:bCs/>
         </w:rPr>
+        <w:lastRenderedPageBreak/>
         <w:t>Trips</w:t>
       </w:r>
     </w:p>
@@ -1315,7 +1391,6 @@
           <w:b/>
           <w:bCs/>
         </w:rPr>
-        <w:lastRenderedPageBreak/>
         <w:tab/>
         <w:t>Statuses</w:t>
       </w:r>
@@ -1506,8 +1581,17 @@
           <w:b/>
           <w:bCs/>
         </w:rPr>
-        <w:t xml:space="preserve"> Partially</w:t>
-      </w:r>
+        <w:t xml:space="preserve"> </w:t>
+      </w:r>
+      <w:proofErr w:type="gramStart"/>
+      <w:r>
+        <w:rPr>
+          <w:b/>
+          <w:bCs/>
+        </w:rPr>
+        <w:t>Partially</w:t>
+      </w:r>
+      <w:proofErr w:type="gramEnd"/>
       <w:r>
         <w:t xml:space="preserve"> – some items in the trip</w:t>
       </w:r>
@@ -1698,6 +1782,7 @@
         </w:numPr>
       </w:pPr>
       <w:r>
+        <w:lastRenderedPageBreak/>
         <w:t>Received</w:t>
       </w:r>
     </w:p>
@@ -1710,7 +1795,6 @@
           <w:b/>
           <w:bCs/>
         </w:rPr>
-        <w:lastRenderedPageBreak/>
         <w:t>Flags</w:t>
       </w:r>
     </w:p>
@@ -1744,8 +1828,17 @@
           <w:b/>
           <w:bCs/>
         </w:rPr>
-        <w:t xml:space="preserve"> Partially</w:t>
-      </w:r>
+        <w:t xml:space="preserve"> </w:t>
+      </w:r>
+      <w:proofErr w:type="gramStart"/>
+      <w:r>
+        <w:rPr>
+          <w:b/>
+          <w:bCs/>
+        </w:rPr>
+        <w:t>Partially</w:t>
+      </w:r>
+      <w:proofErr w:type="gramEnd"/>
       <w:r>
         <w:t xml:space="preserve"> – some items in the trip</w:t>
       </w:r>
@@ -1838,7 +1931,15 @@
         </w:numPr>
       </w:pPr>
       <w:r>
-        <w:t>Flags for Items – this reflect on Partial flag for the container</w:t>
+        <w:t xml:space="preserve">Flags for Items – this </w:t>
+      </w:r>
+      <w:proofErr w:type="gramStart"/>
+      <w:r>
+        <w:t>reflect</w:t>
+      </w:r>
+      <w:proofErr w:type="gramEnd"/>
+      <w:r>
+        <w:t xml:space="preserve"> on Partial flag for the container</w:t>
       </w:r>
     </w:p>
     <w:p>
@@ -1898,7 +1999,15 @@
         </w:numPr>
       </w:pPr>
       <w:r>
-        <w:t>Flags for Containers – this reflect on flags of all items in the container</w:t>
+        <w:t xml:space="preserve">Flags for Containers – this </w:t>
+      </w:r>
+      <w:proofErr w:type="gramStart"/>
+      <w:r>
+        <w:t>reflect</w:t>
+      </w:r>
+      <w:proofErr w:type="gramEnd"/>
+      <w:r>
+        <w:t xml:space="preserve"> on flags of all items in the container</w:t>
       </w:r>
     </w:p>
     <w:p>
@@ -2000,7 +2109,15 @@
       </w:pPr>
       <w:r>
         <w:lastRenderedPageBreak/>
-        <w:t>Request &gt;&gt; In case of Special Order; 3 X Requested from Supplier to Customer by Sales User, In case of non-Special Order &gt;&gt; 3 X Requested from Supplier by Sales User</w:t>
+        <w:t xml:space="preserve">Request &gt;&gt; In case of Special Order; 3 X Requested from Supplier to Customer by Sales User, </w:t>
+      </w:r>
+      <w:proofErr w:type="gramStart"/>
+      <w:r>
+        <w:t>In</w:t>
+      </w:r>
+      <w:proofErr w:type="gramEnd"/>
+      <w:r>
+        <w:t xml:space="preserve"> case of non-Special Order &gt;&gt; 3 X Requested from Supplier by Sales User</w:t>
       </w:r>
     </w:p>
     <w:p>
@@ -2048,7 +2165,15 @@
         </w:numPr>
       </w:pPr>
       <w:r>
-        <w:t>Trip &gt;&gt; Traveler name . Date (which is Last Receiving Date)</w:t>
+        <w:t xml:space="preserve">Trip &gt;&gt; Traveler </w:t>
+      </w:r>
+      <w:proofErr w:type="gramStart"/>
+      <w:r>
+        <w:t>name .</w:t>
+      </w:r>
+      <w:proofErr w:type="gramEnd"/>
+      <w:r>
+        <w:t xml:space="preserve"> Date (which is Last Receiving Date)</w:t>
       </w:r>
     </w:p>
     <w:p>
@@ -2499,7 +2624,23 @@
           <w:color w:val="196B24" w:themeColor="accent3"/>
           <w:lang w:bidi="ar-EG"/>
         </w:rPr>
-        <w:t>Product shape [symbol in calculation formula ‘S’] – select from list (Capsules/Tablets, Softgels/Chews, Powder/Creamy, Gummies, Liquid, Injection) – each product shape has multiplier that can be edited in the admin side</w:t>
+        <w:t xml:space="preserve">Product shape [symbol in calculation formula ‘S’] – select from list (Capsules/Tablets, </w:t>
+      </w:r>
+      <w:proofErr w:type="spellStart"/>
+      <w:r>
+        <w:rPr>
+          <w:color w:val="196B24" w:themeColor="accent3"/>
+          <w:lang w:bidi="ar-EG"/>
+        </w:rPr>
+        <w:t>Softgels</w:t>
+      </w:r>
+      <w:proofErr w:type="spellEnd"/>
+      <w:r>
+        <w:rPr>
+          <w:color w:val="196B24" w:themeColor="accent3"/>
+          <w:lang w:bidi="ar-EG"/>
+        </w:rPr>
+        <w:t>/Chews, Powder/Creamy, Gummies, Liquid, Injection) – each product shape has multiplier that can be edited in the admin side</w:t>
       </w:r>
     </w:p>
     <w:p>
@@ -2650,8 +2791,16 @@
         <w:rPr>
           <w:color w:val="196B24" w:themeColor="accent3"/>
         </w:rPr>
-        <w:t>with a little different calculations</w:t>
-      </w:r>
+        <w:t xml:space="preserve">with a </w:t>
+      </w:r>
+      <w:proofErr w:type="gramStart"/>
+      <w:r>
+        <w:rPr>
+          <w:color w:val="196B24" w:themeColor="accent3"/>
+        </w:rPr>
+        <w:t>little different calculations</w:t>
+      </w:r>
+      <w:proofErr w:type="gramEnd"/>
     </w:p>
     <w:p>
       <w:pPr>
@@ -3042,7 +3191,21 @@
         <w:rPr>
           <w:lang w:bidi="ar-EG"/>
         </w:rPr>
-        <w:t>Product shape [symbol in calculation formula ‘S’] – select from list (Capsules/Tablets, Softgels/Chews, Powder/Creamy, Gummies, Liquid, Injection)</w:t>
+        <w:t xml:space="preserve">Product shape [symbol in calculation formula ‘S’] – select from list (Capsules/Tablets, </w:t>
+      </w:r>
+      <w:proofErr w:type="spellStart"/>
+      <w:r>
+        <w:rPr>
+          <w:lang w:bidi="ar-EG"/>
+        </w:rPr>
+        <w:t>Softgels</w:t>
+      </w:r>
+      <w:proofErr w:type="spellEnd"/>
+      <w:r>
+        <w:rPr>
+          <w:lang w:bidi="ar-EG"/>
+        </w:rPr>
+        <w:t>/Chews, Powder/Creamy, Gummies, Liquid, Injection)</w:t>
       </w:r>
       <w:r>
         <w:rPr>
@@ -3474,7 +3637,14 @@
         <w:rPr>
           <w:lang w:bidi="ar-EG"/>
         </w:rPr>
-        <w:t>[I</w:t>
+        <w:t>[</w:t>
+      </w:r>
+      <w:proofErr w:type="spellStart"/>
+      <w:r>
+        <w:rPr>
+          <w:lang w:bidi="ar-EG"/>
+        </w:rPr>
+        <w:t>I</w:t>
       </w:r>
       <w:r>
         <w:rPr>
@@ -3482,6 +3652,7 @@
         </w:rPr>
         <w:t>c</w:t>
       </w:r>
+      <w:proofErr w:type="spellEnd"/>
       <w:r>
         <w:rPr>
           <w:lang w:bidi="ar-EG"/>
@@ -3651,11 +3822,19 @@
           <w:lang w:bidi="ar-EG"/>
         </w:rPr>
       </w:pPr>
-      <w:r>
-        <w:rPr>
-          <w:lang w:bidi="ar-EG"/>
-        </w:rPr>
-        <w:t>Fx = 54 – editable in admin side</w:t>
+      <w:proofErr w:type="spellStart"/>
+      <w:r>
+        <w:rPr>
+          <w:lang w:bidi="ar-EG"/>
+        </w:rPr>
+        <w:t>Fx</w:t>
+      </w:r>
+      <w:proofErr w:type="spellEnd"/>
+      <w:r>
+        <w:rPr>
+          <w:lang w:bidi="ar-EG"/>
+        </w:rPr>
+        <w:t xml:space="preserve"> = 54 – editable in admin side</w:t>
       </w:r>
     </w:p>
     <w:p>
@@ -3892,7 +4071,21 @@
         <w:rPr>
           <w:lang w:bidi="ar-EG"/>
         </w:rPr>
-        <w:t>if days equal 1 to 30 , then G = 3 then GC=0</w:t>
+        <w:t xml:space="preserve">if days equal 1 to </w:t>
+      </w:r>
+      <w:proofErr w:type="gramStart"/>
+      <w:r>
+        <w:rPr>
+          <w:lang w:bidi="ar-EG"/>
+        </w:rPr>
+        <w:t>30 ,</w:t>
+      </w:r>
+      <w:proofErr w:type="gramEnd"/>
+      <w:r>
+        <w:rPr>
+          <w:lang w:bidi="ar-EG"/>
+        </w:rPr>
+        <w:t xml:space="preserve"> then G = 3 then GC=0</w:t>
       </w:r>
     </w:p>
     <w:p>
@@ -3910,7 +4103,21 @@
         <w:rPr>
           <w:lang w:bidi="ar-EG"/>
         </w:rPr>
-        <w:t>if days equal 31 to 60 , then G = 2</w:t>
+        <w:t xml:space="preserve">if days equal 31 to </w:t>
+      </w:r>
+      <w:proofErr w:type="gramStart"/>
+      <w:r>
+        <w:rPr>
+          <w:lang w:bidi="ar-EG"/>
+        </w:rPr>
+        <w:t>60 ,</w:t>
+      </w:r>
+      <w:proofErr w:type="gramEnd"/>
+      <w:r>
+        <w:rPr>
+          <w:lang w:bidi="ar-EG"/>
+        </w:rPr>
+        <w:t xml:space="preserve"> then G = 2</w:t>
       </w:r>
       <w:r>
         <w:rPr>
@@ -3940,7 +4147,21 @@
         <w:rPr>
           <w:lang w:bidi="ar-EG"/>
         </w:rPr>
-        <w:t>if days more than 60 , then G = 1</w:t>
+        <w:t xml:space="preserve">if days more than </w:t>
+      </w:r>
+      <w:proofErr w:type="gramStart"/>
+      <w:r>
+        <w:rPr>
+          <w:lang w:bidi="ar-EG"/>
+        </w:rPr>
+        <w:t>60 ,</w:t>
+      </w:r>
+      <w:proofErr w:type="gramEnd"/>
+      <w:r>
+        <w:rPr>
+          <w:lang w:bidi="ar-EG"/>
+        </w:rPr>
+        <w:t xml:space="preserve"> then G = 1</w:t>
       </w:r>
       <w:r>
         <w:rPr>

</xml_diff>

<commit_message>
Dropdowns: reliable close on outside-click + Escape
The account, All-modules, and appearance menus used a fixed-inset backdrop that
got trapped by the top bar's backdrop-blur (CSS: a filtered ancestor contains
position:fixed), so it only covered the header and clicks in the page body
didn't close the menu. Replaced with a document-level useDropdown hook
(pointerdown-outside + Escape) on all three menus. Verified in-browser:
opens on click, closes on outside click. tsc 0, build clean.
</commit_message>
<xml_diff>
--- a/PDD.docx
+++ b/PDD.docx
@@ -417,13 +417,23 @@
         </w:numPr>
       </w:pPr>
       <w:r>
-        <w:t xml:space="preserve">Application Unites (containers – from requests to shipments, items - products, and people – users and customers) should be interconnected so that users can click the name of any unit to go to its page. There are links for all connected units that user can click to go to these units. Connected units are units that have </w:t>
-      </w:r>
-      <w:proofErr w:type="gramStart"/>
-      <w:r>
-        <w:t>connection</w:t>
-      </w:r>
-      <w:proofErr w:type="gramEnd"/>
+        <w:t xml:space="preserve">Application Unites (containers – from requests to shipments, items </w:t>
+      </w:r>
+      <w:r>
+        <w:t>–</w:t>
+      </w:r>
+      <w:r>
+        <w:t xml:space="preserve"> </w:t>
+      </w:r>
+      <w:r>
+        <w:t>items (products)</w:t>
+      </w:r>
+      <w:r>
+        <w:t xml:space="preserve">, and people – customers) should be interconnected so that users can click the name of any unit to go to its page. There are links for all connected units that user can click to go to these units. Connected units are units that have </w:t>
+      </w:r>
+      <w:r>
+        <w:t>connections</w:t>
+      </w:r>
       <w:r>
         <w:t xml:space="preserve"> or relations with the current unit. </w:t>
       </w:r>
@@ -474,6 +484,9 @@
       <w:r>
         <w:t>Services</w:t>
       </w:r>
+      <w:r>
+        <w:t xml:space="preserve"> – Pricing and Expenses</w:t>
+      </w:r>
     </w:p>
     <w:p>
       <w:pPr>
@@ -484,7 +497,10 @@
         </w:numPr>
       </w:pPr>
       <w:r>
-        <w:t>Inventory</w:t>
+        <w:t>Supply Chain</w:t>
+      </w:r>
+      <w:r>
+        <w:t xml:space="preserve"> – Sales, XOONX, Logistics, Operations, Couriers, History, Issues and Compensations </w:t>
       </w:r>
     </w:p>
     <w:p>
@@ -496,7 +512,7 @@
         </w:numPr>
       </w:pPr>
       <w:r>
-        <w:t>People</w:t>
+        <w:t>Human Resources – modules will be introduced later</w:t>
       </w:r>
     </w:p>
     <w:p>
@@ -508,7 +524,7 @@
         </w:numPr>
       </w:pPr>
       <w:r>
-        <w:t>Settings</w:t>
+        <w:t>Administration</w:t>
       </w:r>
     </w:p>
     <w:p>
@@ -689,7 +705,17 @@
     <w:p/>
     <w:p/>
     <w:p>
-      <w:r>
+      <w:pPr>
+        <w:rPr>
+          <w:b/>
+          <w:bCs/>
+        </w:rPr>
+      </w:pPr>
+      <w:r>
+        <w:rPr>
+          <w:b/>
+          <w:bCs/>
+        </w:rPr>
         <w:t>Modules</w:t>
       </w:r>
     </w:p>
@@ -780,6 +806,7 @@
         </w:numPr>
       </w:pPr>
       <w:r>
+        <w:lastRenderedPageBreak/>
         <w:t>Operations</w:t>
       </w:r>
     </w:p>
@@ -792,143 +819,677 @@
         </w:numPr>
       </w:pPr>
       <w:r>
+        <w:t>Couriers</w:t>
+      </w:r>
+    </w:p>
+    <w:p>
+      <w:pPr>
+        <w:pStyle w:val="ListParagraph"/>
+        <w:numPr>
+          <w:ilvl w:val="0"/>
+          <w:numId w:val="5"/>
+        </w:numPr>
+      </w:pPr>
+      <w:r>
+        <w:t>Issues</w:t>
+      </w:r>
+    </w:p>
+    <w:p>
+      <w:pPr>
+        <w:pStyle w:val="ListParagraph"/>
+        <w:numPr>
+          <w:ilvl w:val="0"/>
+          <w:numId w:val="5"/>
+        </w:numPr>
+      </w:pPr>
+      <w:r>
+        <w:t>History</w:t>
+      </w:r>
+    </w:p>
+    <w:p>
+      <w:pPr>
+        <w:ind w:left="360"/>
+      </w:pPr>
+      <w:r>
+        <w:t>Administration</w:t>
+      </w:r>
+    </w:p>
+    <w:p>
+      <w:pPr>
+        <w:pStyle w:val="ListParagraph"/>
+        <w:numPr>
+          <w:ilvl w:val="0"/>
+          <w:numId w:val="5"/>
+        </w:numPr>
+      </w:pPr>
+      <w:r>
+        <w:t>Users</w:t>
+      </w:r>
+    </w:p>
+    <w:p>
+      <w:pPr>
+        <w:pStyle w:val="ListParagraph"/>
+        <w:numPr>
+          <w:ilvl w:val="0"/>
+          <w:numId w:val="5"/>
+        </w:numPr>
+      </w:pPr>
+      <w:r>
+        <w:t>Setting</w:t>
+      </w:r>
+    </w:p>
+    <w:p>
+      <w:pPr>
+        <w:rPr>
+          <w:lang w:bidi="ar-EG"/>
+        </w:rPr>
+      </w:pPr>
+    </w:p>
+    <w:p>
+      <w:pPr>
+        <w:rPr>
+          <w:lang w:bidi="ar-EG"/>
+        </w:rPr>
+      </w:pPr>
+      <w:r>
+        <w:rPr>
+          <w:lang w:bidi="ar-EG"/>
+        </w:rPr>
+        <w:t>Entry Fields for each unit</w:t>
+      </w:r>
+    </w:p>
+    <w:p>
+      <w:pPr>
+        <w:rPr>
+          <w:b/>
+          <w:bCs/>
+          <w:lang w:bidi="ar-EG"/>
+        </w:rPr>
+      </w:pPr>
+      <w:r>
+        <w:rPr>
+          <w:b/>
+          <w:bCs/>
+          <w:lang w:bidi="ar-EG"/>
+        </w:rPr>
+        <w:t>Customer</w:t>
+      </w:r>
+    </w:p>
+    <w:p>
+      <w:pPr>
+        <w:pStyle w:val="ListParagraph"/>
+        <w:numPr>
+          <w:ilvl w:val="0"/>
+          <w:numId w:val="26"/>
+        </w:numPr>
+        <w:rPr>
+          <w:lang w:bidi="ar-EG"/>
+        </w:rPr>
+      </w:pPr>
+      <w:r>
+        <w:rPr>
+          <w:lang w:bidi="ar-EG"/>
+        </w:rPr>
+        <w:t xml:space="preserve">Customer [Name] </w:t>
+      </w:r>
+      <w:r>
+        <w:rPr>
+          <w:lang w:bidi="ar-EG"/>
+        </w:rPr>
+        <w:t>– short text input</w:t>
+      </w:r>
+      <w:r>
+        <w:rPr>
+          <w:lang w:bidi="ar-EG"/>
+        </w:rPr>
+        <w:t xml:space="preserve"> - Required</w:t>
+      </w:r>
+    </w:p>
+    <w:p>
+      <w:pPr>
+        <w:pStyle w:val="ListParagraph"/>
+        <w:numPr>
+          <w:ilvl w:val="0"/>
+          <w:numId w:val="26"/>
+        </w:numPr>
+        <w:rPr>
+          <w:lang w:bidi="ar-EG"/>
+        </w:rPr>
+      </w:pPr>
+      <w:r>
+        <w:rPr>
+          <w:lang w:bidi="ar-EG"/>
+        </w:rPr>
+        <w:t>Contact [Channel] – select from list; What’s App, Phone, Direct, Facebook and Instagram. Default Value is What’s App – Optional</w:t>
+      </w:r>
+    </w:p>
+    <w:p>
+      <w:pPr>
+        <w:pStyle w:val="ListParagraph"/>
+        <w:numPr>
+          <w:ilvl w:val="0"/>
+          <w:numId w:val="26"/>
+        </w:numPr>
+        <w:rPr>
+          <w:lang w:bidi="ar-EG"/>
+        </w:rPr>
+      </w:pPr>
+      <w:r>
+        <w:rPr>
+          <w:lang w:bidi="ar-EG"/>
+        </w:rPr>
+        <w:t>Contact [Number] – short text input</w:t>
+      </w:r>
+      <w:r>
+        <w:rPr>
+          <w:lang w:bidi="ar-EG"/>
+        </w:rPr>
+        <w:t xml:space="preserve"> – Optional</w:t>
+      </w:r>
+    </w:p>
+    <w:p>
+      <w:pPr>
+        <w:rPr>
+          <w:lang w:bidi="ar-EG"/>
+        </w:rPr>
+      </w:pPr>
+    </w:p>
+    <w:p>
+      <w:pPr>
+        <w:rPr>
+          <w:b/>
+          <w:bCs/>
+          <w:lang w:bidi="ar-EG"/>
+        </w:rPr>
+      </w:pPr>
+      <w:r>
+        <w:rPr>
+          <w:b/>
+          <w:bCs/>
+          <w:lang w:bidi="ar-EG"/>
+        </w:rPr>
+        <w:t>Product</w:t>
+      </w:r>
+    </w:p>
+    <w:p>
+      <w:pPr>
+        <w:rPr>
+          <w:lang w:bidi="ar-EG"/>
+        </w:rPr>
+      </w:pPr>
+    </w:p>
+    <w:p>
+      <w:pPr>
+        <w:rPr>
+          <w:lang w:bidi="ar-EG"/>
+        </w:rPr>
+      </w:pPr>
+    </w:p>
+    <w:p>
+      <w:pPr>
+        <w:rPr>
+          <w:lang w:bidi="ar-EG"/>
+        </w:rPr>
+      </w:pPr>
+      <w:r>
+        <w:rPr>
+          <w:lang w:bidi="ar-EG"/>
+        </w:rPr>
+        <w:t>Request</w:t>
+      </w:r>
+    </w:p>
+    <w:p>
+      <w:pPr>
+        <w:rPr>
+          <w:lang w:bidi="ar-EG"/>
+        </w:rPr>
+      </w:pPr>
+    </w:p>
+    <w:p>
+      <w:pPr>
+        <w:rPr>
+          <w:lang w:bidi="ar-EG"/>
+        </w:rPr>
+      </w:pPr>
+      <w:r>
+        <w:rPr>
+          <w:lang w:bidi="ar-EG"/>
+        </w:rPr>
+        <w:t>Purchase</w:t>
+      </w:r>
+    </w:p>
+    <w:p>
+      <w:pPr>
+        <w:rPr>
+          <w:lang w:bidi="ar-EG"/>
+        </w:rPr>
+      </w:pPr>
+    </w:p>
+    <w:p>
+      <w:pPr>
+        <w:rPr>
+          <w:lang w:bidi="ar-EG"/>
+        </w:rPr>
+      </w:pPr>
+      <w:r>
+        <w:rPr>
+          <w:lang w:bidi="ar-EG"/>
+        </w:rPr>
+        <w:t>Patch</w:t>
+      </w:r>
+    </w:p>
+    <w:p>
+      <w:pPr>
+        <w:rPr>
+          <w:lang w:bidi="ar-EG"/>
+        </w:rPr>
+      </w:pPr>
+    </w:p>
+    <w:p>
+      <w:pPr>
+        <w:rPr>
+          <w:lang w:bidi="ar-EG"/>
+        </w:rPr>
+      </w:pPr>
+      <w:r>
+        <w:rPr>
+          <w:lang w:bidi="ar-EG"/>
+        </w:rPr>
+        <w:t>Transfer</w:t>
+      </w:r>
+    </w:p>
+    <w:p>
+      <w:pPr>
+        <w:rPr>
+          <w:lang w:bidi="ar-EG"/>
+        </w:rPr>
+      </w:pPr>
+    </w:p>
+    <w:p>
+      <w:pPr>
+        <w:rPr>
+          <w:lang w:bidi="ar-EG"/>
+        </w:rPr>
+      </w:pPr>
+      <w:r>
+        <w:rPr>
+          <w:lang w:bidi="ar-EG"/>
+        </w:rPr>
+        <w:t>Shipment</w:t>
+      </w:r>
+    </w:p>
+    <w:p>
+      <w:pPr>
+        <w:rPr>
+          <w:lang w:bidi="ar-EG"/>
+        </w:rPr>
+      </w:pPr>
+    </w:p>
+    <w:p>
+      <w:pPr>
+        <w:rPr>
+          <w:lang w:bidi="ar-EG"/>
+        </w:rPr>
+      </w:pPr>
+    </w:p>
+    <w:p>
+      <w:pPr>
+        <w:rPr>
+          <w:lang w:bidi="ar-EG"/>
+        </w:rPr>
+      </w:pPr>
+    </w:p>
+    <w:p>
+      <w:pPr>
+        <w:rPr>
+          <w:lang w:bidi="ar-EG"/>
+        </w:rPr>
+      </w:pPr>
+    </w:p>
+    <w:p>
+      <w:pPr>
+        <w:rPr>
+          <w:b/>
+          <w:bCs/>
+        </w:rPr>
+      </w:pPr>
+      <w:r>
+        <w:rPr>
+          <w:b/>
+          <w:bCs/>
+        </w:rPr>
+        <w:t>Staff</w:t>
+      </w:r>
+    </w:p>
+    <w:p>
+      <w:r>
+        <w:t xml:space="preserve">Every employee will have a user account that </w:t>
+      </w:r>
+      <w:proofErr w:type="gramStart"/>
+      <w:r>
+        <w:t>have</w:t>
+      </w:r>
+      <w:proofErr w:type="gramEnd"/>
+      <w:r>
+        <w:t xml:space="preserve"> some permissions over some modules</w:t>
+      </w:r>
+    </w:p>
+    <w:p/>
+    <w:p>
+      <w:pPr>
+        <w:rPr>
+          <w:b/>
+          <w:bCs/>
+        </w:rPr>
+      </w:pPr>
+      <w:r>
+        <w:rPr>
+          <w:b/>
+          <w:bCs/>
+        </w:rPr>
+        <w:t>Units</w:t>
+      </w:r>
+    </w:p>
+    <w:p>
+      <w:pPr>
+        <w:rPr>
+          <w:rtl/>
+          <w:lang w:bidi="ar-EG"/>
+        </w:rPr>
+      </w:pPr>
+      <w:r>
+        <w:rPr>
+          <w:lang w:bidi="ar-EG"/>
+        </w:rPr>
+        <w:t xml:space="preserve">Items of </w:t>
+      </w:r>
+      <w:proofErr w:type="gramStart"/>
+      <w:r>
+        <w:rPr>
+          <w:lang w:bidi="ar-EG"/>
+        </w:rPr>
+        <w:t>products, they</w:t>
+      </w:r>
+      <w:proofErr w:type="gramEnd"/>
+      <w:r>
+        <w:rPr>
+          <w:lang w:bidi="ar-EG"/>
+        </w:rPr>
+        <w:t xml:space="preserve"> are the building block of the system while tracking inventory from point to point.</w:t>
+      </w:r>
+    </w:p>
+    <w:p/>
+    <w:p>
+      <w:pPr>
+        <w:rPr>
+          <w:b/>
+          <w:bCs/>
+        </w:rPr>
+      </w:pPr>
+      <w:r>
+        <w:rPr>
+          <w:b/>
+          <w:bCs/>
+        </w:rPr>
+        <w:t>Containers</w:t>
+      </w:r>
+    </w:p>
+    <w:p>
+      <w:r>
+        <w:t>Containers are baskets that carry the items from point to point during their pathway from supplier to customer. Supplier is the starting point, and customer is the ending point. In some cases, the item (product) lifecycle starts with a customer and ends with the customer. This case happens in Special Order – where customer ask us to buy a product for him and we go to supplier and order the product and handle the product from container to container till we reach the customer back.</w:t>
+      </w:r>
+    </w:p>
+    <w:p/>
+    <w:p>
+      <w:pPr>
+        <w:pStyle w:val="ListParagraph"/>
+      </w:pPr>
+      <w:r>
+        <w:t>Supplier</w:t>
+      </w:r>
+    </w:p>
+    <w:p>
+      <w:pPr>
+        <w:pStyle w:val="ListParagraph"/>
+        <w:numPr>
+          <w:ilvl w:val="0"/>
+          <w:numId w:val="2"/>
+        </w:numPr>
+      </w:pPr>
+      <w:r>
+        <w:t>Request</w:t>
+      </w:r>
+    </w:p>
+    <w:p>
+      <w:pPr>
+        <w:pStyle w:val="ListParagraph"/>
+        <w:numPr>
+          <w:ilvl w:val="0"/>
+          <w:numId w:val="2"/>
+        </w:numPr>
+      </w:pPr>
+      <w:r>
+        <w:t>Purchase</w:t>
+      </w:r>
+    </w:p>
+    <w:p>
+      <w:pPr>
+        <w:pStyle w:val="ListParagraph"/>
+        <w:numPr>
+          <w:ilvl w:val="0"/>
+          <w:numId w:val="2"/>
+        </w:numPr>
+      </w:pPr>
+      <w:r>
+        <w:t>Patch</w:t>
+      </w:r>
+    </w:p>
+    <w:p>
+      <w:pPr>
+        <w:pStyle w:val="ListParagraph"/>
+        <w:numPr>
+          <w:ilvl w:val="0"/>
+          <w:numId w:val="2"/>
+        </w:numPr>
+      </w:pPr>
+      <w:r>
+        <w:t>Travel</w:t>
+      </w:r>
+      <w:r>
+        <w:t>er</w:t>
+      </w:r>
+    </w:p>
+    <w:p>
+      <w:pPr>
+        <w:pStyle w:val="ListParagraph"/>
+        <w:numPr>
+          <w:ilvl w:val="0"/>
+          <w:numId w:val="2"/>
+        </w:numPr>
+      </w:pPr>
+      <w:r>
+        <w:t>Trip</w:t>
+      </w:r>
+    </w:p>
+    <w:p>
+      <w:pPr>
+        <w:pStyle w:val="ListParagraph"/>
+        <w:numPr>
+          <w:ilvl w:val="0"/>
+          <w:numId w:val="2"/>
+        </w:numPr>
+      </w:pPr>
+      <w:r>
+        <w:t>Hub – optional</w:t>
+      </w:r>
+    </w:p>
+    <w:p>
+      <w:pPr>
+        <w:pStyle w:val="ListParagraph"/>
+        <w:numPr>
+          <w:ilvl w:val="0"/>
+          <w:numId w:val="2"/>
+        </w:numPr>
+      </w:pPr>
+      <w:r>
+        <w:t>Transfer – optional</w:t>
+      </w:r>
+    </w:p>
+    <w:p>
+      <w:pPr>
+        <w:pStyle w:val="ListParagraph"/>
+        <w:numPr>
+          <w:ilvl w:val="0"/>
+          <w:numId w:val="2"/>
+        </w:numPr>
+      </w:pPr>
+      <w:r>
+        <w:t>Shipment</w:t>
+      </w:r>
+    </w:p>
+    <w:p>
+      <w:pPr>
+        <w:pStyle w:val="ListParagraph"/>
+        <w:numPr>
+          <w:ilvl w:val="0"/>
+          <w:numId w:val="2"/>
+        </w:numPr>
+      </w:pPr>
+      <w:r>
+        <w:t>Office</w:t>
+      </w:r>
+    </w:p>
+    <w:p>
+      <w:pPr>
+        <w:pStyle w:val="ListParagraph"/>
+      </w:pPr>
+      <w:r>
+        <w:t>Website</w:t>
+      </w:r>
+    </w:p>
+    <w:p>
+      <w:r>
+        <w:t>Products go from website to customer through these steps;</w:t>
+      </w:r>
+    </w:p>
+    <w:p>
+      <w:pPr>
+        <w:pStyle w:val="ListParagraph"/>
+        <w:numPr>
+          <w:ilvl w:val="0"/>
+          <w:numId w:val="23"/>
+        </w:numPr>
+      </w:pPr>
+      <w:r>
+        <w:t>Order</w:t>
+      </w:r>
+    </w:p>
+    <w:p>
+      <w:pPr>
+        <w:pStyle w:val="ListParagraph"/>
+        <w:numPr>
+          <w:ilvl w:val="0"/>
+          <w:numId w:val="23"/>
+        </w:numPr>
+      </w:pPr>
+      <w:r>
         <w:lastRenderedPageBreak/>
-        <w:t>Couriers</w:t>
-      </w:r>
-    </w:p>
-    <w:p>
-      <w:pPr>
-        <w:pStyle w:val="ListParagraph"/>
-        <w:numPr>
-          <w:ilvl w:val="0"/>
-          <w:numId w:val="5"/>
-        </w:numPr>
-      </w:pPr>
-      <w:r>
-        <w:t>Issues</w:t>
-      </w:r>
-    </w:p>
-    <w:p>
-      <w:pPr>
-        <w:pStyle w:val="ListParagraph"/>
-        <w:numPr>
-          <w:ilvl w:val="0"/>
-          <w:numId w:val="5"/>
-        </w:numPr>
-      </w:pPr>
-      <w:r>
-        <w:t>History</w:t>
-      </w:r>
-    </w:p>
-    <w:p>
-      <w:pPr>
-        <w:ind w:left="360"/>
-      </w:pPr>
-      <w:r>
-        <w:t>Administration</w:t>
-      </w:r>
-    </w:p>
-    <w:p>
-      <w:pPr>
-        <w:pStyle w:val="ListParagraph"/>
-        <w:numPr>
-          <w:ilvl w:val="0"/>
-          <w:numId w:val="5"/>
-        </w:numPr>
-      </w:pPr>
-      <w:r>
-        <w:t>Users</w:t>
-      </w:r>
-    </w:p>
-    <w:p>
-      <w:pPr>
-        <w:pStyle w:val="ListParagraph"/>
-        <w:numPr>
-          <w:ilvl w:val="0"/>
-          <w:numId w:val="5"/>
-        </w:numPr>
-      </w:pPr>
-      <w:r>
-        <w:t>Setting</w:t>
-      </w:r>
-    </w:p>
-    <w:p>
-      <w:pPr>
-        <w:rPr>
-          <w:lang w:bidi="ar-EG"/>
-        </w:rPr>
-      </w:pPr>
-    </w:p>
-    <w:p>
-      <w:pPr>
-        <w:rPr>
-          <w:b/>
-          <w:bCs/>
-        </w:rPr>
-      </w:pPr>
-      <w:r>
-        <w:rPr>
-          <w:b/>
-          <w:bCs/>
-        </w:rPr>
-        <w:t>Staff</w:t>
-      </w:r>
-    </w:p>
-    <w:p>
-      <w:r>
-        <w:t xml:space="preserve">Every employee will have a user account that </w:t>
-      </w:r>
-      <w:proofErr w:type="gramStart"/>
-      <w:r>
-        <w:t>have</w:t>
-      </w:r>
-      <w:proofErr w:type="gramEnd"/>
-      <w:r>
-        <w:t xml:space="preserve"> some permissions over some modules</w:t>
+        <w:t>Delivery</w:t>
+      </w:r>
+    </w:p>
+    <w:p>
+      <w:pPr>
+        <w:pStyle w:val="ListParagraph"/>
+        <w:numPr>
+          <w:ilvl w:val="0"/>
+          <w:numId w:val="23"/>
+        </w:numPr>
+      </w:pPr>
+      <w:r>
+        <w:t>Courier</w:t>
+      </w:r>
+    </w:p>
+    <w:p>
+      <w:pPr>
+        <w:pStyle w:val="ListParagraph"/>
+      </w:pPr>
+      <w:r>
+        <w:t>Customer</w:t>
+      </w:r>
+    </w:p>
+    <w:p>
+      <w:r>
+        <w:t>And 3 other containers</w:t>
+      </w:r>
+    </w:p>
+    <w:p>
+      <w:pPr>
+        <w:pStyle w:val="ListParagraph"/>
+        <w:numPr>
+          <w:ilvl w:val="0"/>
+          <w:numId w:val="24"/>
+        </w:numPr>
+      </w:pPr>
+      <w:r>
+        <w:t>Lost</w:t>
+      </w:r>
+    </w:p>
+    <w:p>
+      <w:pPr>
+        <w:pStyle w:val="ListParagraph"/>
+        <w:numPr>
+          <w:ilvl w:val="0"/>
+          <w:numId w:val="24"/>
+        </w:numPr>
+      </w:pPr>
+      <w:r>
+        <w:t>Damaged</w:t>
+      </w:r>
+    </w:p>
+    <w:p>
+      <w:pPr>
+        <w:pStyle w:val="ListParagraph"/>
+        <w:numPr>
+          <w:ilvl w:val="0"/>
+          <w:numId w:val="24"/>
+        </w:numPr>
+      </w:pPr>
+      <w:r>
+        <w:t>Errant</w:t>
+      </w:r>
+    </w:p>
+    <w:p>
+      <w:r>
+        <w:t>And flags;</w:t>
+      </w:r>
+    </w:p>
+    <w:p>
+      <w:pPr>
+        <w:pStyle w:val="ListParagraph"/>
+        <w:numPr>
+          <w:ilvl w:val="0"/>
+          <w:numId w:val="25"/>
+        </w:numPr>
+      </w:pPr>
+      <w:r>
+        <w:t>Delay</w:t>
+      </w:r>
+      <w:r>
+        <w:t xml:space="preserve"> – this flag can be added manually or automatically through some predefined conditions</w:t>
       </w:r>
     </w:p>
     <w:p/>
     <w:p>
-      <w:pPr>
-        <w:rPr>
-          <w:b/>
-          <w:bCs/>
-        </w:rPr>
-      </w:pPr>
-      <w:r>
-        <w:rPr>
-          <w:b/>
-          <w:bCs/>
-        </w:rPr>
-        <w:t>Units</w:t>
-      </w:r>
-    </w:p>
-    <w:p>
-      <w:pPr>
-        <w:rPr>
-          <w:rtl/>
-          <w:lang w:bidi="ar-EG"/>
-        </w:rPr>
-      </w:pPr>
-      <w:r>
-        <w:rPr>
-          <w:lang w:bidi="ar-EG"/>
-        </w:rPr>
-        <w:t xml:space="preserve">Items of </w:t>
-      </w:r>
-      <w:proofErr w:type="gramStart"/>
-      <w:r>
-        <w:rPr>
-          <w:lang w:bidi="ar-EG"/>
-        </w:rPr>
-        <w:t>products, they</w:t>
-      </w:r>
-      <w:proofErr w:type="gramEnd"/>
-      <w:r>
-        <w:rPr>
-          <w:lang w:bidi="ar-EG"/>
-        </w:rPr>
-        <w:t xml:space="preserve"> are the building block of the system while tracking inventory from point to point.</w:t>
+      <w:r>
+        <w:t>Statuses</w:t>
+      </w:r>
+    </w:p>
+    <w:p>
+      <w:pPr>
+        <w:ind w:firstLine="720"/>
+      </w:pPr>
+      <w:r>
+        <w:t>Sales Side</w:t>
       </w:r>
     </w:p>
     <w:p/>
@@ -944,438 +1505,163 @@
           <w:b/>
           <w:bCs/>
         </w:rPr>
-        <w:t>Containers</w:t>
-      </w:r>
-    </w:p>
-    <w:p>
-      <w:r>
-        <w:t>Containers are baskets that carry the items from point to point during their pathway from supplier to customer. Supplier is the starting point, and customer is the ending point. In some cases, the item (product) lifecycle starts with a customer and ends with the customer. This case happens in Special Order – where customer ask us to buy a product for him and we go to supplier and order the product and handle the product from container to container till we reach the customer back.</w:t>
-      </w:r>
+        <w:t>Items</w:t>
+      </w:r>
+    </w:p>
+    <w:p>
+      <w:pPr>
+        <w:pStyle w:val="ListParagraph"/>
+        <w:numPr>
+          <w:ilvl w:val="0"/>
+          <w:numId w:val="12"/>
+        </w:numPr>
+      </w:pPr>
+      <w:r>
+        <w:t>Requested</w:t>
+      </w:r>
+    </w:p>
+    <w:p>
+      <w:pPr>
+        <w:pStyle w:val="ListParagraph"/>
+        <w:numPr>
+          <w:ilvl w:val="0"/>
+          <w:numId w:val="12"/>
+        </w:numPr>
+      </w:pPr>
+      <w:r>
+        <w:t>Purchased</w:t>
+      </w:r>
+    </w:p>
+    <w:p>
+      <w:pPr>
+        <w:pStyle w:val="ListParagraph"/>
+        <w:numPr>
+          <w:ilvl w:val="0"/>
+          <w:numId w:val="12"/>
+        </w:numPr>
+      </w:pPr>
+      <w:r>
+        <w:t>Dispatched</w:t>
+      </w:r>
+    </w:p>
+    <w:p>
+      <w:pPr>
+        <w:pStyle w:val="ListParagraph"/>
+        <w:numPr>
+          <w:ilvl w:val="0"/>
+          <w:numId w:val="12"/>
+        </w:numPr>
+      </w:pPr>
+      <w:r>
+        <w:t>Delivered</w:t>
+      </w:r>
+    </w:p>
+    <w:p>
+      <w:pPr>
+        <w:pStyle w:val="ListParagraph"/>
+        <w:numPr>
+          <w:ilvl w:val="0"/>
+          <w:numId w:val="12"/>
+        </w:numPr>
+      </w:pPr>
+      <w:r>
+        <w:t>Received</w:t>
+      </w:r>
+    </w:p>
+    <w:p>
+      <w:pPr>
+        <w:pStyle w:val="ListParagraph"/>
+        <w:numPr>
+          <w:ilvl w:val="0"/>
+          <w:numId w:val="12"/>
+        </w:numPr>
+      </w:pPr>
+      <w:r>
+        <w:t>Hub</w:t>
+      </w:r>
+    </w:p>
+    <w:p>
+      <w:pPr>
+        <w:pStyle w:val="ListParagraph"/>
+        <w:numPr>
+          <w:ilvl w:val="0"/>
+          <w:numId w:val="12"/>
+        </w:numPr>
+      </w:pPr>
+      <w:r>
+        <w:t>Transit</w:t>
+      </w:r>
+    </w:p>
+    <w:p>
+      <w:pPr>
+        <w:pStyle w:val="ListParagraph"/>
+        <w:numPr>
+          <w:ilvl w:val="0"/>
+          <w:numId w:val="12"/>
+        </w:numPr>
+      </w:pPr>
+      <w:r>
+        <w:t>Customs</w:t>
+      </w:r>
+    </w:p>
+    <w:p>
+      <w:pPr>
+        <w:pStyle w:val="ListParagraph"/>
+        <w:numPr>
+          <w:ilvl w:val="0"/>
+          <w:numId w:val="12"/>
+        </w:numPr>
+      </w:pPr>
+      <w:r>
+        <w:t>Out for delivery</w:t>
+      </w:r>
+    </w:p>
+    <w:p>
+      <w:pPr>
+        <w:pStyle w:val="ListParagraph"/>
+        <w:numPr>
+          <w:ilvl w:val="0"/>
+          <w:numId w:val="12"/>
+        </w:numPr>
+      </w:pPr>
+      <w:r>
+        <w:t>Office</w:t>
+      </w:r>
+    </w:p>
+    <w:p>
+      <w:pPr>
+        <w:pStyle w:val="ListParagraph"/>
+        <w:numPr>
+          <w:ilvl w:val="0"/>
+          <w:numId w:val="12"/>
+        </w:numPr>
+      </w:pPr>
+      <w:r>
+        <w:t>Photos sent</w:t>
+      </w:r>
+    </w:p>
+    <w:p>
+      <w:pPr>
+        <w:pStyle w:val="ListParagraph"/>
+        <w:numPr>
+          <w:ilvl w:val="0"/>
+          <w:numId w:val="12"/>
+        </w:numPr>
+      </w:pPr>
     </w:p>
     <w:p/>
     <w:p>
       <w:pPr>
-        <w:pStyle w:val="ListParagraph"/>
-      </w:pPr>
-      <w:r>
-        <w:t>Supplier</w:t>
-      </w:r>
-    </w:p>
-    <w:p>
-      <w:pPr>
-        <w:pStyle w:val="ListParagraph"/>
-        <w:numPr>
-          <w:ilvl w:val="0"/>
-          <w:numId w:val="2"/>
-        </w:numPr>
-      </w:pPr>
-      <w:r>
-        <w:t>Request</w:t>
-      </w:r>
-    </w:p>
-    <w:p>
-      <w:pPr>
-        <w:pStyle w:val="ListParagraph"/>
-        <w:numPr>
-          <w:ilvl w:val="0"/>
-          <w:numId w:val="2"/>
-        </w:numPr>
-      </w:pPr>
-      <w:r>
-        <w:t>Purchase</w:t>
-      </w:r>
-    </w:p>
-    <w:p>
-      <w:pPr>
-        <w:pStyle w:val="ListParagraph"/>
-        <w:numPr>
-          <w:ilvl w:val="0"/>
-          <w:numId w:val="2"/>
-        </w:numPr>
-      </w:pPr>
-      <w:r>
-        <w:t>Patch</w:t>
-      </w:r>
-    </w:p>
-    <w:p>
-      <w:pPr>
-        <w:pStyle w:val="ListParagraph"/>
-        <w:numPr>
-          <w:ilvl w:val="0"/>
-          <w:numId w:val="2"/>
-        </w:numPr>
-      </w:pPr>
-      <w:r>
-        <w:t>Travel</w:t>
-      </w:r>
-      <w:r>
-        <w:t>er</w:t>
-      </w:r>
-    </w:p>
-    <w:p>
-      <w:pPr>
-        <w:pStyle w:val="ListParagraph"/>
-        <w:numPr>
-          <w:ilvl w:val="0"/>
-          <w:numId w:val="2"/>
-        </w:numPr>
-      </w:pPr>
-      <w:r>
-        <w:t>Trip</w:t>
-      </w:r>
-    </w:p>
-    <w:p>
-      <w:pPr>
-        <w:pStyle w:val="ListParagraph"/>
-        <w:numPr>
-          <w:ilvl w:val="0"/>
-          <w:numId w:val="2"/>
-        </w:numPr>
-      </w:pPr>
-      <w:r>
-        <w:t>Hub – optional</w:t>
-      </w:r>
-    </w:p>
-    <w:p>
-      <w:pPr>
-        <w:pStyle w:val="ListParagraph"/>
-        <w:numPr>
-          <w:ilvl w:val="0"/>
-          <w:numId w:val="2"/>
-        </w:numPr>
-      </w:pPr>
-      <w:r>
-        <w:t>Transfer – optional</w:t>
-      </w:r>
-    </w:p>
-    <w:p>
-      <w:pPr>
-        <w:pStyle w:val="ListParagraph"/>
-        <w:numPr>
-          <w:ilvl w:val="0"/>
-          <w:numId w:val="2"/>
-        </w:numPr>
-      </w:pPr>
-      <w:r>
-        <w:t>Shipment</w:t>
-      </w:r>
-    </w:p>
-    <w:p>
-      <w:pPr>
-        <w:pStyle w:val="ListParagraph"/>
-        <w:numPr>
-          <w:ilvl w:val="0"/>
-          <w:numId w:val="2"/>
-        </w:numPr>
-      </w:pPr>
-      <w:r>
-        <w:t>Office</w:t>
-      </w:r>
-    </w:p>
-    <w:p>
-      <w:pPr>
-        <w:pStyle w:val="ListParagraph"/>
-      </w:pPr>
-      <w:r>
-        <w:lastRenderedPageBreak/>
-        <w:t>Website</w:t>
-      </w:r>
-    </w:p>
-    <w:p>
-      <w:r>
-        <w:t>Products go from website to customer through these steps;</w:t>
-      </w:r>
-    </w:p>
-    <w:p>
-      <w:pPr>
-        <w:pStyle w:val="ListParagraph"/>
-        <w:numPr>
-          <w:ilvl w:val="0"/>
-          <w:numId w:val="23"/>
-        </w:numPr>
-      </w:pPr>
-      <w:r>
-        <w:t>Order</w:t>
-      </w:r>
-    </w:p>
-    <w:p>
-      <w:pPr>
-        <w:pStyle w:val="ListParagraph"/>
-        <w:numPr>
-          <w:ilvl w:val="0"/>
-          <w:numId w:val="23"/>
-        </w:numPr>
-      </w:pPr>
-      <w:r>
-        <w:t>Delivery</w:t>
-      </w:r>
-    </w:p>
-    <w:p>
-      <w:pPr>
-        <w:pStyle w:val="ListParagraph"/>
-        <w:numPr>
-          <w:ilvl w:val="0"/>
-          <w:numId w:val="23"/>
-        </w:numPr>
-      </w:pPr>
-      <w:r>
-        <w:t>Courier</w:t>
-      </w:r>
-    </w:p>
-    <w:p>
-      <w:pPr>
-        <w:pStyle w:val="ListParagraph"/>
-      </w:pPr>
-      <w:r>
-        <w:t>Customer</w:t>
-      </w:r>
-    </w:p>
-    <w:p>
-      <w:r>
-        <w:t>And 3 other containers</w:t>
-      </w:r>
-    </w:p>
-    <w:p>
-      <w:pPr>
-        <w:pStyle w:val="ListParagraph"/>
-        <w:numPr>
-          <w:ilvl w:val="0"/>
-          <w:numId w:val="24"/>
-        </w:numPr>
-      </w:pPr>
-      <w:r>
-        <w:t>Lost</w:t>
-      </w:r>
-    </w:p>
-    <w:p>
-      <w:pPr>
-        <w:pStyle w:val="ListParagraph"/>
-        <w:numPr>
-          <w:ilvl w:val="0"/>
-          <w:numId w:val="24"/>
-        </w:numPr>
-      </w:pPr>
-      <w:r>
-        <w:t>Damaged</w:t>
-      </w:r>
-    </w:p>
-    <w:p>
-      <w:pPr>
-        <w:pStyle w:val="ListParagraph"/>
-        <w:numPr>
-          <w:ilvl w:val="0"/>
-          <w:numId w:val="24"/>
-        </w:numPr>
-      </w:pPr>
-      <w:r>
-        <w:t>Errant</w:t>
-      </w:r>
-    </w:p>
-    <w:p>
-      <w:r>
-        <w:t>And flags;</w:t>
-      </w:r>
-    </w:p>
-    <w:p>
-      <w:pPr>
-        <w:pStyle w:val="ListParagraph"/>
-        <w:numPr>
-          <w:ilvl w:val="0"/>
-          <w:numId w:val="25"/>
-        </w:numPr>
-      </w:pPr>
-      <w:r>
-        <w:t>Delay</w:t>
-      </w:r>
-      <w:r>
-        <w:t xml:space="preserve"> – this flag can be added manually or automatically through some predefined conditions</w:t>
-      </w:r>
-    </w:p>
-    <w:p/>
-    <w:p>
-      <w:r>
-        <w:t>Statuses</w:t>
-      </w:r>
-    </w:p>
-    <w:p>
-      <w:pPr>
-        <w:ind w:firstLine="720"/>
-      </w:pPr>
-      <w:r>
-        <w:t>Sales Side</w:t>
-      </w:r>
-    </w:p>
-    <w:p/>
-    <w:p>
-      <w:pPr>
-        <w:rPr>
-          <w:b/>
-          <w:bCs/>
-        </w:rPr>
-      </w:pPr>
-      <w:r>
-        <w:rPr>
-          <w:b/>
-          <w:bCs/>
-        </w:rPr>
-        <w:t>Items</w:t>
-      </w:r>
-    </w:p>
-    <w:p>
-      <w:pPr>
-        <w:pStyle w:val="ListParagraph"/>
-        <w:numPr>
-          <w:ilvl w:val="0"/>
-          <w:numId w:val="12"/>
-        </w:numPr>
-      </w:pPr>
-      <w:r>
-        <w:t>Requested</w:t>
-      </w:r>
-    </w:p>
-    <w:p>
-      <w:pPr>
-        <w:pStyle w:val="ListParagraph"/>
-        <w:numPr>
-          <w:ilvl w:val="0"/>
-          <w:numId w:val="12"/>
-        </w:numPr>
-      </w:pPr>
-      <w:r>
-        <w:t>Purchased</w:t>
-      </w:r>
-    </w:p>
-    <w:p>
-      <w:pPr>
-        <w:pStyle w:val="ListParagraph"/>
-        <w:numPr>
-          <w:ilvl w:val="0"/>
-          <w:numId w:val="12"/>
-        </w:numPr>
-      </w:pPr>
-      <w:r>
-        <w:t>Dispatched</w:t>
-      </w:r>
-    </w:p>
-    <w:p>
-      <w:pPr>
-        <w:pStyle w:val="ListParagraph"/>
-        <w:numPr>
-          <w:ilvl w:val="0"/>
-          <w:numId w:val="12"/>
-        </w:numPr>
-      </w:pPr>
-      <w:r>
-        <w:t>Delivered</w:t>
-      </w:r>
-    </w:p>
-    <w:p>
-      <w:pPr>
-        <w:pStyle w:val="ListParagraph"/>
-        <w:numPr>
-          <w:ilvl w:val="0"/>
-          <w:numId w:val="12"/>
-        </w:numPr>
-      </w:pPr>
-      <w:r>
-        <w:t>Received</w:t>
-      </w:r>
-    </w:p>
-    <w:p>
-      <w:pPr>
-        <w:pStyle w:val="ListParagraph"/>
-        <w:numPr>
-          <w:ilvl w:val="0"/>
-          <w:numId w:val="12"/>
-        </w:numPr>
-      </w:pPr>
-      <w:r>
-        <w:t>Hub</w:t>
-      </w:r>
-    </w:p>
-    <w:p>
-      <w:pPr>
-        <w:pStyle w:val="ListParagraph"/>
-        <w:numPr>
-          <w:ilvl w:val="0"/>
-          <w:numId w:val="12"/>
-        </w:numPr>
-      </w:pPr>
-      <w:r>
-        <w:t>Transit</w:t>
-      </w:r>
-    </w:p>
-    <w:p>
-      <w:pPr>
-        <w:pStyle w:val="ListParagraph"/>
-        <w:numPr>
-          <w:ilvl w:val="0"/>
-          <w:numId w:val="12"/>
-        </w:numPr>
-      </w:pPr>
-      <w:r>
-        <w:t>Customs</w:t>
-      </w:r>
-    </w:p>
-    <w:p>
-      <w:pPr>
-        <w:pStyle w:val="ListParagraph"/>
-        <w:numPr>
-          <w:ilvl w:val="0"/>
-          <w:numId w:val="12"/>
-        </w:numPr>
-      </w:pPr>
-      <w:r>
-        <w:t>Out for delivery</w:t>
-      </w:r>
-    </w:p>
-    <w:p>
-      <w:pPr>
-        <w:pStyle w:val="ListParagraph"/>
-        <w:numPr>
-          <w:ilvl w:val="0"/>
-          <w:numId w:val="12"/>
-        </w:numPr>
-      </w:pPr>
-      <w:r>
-        <w:t>Office</w:t>
-      </w:r>
-    </w:p>
-    <w:p>
-      <w:pPr>
-        <w:pStyle w:val="ListParagraph"/>
-        <w:numPr>
-          <w:ilvl w:val="0"/>
-          <w:numId w:val="12"/>
-        </w:numPr>
-      </w:pPr>
-      <w:r>
-        <w:t>Photos sent</w:t>
-      </w:r>
-    </w:p>
-    <w:p>
-      <w:pPr>
-        <w:pStyle w:val="ListParagraph"/>
-        <w:numPr>
-          <w:ilvl w:val="0"/>
-          <w:numId w:val="12"/>
-        </w:numPr>
-      </w:pPr>
-    </w:p>
-    <w:p/>
-    <w:p>
-      <w:pPr>
-        <w:rPr>
-          <w:b/>
-          <w:bCs/>
-        </w:rPr>
-      </w:pPr>
-      <w:r>
-        <w:rPr>
-          <w:b/>
-          <w:bCs/>
-        </w:rPr>
-        <w:lastRenderedPageBreak/>
+        <w:rPr>
+          <w:b/>
+          <w:bCs/>
+        </w:rPr>
+      </w:pPr>
+      <w:r>
+        <w:rPr>
+          <w:b/>
+          <w:bCs/>
+        </w:rPr>
         <w:t>Trips</w:t>
       </w:r>
     </w:p>
@@ -1416,6 +1702,7 @@
         </w:numPr>
       </w:pPr>
       <w:r>
+        <w:lastRenderedPageBreak/>
         <w:t>Approved</w:t>
       </w:r>
     </w:p>
@@ -1782,83 +2069,83 @@
         </w:numPr>
       </w:pPr>
       <w:r>
+        <w:t>Received</w:t>
+      </w:r>
+    </w:p>
+    <w:p>
+      <w:pPr>
+        <w:ind w:firstLine="720"/>
+      </w:pPr>
+      <w:r>
+        <w:rPr>
+          <w:b/>
+          <w:bCs/>
+        </w:rPr>
+        <w:t>Flags</w:t>
+      </w:r>
+    </w:p>
+    <w:p>
+      <w:pPr>
+        <w:ind w:left="360"/>
+        <w:rPr>
+          <w:b/>
+          <w:bCs/>
+        </w:rPr>
+      </w:pPr>
+      <w:r>
+        <w:rPr>
+          <w:b/>
+          <w:bCs/>
+        </w:rPr>
+        <w:t>Flags</w:t>
+      </w:r>
+      <w:r>
+        <w:rPr>
+          <w:b/>
+          <w:bCs/>
+        </w:rPr>
+        <w:t xml:space="preserve"> (Totally </w:t>
+      </w:r>
+      <w:r>
+        <w:t>– all inventory of the trip or</w:t>
+      </w:r>
+      <w:r>
+        <w:rPr>
+          <w:b/>
+          <w:bCs/>
+        </w:rPr>
+        <w:t xml:space="preserve"> </w:t>
+      </w:r>
+      <w:proofErr w:type="gramStart"/>
+      <w:r>
+        <w:rPr>
+          <w:b/>
+          <w:bCs/>
+        </w:rPr>
+        <w:t>Partially</w:t>
+      </w:r>
+      <w:proofErr w:type="gramEnd"/>
+      <w:r>
+        <w:t xml:space="preserve"> – some items in the trip</w:t>
+      </w:r>
+      <w:r>
+        <w:rPr>
+          <w:b/>
+          <w:bCs/>
+        </w:rPr>
+        <w:t>)</w:t>
+      </w:r>
+    </w:p>
+    <w:p>
+      <w:pPr>
+        <w:pStyle w:val="ListParagraph"/>
+        <w:numPr>
+          <w:ilvl w:val="0"/>
+          <w:numId w:val="16"/>
+        </w:numPr>
+      </w:pPr>
+      <w:r>
         <w:lastRenderedPageBreak/>
-        <w:t>Received</w:t>
-      </w:r>
-    </w:p>
-    <w:p>
-      <w:pPr>
-        <w:ind w:firstLine="720"/>
-      </w:pPr>
-      <w:r>
-        <w:rPr>
-          <w:b/>
-          <w:bCs/>
-        </w:rPr>
-        <w:t>Flags</w:t>
-      </w:r>
-    </w:p>
-    <w:p>
-      <w:pPr>
-        <w:ind w:left="360"/>
-        <w:rPr>
-          <w:b/>
-          <w:bCs/>
-        </w:rPr>
-      </w:pPr>
-      <w:r>
-        <w:rPr>
-          <w:b/>
-          <w:bCs/>
-        </w:rPr>
-        <w:t>Flags</w:t>
-      </w:r>
-      <w:r>
-        <w:rPr>
-          <w:b/>
-          <w:bCs/>
-        </w:rPr>
-        <w:t xml:space="preserve"> (Totally </w:t>
-      </w:r>
-      <w:r>
-        <w:t>– all inventory of the trip or</w:t>
-      </w:r>
-      <w:r>
-        <w:rPr>
-          <w:b/>
-          <w:bCs/>
-        </w:rPr>
-        <w:t xml:space="preserve"> </w:t>
-      </w:r>
-      <w:proofErr w:type="gramStart"/>
-      <w:r>
-        <w:rPr>
-          <w:b/>
-          <w:bCs/>
-        </w:rPr>
-        <w:t>Partially</w:t>
-      </w:r>
-      <w:proofErr w:type="gramEnd"/>
-      <w:r>
-        <w:t xml:space="preserve"> – some items in the trip</w:t>
-      </w:r>
-      <w:r>
-        <w:rPr>
-          <w:b/>
-          <w:bCs/>
-        </w:rPr>
-        <w:t>)</w:t>
-      </w:r>
-    </w:p>
-    <w:p>
-      <w:pPr>
-        <w:pStyle w:val="ListParagraph"/>
-        <w:numPr>
-          <w:ilvl w:val="0"/>
-          <w:numId w:val="16"/>
-        </w:numPr>
-      </w:pPr>
-      <w:r>
         <w:t>Delayed</w:t>
       </w:r>
     </w:p>
@@ -2108,51 +2395,51 @@
         </w:numPr>
       </w:pPr>
       <w:r>
+        <w:t xml:space="preserve">Request &gt;&gt; In case of Special Order; 3 X Requested from Supplier to Customer by Sales User, </w:t>
+      </w:r>
+      <w:proofErr w:type="gramStart"/>
+      <w:r>
+        <w:t>In</w:t>
+      </w:r>
+      <w:proofErr w:type="gramEnd"/>
+      <w:r>
+        <w:t xml:space="preserve"> case of non-Special Order &gt;&gt; 3 X Requested from Supplier by Sales User</w:t>
+      </w:r>
+    </w:p>
+    <w:p>
+      <w:pPr>
+        <w:pStyle w:val="ListParagraph"/>
+        <w:numPr>
+          <w:ilvl w:val="0"/>
+          <w:numId w:val="18"/>
+        </w:numPr>
+      </w:pPr>
+      <w:r>
+        <w:t>Purchase &gt;&gt; 3 X Purchased from Supplier to Destination</w:t>
+      </w:r>
+    </w:p>
+    <w:p>
+      <w:pPr>
+        <w:pStyle w:val="ListParagraph"/>
+        <w:numPr>
+          <w:ilvl w:val="0"/>
+          <w:numId w:val="18"/>
+        </w:numPr>
+      </w:pPr>
+      <w:r>
+        <w:t>Patch &gt;&gt; 3 X Shipped from Supplier to Destination</w:t>
+      </w:r>
+    </w:p>
+    <w:p>
+      <w:pPr>
+        <w:pStyle w:val="ListParagraph"/>
+        <w:numPr>
+          <w:ilvl w:val="0"/>
+          <w:numId w:val="18"/>
+        </w:numPr>
+      </w:pPr>
+      <w:r>
         <w:lastRenderedPageBreak/>
-        <w:t xml:space="preserve">Request &gt;&gt; In case of Special Order; 3 X Requested from Supplier to Customer by Sales User, </w:t>
-      </w:r>
-      <w:proofErr w:type="gramStart"/>
-      <w:r>
-        <w:t>In</w:t>
-      </w:r>
-      <w:proofErr w:type="gramEnd"/>
-      <w:r>
-        <w:t xml:space="preserve"> case of non-Special Order &gt;&gt; 3 X Requested from Supplier by Sales User</w:t>
-      </w:r>
-    </w:p>
-    <w:p>
-      <w:pPr>
-        <w:pStyle w:val="ListParagraph"/>
-        <w:numPr>
-          <w:ilvl w:val="0"/>
-          <w:numId w:val="18"/>
-        </w:numPr>
-      </w:pPr>
-      <w:r>
-        <w:t>Purchase &gt;&gt; 3 X Purchased from Supplier to Destination</w:t>
-      </w:r>
-    </w:p>
-    <w:p>
-      <w:pPr>
-        <w:pStyle w:val="ListParagraph"/>
-        <w:numPr>
-          <w:ilvl w:val="0"/>
-          <w:numId w:val="18"/>
-        </w:numPr>
-      </w:pPr>
-      <w:r>
-        <w:t>Patch &gt;&gt; 3 X Shipped from Supplier to Destination</w:t>
-      </w:r>
-    </w:p>
-    <w:p>
-      <w:pPr>
-        <w:pStyle w:val="ListParagraph"/>
-        <w:numPr>
-          <w:ilvl w:val="0"/>
-          <w:numId w:val="18"/>
-        </w:numPr>
-      </w:pPr>
-      <w:r>
         <w:t>Traveler &gt;&gt; Traveler Name</w:t>
       </w:r>
     </w:p>
@@ -2336,115 +2623,78 @@
     <w:p/>
     <w:p/>
     <w:p/>
-    <w:p/>
-    <w:p/>
-    <w:p/>
-    <w:p/>
-    <w:p>
-      <w:r>
-        <w:rPr>
-          <w:b/>
-          <w:bCs/>
+    <w:p>
+      <w:pPr>
+        <w:rPr>
           <w:color w:val="196B24" w:themeColor="accent3"/>
         </w:rPr>
-        <w:t>Expenses Module</w:t>
-      </w:r>
+      </w:pPr>
       <w:r>
         <w:rPr>
           <w:b/>
           <w:bCs/>
           <w:color w:val="196B24" w:themeColor="accent3"/>
         </w:rPr>
+        <w:t>Pricing Module</w:t>
+      </w:r>
+      <w:r>
+        <w:rPr>
+          <w:b/>
+          <w:bCs/>
+          <w:color w:val="196B24" w:themeColor="accent3"/>
+        </w:rPr>
         <w:br/>
       </w:r>
       <w:r>
-        <w:t>A</w:t>
-      </w:r>
-    </w:p>
-    <w:p/>
-    <w:p>
-      <w:pPr>
-        <w:rPr>
-          <w:b/>
-          <w:bCs/>
+        <w:rPr>
           <w:color w:val="196B24" w:themeColor="accent3"/>
         </w:rPr>
-      </w:pPr>
-      <w:r>
-        <w:rPr>
-          <w:b/>
-          <w:bCs/>
+        <w:t>In this module there are 3 sections;</w:t>
+      </w:r>
+    </w:p>
+    <w:p>
+      <w:pPr>
+        <w:pStyle w:val="ListParagraph"/>
+        <w:numPr>
+          <w:ilvl w:val="0"/>
+          <w:numId w:val="20"/>
+        </w:numPr>
+        <w:rPr>
           <w:color w:val="196B24" w:themeColor="accent3"/>
         </w:rPr>
-        <w:br w:type="page"/>
-      </w:r>
-    </w:p>
-    <w:p>
-      <w:pPr>
-        <w:rPr>
+      </w:pPr>
+      <w:r>
+        <w:rPr>
+          <w:b/>
+          <w:bCs/>
           <w:color w:val="196B24" w:themeColor="accent3"/>
         </w:rPr>
-      </w:pPr>
-      <w:r>
-        <w:rPr>
-          <w:b/>
-          <w:bCs/>
+        <w:t>Supplements</w:t>
+      </w:r>
+      <w:r>
+        <w:rPr>
           <w:color w:val="196B24" w:themeColor="accent3"/>
         </w:rPr>
+        <w:t xml:space="preserve"> – calculator that take many inputs in give single output; Price. Each calculation is registered in history automatically. Historical calculations can be deleted by users but </w:t>
+      </w:r>
+      <w:r>
+        <w:rPr>
+          <w:color w:val="196B24" w:themeColor="accent3"/>
+        </w:rPr>
+        <w:t>are still</w:t>
+      </w:r>
+      <w:r>
+        <w:rPr>
+          <w:color w:val="196B24" w:themeColor="accent3"/>
+        </w:rPr>
+        <w:t xml:space="preserve"> reachable by admin. After successful entry that led to </w:t>
+      </w:r>
+      <w:r>
+        <w:rPr>
+          <w:color w:val="196B24" w:themeColor="accent3"/>
+        </w:rPr>
         <w:lastRenderedPageBreak/>
-        <w:t>Pricing Module</w:t>
-      </w:r>
-      <w:r>
-        <w:rPr>
-          <w:b/>
-          <w:bCs/>
-          <w:color w:val="196B24" w:themeColor="accent3"/>
-        </w:rPr>
-        <w:br/>
-      </w:r>
-      <w:r>
-        <w:rPr>
-          <w:color w:val="196B24" w:themeColor="accent3"/>
-        </w:rPr>
-        <w:t>In this module there are 3 sections;</w:t>
-      </w:r>
-    </w:p>
-    <w:p>
-      <w:pPr>
-        <w:pStyle w:val="ListParagraph"/>
-        <w:numPr>
-          <w:ilvl w:val="0"/>
-          <w:numId w:val="20"/>
-        </w:numPr>
-        <w:rPr>
-          <w:color w:val="196B24" w:themeColor="accent3"/>
-        </w:rPr>
-      </w:pPr>
-      <w:r>
-        <w:rPr>
-          <w:b/>
-          <w:bCs/>
-          <w:color w:val="196B24" w:themeColor="accent3"/>
-        </w:rPr>
-        <w:t>Supplements</w:t>
-      </w:r>
-      <w:r>
-        <w:rPr>
-          <w:color w:val="196B24" w:themeColor="accent3"/>
-        </w:rPr>
-        <w:t xml:space="preserve"> – calculator that take many inputs in give single output; Price. Each calculation is registered in history automatically. Historical calculations can be deleted by users but </w:t>
-      </w:r>
-      <w:r>
-        <w:rPr>
-          <w:color w:val="196B24" w:themeColor="accent3"/>
-        </w:rPr>
-        <w:t>are still</w:t>
-      </w:r>
-      <w:r>
-        <w:rPr>
-          <w:color w:val="196B24" w:themeColor="accent3"/>
-        </w:rPr>
-        <w:t xml:space="preserve"> reachable by admin. After successful entry that led to calculated results, or after invalid or missing entry that resulted in error, please return form pre-filled with recent input and highlight problematic entry field with red color in applicable. Section details are as follows;</w:t>
+        <w:t>calculated results, or after invalid or missing entry that resulted in error, please return form pre-filled with recent input and highlight problematic entry field with red color in applicable. Section details are as follows;</w:t>
       </w:r>
     </w:p>
     <w:p>
@@ -2817,7 +3067,6 @@
         <w:rPr>
           <w:color w:val="196B24" w:themeColor="accent3"/>
         </w:rPr>
-        <w:lastRenderedPageBreak/>
         <w:t>History – list of all calculation stamped by date, time and user</w:t>
       </w:r>
       <w:r>
@@ -2864,6 +3113,7 @@
           <w:color w:val="196B24" w:themeColor="accent3"/>
           <w:lang w:bidi="ar-EG"/>
         </w:rPr>
+        <w:lastRenderedPageBreak/>
         <w:t xml:space="preserve">There should be a list of all variables and their multipliers editable </w:t>
       </w:r>
       <w:r>
@@ -2955,1244 +3205,6 @@
         <w:t>Register calculation inputs and output and user into history</w:t>
       </w:r>
     </w:p>
-    <w:p/>
-    <w:p/>
-    <w:p/>
-    <w:p/>
-    <w:p/>
-    <w:p/>
-    <w:p/>
-    <w:p>
-      <w:r>
-        <w:rPr>
-          <w:b/>
-          <w:bCs/>
-        </w:rPr>
-        <w:t xml:space="preserve">Pricing </w:t>
-      </w:r>
-      <w:r>
-        <w:rPr>
-          <w:b/>
-          <w:bCs/>
-        </w:rPr>
-        <w:t>Module</w:t>
-      </w:r>
-      <w:r>
-        <w:rPr>
-          <w:b/>
-          <w:bCs/>
-        </w:rPr>
-        <w:br/>
-      </w:r>
-      <w:r>
-        <w:t>In this module there are 3 sections;</w:t>
-      </w:r>
-    </w:p>
-    <w:p>
-      <w:pPr>
-        <w:pStyle w:val="ListParagraph"/>
-        <w:numPr>
-          <w:ilvl w:val="0"/>
-          <w:numId w:val="20"/>
-        </w:numPr>
-      </w:pPr>
-      <w:r>
-        <w:rPr>
-          <w:b/>
-          <w:bCs/>
-        </w:rPr>
-        <w:t>Supplements</w:t>
-      </w:r>
-      <w:r>
-        <w:t xml:space="preserve"> – calculator that take many inputs in give single output; Price. Each calculation is registered in history automatically. Historical calculations can be deleted by users but still reachable by admin. After successful entry that led to calculated results, or after invalid or missing entry that resulted in error, </w:t>
-      </w:r>
-      <w:r>
-        <w:t xml:space="preserve">please return form pre-filled with recent input and highlight problematic entry field with red color in applicable. </w:t>
-      </w:r>
-      <w:r>
-        <w:t>Section details are as follows;</w:t>
-      </w:r>
-    </w:p>
-    <w:p>
-      <w:pPr>
-        <w:pStyle w:val="ListParagraph"/>
-        <w:numPr>
-          <w:ilvl w:val="0"/>
-          <w:numId w:val="21"/>
-        </w:numPr>
-        <w:rPr>
-          <w:lang w:bidi="ar-EG"/>
-        </w:rPr>
-      </w:pPr>
-      <w:r>
-        <w:rPr>
-          <w:lang w:bidi="ar-EG"/>
-        </w:rPr>
-        <w:t>Input;</w:t>
-      </w:r>
-    </w:p>
-    <w:p>
-      <w:pPr>
-        <w:pStyle w:val="ListParagraph"/>
-        <w:numPr>
-          <w:ilvl w:val="1"/>
-          <w:numId w:val="21"/>
-        </w:numPr>
-        <w:rPr>
-          <w:lang w:bidi="ar-EG"/>
-        </w:rPr>
-      </w:pPr>
-      <w:r>
-        <w:rPr>
-          <w:lang w:bidi="ar-EG"/>
-        </w:rPr>
-        <w:t xml:space="preserve">Product name – </w:t>
-      </w:r>
-      <w:r>
-        <w:rPr>
-          <w:lang w:bidi="ar-EG"/>
-        </w:rPr>
-        <w:t>doesn’t affect calculations, but still registered in History</w:t>
-      </w:r>
-    </w:p>
-    <w:p>
-      <w:pPr>
-        <w:pStyle w:val="ListParagraph"/>
-        <w:numPr>
-          <w:ilvl w:val="1"/>
-          <w:numId w:val="21"/>
-        </w:numPr>
-        <w:rPr>
-          <w:lang w:bidi="ar-EG"/>
-        </w:rPr>
-      </w:pPr>
-      <w:r>
-        <w:rPr>
-          <w:lang w:bidi="ar-EG"/>
-        </w:rPr>
-        <w:t>Imported from [symbol in calculation formula ‘</w:t>
-      </w:r>
-      <w:r>
-        <w:rPr>
-          <w:lang w:bidi="ar-EG"/>
-        </w:rPr>
-        <w:t>O</w:t>
-      </w:r>
-      <w:r>
-        <w:rPr>
-          <w:lang w:bidi="ar-EG"/>
-        </w:rPr>
-        <w:t xml:space="preserve">’] – select from (USA, UK or EU) – each selection has adjacent value that affect calculations </w:t>
-      </w:r>
-    </w:p>
-    <w:p>
-      <w:pPr>
-        <w:pStyle w:val="ListParagraph"/>
-        <w:numPr>
-          <w:ilvl w:val="1"/>
-          <w:numId w:val="21"/>
-        </w:numPr>
-        <w:rPr>
-          <w:lang w:bidi="ar-EG"/>
-        </w:rPr>
-      </w:pPr>
-      <w:r>
-        <w:rPr>
-          <w:lang w:bidi="ar-EG"/>
-        </w:rPr>
-        <w:t>Supplier – select from list of suppliers available in each country. Some suppliers are available in more than one country. List of suppliers and their availability should be editable in admin side &gt; Setting Module &gt; Logistics section</w:t>
-      </w:r>
-    </w:p>
-    <w:p>
-      <w:pPr>
-        <w:pStyle w:val="ListParagraph"/>
-        <w:numPr>
-          <w:ilvl w:val="1"/>
-          <w:numId w:val="21"/>
-        </w:numPr>
-        <w:rPr>
-          <w:lang w:bidi="ar-EG"/>
-        </w:rPr>
-      </w:pPr>
-      <w:r>
-        <w:rPr>
-          <w:lang w:bidi="ar-EG"/>
-        </w:rPr>
-        <w:lastRenderedPageBreak/>
-        <w:t>Purchase Price [symbol in calculation formula ‘P’]</w:t>
-      </w:r>
-    </w:p>
-    <w:p>
-      <w:pPr>
-        <w:pStyle w:val="ListParagraph"/>
-        <w:numPr>
-          <w:ilvl w:val="1"/>
-          <w:numId w:val="21"/>
-        </w:numPr>
-        <w:rPr>
-          <w:lang w:bidi="ar-EG"/>
-        </w:rPr>
-      </w:pPr>
-      <w:r>
-        <w:rPr>
-          <w:lang w:bidi="ar-EG"/>
-        </w:rPr>
-        <w:t>Count [symbol in calculation formula ‘C’]</w:t>
-      </w:r>
-    </w:p>
-    <w:p>
-      <w:pPr>
-        <w:pStyle w:val="ListParagraph"/>
-        <w:numPr>
-          <w:ilvl w:val="1"/>
-          <w:numId w:val="21"/>
-        </w:numPr>
-        <w:rPr>
-          <w:lang w:bidi="ar-EG"/>
-        </w:rPr>
-      </w:pPr>
-      <w:r>
-        <w:rPr>
-          <w:lang w:bidi="ar-EG"/>
-        </w:rPr>
-        <w:t>Daily Dose [symbol in calculation formula ‘D’]</w:t>
-      </w:r>
-    </w:p>
-    <w:p>
-      <w:pPr>
-        <w:pStyle w:val="ListParagraph"/>
-        <w:numPr>
-          <w:ilvl w:val="1"/>
-          <w:numId w:val="21"/>
-        </w:numPr>
-        <w:rPr>
-          <w:lang w:bidi="ar-EG"/>
-        </w:rPr>
-      </w:pPr>
-      <w:r>
-        <w:rPr>
-          <w:lang w:bidi="ar-EG"/>
-        </w:rPr>
-        <w:t>Weight (grams) [symbol in calculation formula ‘W’]</w:t>
-      </w:r>
-    </w:p>
-    <w:p>
-      <w:pPr>
-        <w:pStyle w:val="ListParagraph"/>
-        <w:numPr>
-          <w:ilvl w:val="1"/>
-          <w:numId w:val="21"/>
-        </w:numPr>
-        <w:rPr>
-          <w:lang w:bidi="ar-EG"/>
-        </w:rPr>
-      </w:pPr>
-      <w:r>
-        <w:rPr>
-          <w:lang w:bidi="ar-EG"/>
-        </w:rPr>
-        <w:t xml:space="preserve">Product shape [symbol in calculation formula ‘S’] – select from list (Capsules/Tablets, </w:t>
-      </w:r>
-      <w:proofErr w:type="spellStart"/>
-      <w:r>
-        <w:rPr>
-          <w:lang w:bidi="ar-EG"/>
-        </w:rPr>
-        <w:t>Softgels</w:t>
-      </w:r>
-      <w:proofErr w:type="spellEnd"/>
-      <w:r>
-        <w:rPr>
-          <w:lang w:bidi="ar-EG"/>
-        </w:rPr>
-        <w:t>/Chews, Powder/Creamy, Gummies, Liquid, Injection)</w:t>
-      </w:r>
-      <w:r>
-        <w:rPr>
-          <w:lang w:bidi="ar-EG"/>
-        </w:rPr>
-        <w:t xml:space="preserve"> – each product shape has multiplier that can be edited in the admin side</w:t>
-      </w:r>
-    </w:p>
-    <w:p>
-      <w:pPr>
-        <w:pStyle w:val="ListParagraph"/>
-        <w:numPr>
-          <w:ilvl w:val="1"/>
-          <w:numId w:val="21"/>
-        </w:numPr>
-        <w:rPr>
-          <w:lang w:bidi="ar-EG"/>
-        </w:rPr>
-      </w:pPr>
-      <w:r>
-        <w:rPr>
-          <w:lang w:bidi="ar-EG"/>
-        </w:rPr>
-        <w:t>Packaging Material [symbol in calculation formula ‘</w:t>
-      </w:r>
-      <w:r>
-        <w:rPr>
-          <w:lang w:bidi="ar-EG"/>
-        </w:rPr>
-        <w:t>K</w:t>
-      </w:r>
-      <w:r>
-        <w:rPr>
-          <w:lang w:bidi="ar-EG"/>
-        </w:rPr>
-        <w:t>’]</w:t>
-      </w:r>
-      <w:r>
-        <w:rPr>
-          <w:lang w:bidi="ar-EG"/>
-        </w:rPr>
-        <w:t xml:space="preserve"> – each packaging material has multiplier that can be edited in the admin side</w:t>
-      </w:r>
-    </w:p>
-    <w:p>
-      <w:pPr>
-        <w:pStyle w:val="ListParagraph"/>
-        <w:numPr>
-          <w:ilvl w:val="1"/>
-          <w:numId w:val="21"/>
-        </w:numPr>
-        <w:rPr>
-          <w:lang w:bidi="ar-EG"/>
-        </w:rPr>
-      </w:pPr>
-      <w:r>
-        <w:rPr>
-          <w:lang w:bidi="ar-EG"/>
-        </w:rPr>
-        <w:t>Size [symbol in calculation formula ‘</w:t>
-      </w:r>
-      <w:r>
-        <w:rPr>
-          <w:lang w:bidi="ar-EG"/>
-        </w:rPr>
-        <w:t>Z</w:t>
-      </w:r>
-      <w:r>
-        <w:rPr>
-          <w:lang w:bidi="ar-EG"/>
-        </w:rPr>
-        <w:t xml:space="preserve">’] </w:t>
-      </w:r>
-      <w:r>
-        <w:rPr>
-          <w:lang w:bidi="ar-EG"/>
-        </w:rPr>
-        <w:t>–</w:t>
-      </w:r>
-      <w:r>
-        <w:rPr>
-          <w:lang w:bidi="ar-EG"/>
-        </w:rPr>
-        <w:t xml:space="preserve"> </w:t>
-      </w:r>
-      <w:r>
-        <w:rPr>
-          <w:lang w:bidi="ar-EG"/>
-        </w:rPr>
-        <w:t>select from list; Small, Normal, Big and Huge – each size has multiplier that can be edited in the admin side</w:t>
-      </w:r>
-    </w:p>
-    <w:p>
-      <w:pPr>
-        <w:pStyle w:val="ListParagraph"/>
-        <w:numPr>
-          <w:ilvl w:val="1"/>
-          <w:numId w:val="21"/>
-        </w:numPr>
-        <w:rPr>
-          <w:lang w:bidi="ar-EG"/>
-        </w:rPr>
-      </w:pPr>
-      <w:r>
-        <w:rPr>
-          <w:lang w:bidi="ar-EG"/>
-        </w:rPr>
-        <w:t>Male Support [symbol in calculation formula ‘</w:t>
-      </w:r>
-      <w:r>
-        <w:rPr>
-          <w:lang w:bidi="ar-EG"/>
-        </w:rPr>
-        <w:t>X</w:t>
-      </w:r>
-      <w:r>
-        <w:rPr>
-          <w:lang w:bidi="ar-EG"/>
-        </w:rPr>
-        <w:t xml:space="preserve">’] – switch – if yes, </w:t>
-      </w:r>
-      <w:r>
-        <w:rPr>
-          <w:lang w:bidi="ar-EG"/>
-        </w:rPr>
-        <w:t>X</w:t>
-      </w:r>
-      <w:r>
-        <w:rPr>
-          <w:lang w:bidi="ar-EG"/>
-        </w:rPr>
-        <w:t xml:space="preserve"> = 1 and if no, </w:t>
-      </w:r>
-      <w:r>
-        <w:rPr>
-          <w:lang w:bidi="ar-EG"/>
-        </w:rPr>
-        <w:t>X</w:t>
-      </w:r>
-      <w:r>
-        <w:rPr>
-          <w:lang w:bidi="ar-EG"/>
-        </w:rPr>
-        <w:t xml:space="preserve"> = 0</w:t>
-      </w:r>
-      <w:r>
-        <w:rPr>
-          <w:lang w:bidi="ar-EG"/>
-        </w:rPr>
-        <w:t xml:space="preserve"> </w:t>
-      </w:r>
-    </w:p>
-    <w:p>
-      <w:pPr>
-        <w:pStyle w:val="ListParagraph"/>
-        <w:numPr>
-          <w:ilvl w:val="1"/>
-          <w:numId w:val="21"/>
-        </w:numPr>
-        <w:rPr>
-          <w:lang w:bidi="ar-EG"/>
-        </w:rPr>
-      </w:pPr>
-      <w:r>
-        <w:rPr>
-          <w:lang w:bidi="ar-EG"/>
-        </w:rPr>
-        <w:t>Notes – doesn’t affect calculations, but still registered in History</w:t>
-      </w:r>
-    </w:p>
-    <w:p>
-      <w:pPr>
-        <w:pStyle w:val="ListParagraph"/>
-        <w:numPr>
-          <w:ilvl w:val="1"/>
-          <w:numId w:val="21"/>
-        </w:numPr>
-        <w:rPr>
-          <w:lang w:bidi="ar-EG"/>
-        </w:rPr>
-      </w:pPr>
-      <w:r>
-        <w:rPr>
-          <w:lang w:bidi="ar-EG"/>
-        </w:rPr>
-        <w:t xml:space="preserve">Attached </w:t>
-      </w:r>
-      <w:r>
-        <w:rPr>
-          <w:lang w:bidi="ar-EG"/>
-        </w:rPr>
-        <w:t>photos –</w:t>
-      </w:r>
-      <w:r>
-        <w:rPr>
-          <w:lang w:bidi="ar-EG"/>
-        </w:rPr>
-        <w:t xml:space="preserve"> doesn’t affect calculations, but still registered in History</w:t>
-      </w:r>
-    </w:p>
-    <w:p>
-      <w:pPr>
-        <w:pStyle w:val="ListParagraph"/>
-        <w:numPr>
-          <w:ilvl w:val="0"/>
-          <w:numId w:val="21"/>
-        </w:numPr>
-        <w:rPr>
-          <w:lang w:bidi="ar-EG"/>
-        </w:rPr>
-      </w:pPr>
-      <w:r>
-        <w:rPr>
-          <w:lang w:bidi="ar-EG"/>
-        </w:rPr>
-        <w:t>Calculations</w:t>
-      </w:r>
-    </w:p>
-    <w:p>
-      <w:pPr>
-        <w:pStyle w:val="ListParagraph"/>
-        <w:numPr>
-          <w:ilvl w:val="1"/>
-          <w:numId w:val="21"/>
-        </w:numPr>
-        <w:rPr>
-          <w:lang w:bidi="ar-EG"/>
-        </w:rPr>
-      </w:pPr>
-      <w:r>
-        <w:rPr>
-          <w:lang w:bidi="ar-EG"/>
-        </w:rPr>
-        <w:t xml:space="preserve">Calculate dosage </w:t>
-      </w:r>
-      <w:r>
-        <w:rPr>
-          <w:lang w:bidi="ar-EG"/>
-        </w:rPr>
-        <w:t xml:space="preserve">– how many bottles are required to supply usage for 3 months? Maximum 3 bottles </w:t>
-      </w:r>
-      <w:r>
-        <w:rPr>
-          <w:lang w:bidi="ar-EG"/>
-        </w:rPr>
-        <w:t>[symbol in calculation formula ‘</w:t>
-      </w:r>
-      <w:r>
-        <w:rPr>
-          <w:lang w:bidi="ar-EG"/>
-        </w:rPr>
-        <w:t>G</w:t>
-      </w:r>
-      <w:r>
-        <w:rPr>
-          <w:lang w:bidi="ar-EG"/>
-        </w:rPr>
-        <w:t>’]; as follows;</w:t>
-      </w:r>
-    </w:p>
-    <w:p>
-      <w:pPr>
-        <w:pStyle w:val="ListParagraph"/>
-        <w:numPr>
-          <w:ilvl w:val="2"/>
-          <w:numId w:val="21"/>
-        </w:numPr>
-        <w:rPr>
-          <w:lang w:bidi="ar-EG"/>
-        </w:rPr>
-      </w:pPr>
-      <w:r>
-        <w:rPr>
-          <w:lang w:bidi="ar-EG"/>
-        </w:rPr>
-        <w:t>Dosage ‘G’ is how much bottles do I need to supply me for 3 months. Round up to next integer and the maximum for dosage is 3. Dosage can be 1, 2 or 3</w:t>
-      </w:r>
-    </w:p>
-    <w:p>
-      <w:pPr>
-        <w:pStyle w:val="ListParagraph"/>
-        <w:numPr>
-          <w:ilvl w:val="2"/>
-          <w:numId w:val="21"/>
-        </w:numPr>
-        <w:rPr>
-          <w:lang w:bidi="ar-EG"/>
-        </w:rPr>
-      </w:pPr>
-      <w:r>
-        <w:rPr>
-          <w:lang w:bidi="ar-EG"/>
-        </w:rPr>
-        <w:t>Dosage Cost [symbol in calculation formula ‘GC’]</w:t>
-      </w:r>
-    </w:p>
-    <w:p>
-      <w:pPr>
-        <w:pStyle w:val="ListParagraph"/>
-        <w:numPr>
-          <w:ilvl w:val="2"/>
-          <w:numId w:val="21"/>
-        </w:numPr>
-        <w:rPr>
-          <w:lang w:bidi="ar-EG"/>
-        </w:rPr>
-      </w:pPr>
-      <w:r>
-        <w:rPr>
-          <w:lang w:bidi="ar-EG"/>
-        </w:rPr>
-        <w:t xml:space="preserve">if </w:t>
-      </w:r>
-      <w:r>
-        <w:rPr>
-          <w:lang w:bidi="ar-EG"/>
-        </w:rPr>
-        <w:t>G = 1 &gt;&gt; GC = 62</w:t>
-      </w:r>
-    </w:p>
-    <w:p>
-      <w:pPr>
-        <w:pStyle w:val="ListParagraph"/>
-        <w:numPr>
-          <w:ilvl w:val="2"/>
-          <w:numId w:val="21"/>
-        </w:numPr>
-        <w:rPr>
-          <w:lang w:bidi="ar-EG"/>
-        </w:rPr>
-      </w:pPr>
-      <w:r>
-        <w:rPr>
-          <w:lang w:bidi="ar-EG"/>
-        </w:rPr>
-        <w:t>if G = 1 &gt;&gt; GC = 31</w:t>
-      </w:r>
-    </w:p>
-    <w:p>
-      <w:pPr>
-        <w:pStyle w:val="ListParagraph"/>
-        <w:numPr>
-          <w:ilvl w:val="2"/>
-          <w:numId w:val="21"/>
-        </w:numPr>
-        <w:rPr>
-          <w:lang w:bidi="ar-EG"/>
-        </w:rPr>
-      </w:pPr>
-      <w:r>
-        <w:rPr>
-          <w:lang w:bidi="ar-EG"/>
-        </w:rPr>
-        <w:t>if G = 1 &gt;&gt; GC = 0</w:t>
-      </w:r>
-    </w:p>
-    <w:p>
-      <w:pPr>
-        <w:pStyle w:val="ListParagraph"/>
-        <w:numPr>
-          <w:ilvl w:val="2"/>
-          <w:numId w:val="21"/>
-        </w:numPr>
-        <w:rPr>
-          <w:lang w:bidi="ar-EG"/>
-        </w:rPr>
-      </w:pPr>
-      <w:r>
-        <w:rPr>
-          <w:lang w:bidi="ar-EG"/>
-        </w:rPr>
-        <w:t>GC values for each G are editable in admin side</w:t>
-      </w:r>
-    </w:p>
-    <w:p>
-      <w:pPr>
-        <w:pStyle w:val="ListParagraph"/>
-        <w:numPr>
-          <w:ilvl w:val="1"/>
-          <w:numId w:val="21"/>
-        </w:numPr>
-        <w:rPr>
-          <w:lang w:bidi="ar-EG"/>
-        </w:rPr>
-      </w:pPr>
-      <w:r>
-        <w:rPr>
-          <w:lang w:bidi="ar-EG"/>
-        </w:rPr>
-        <w:t xml:space="preserve">TM (total multiplier) is the result of multiplying all these multipliers; TM = O * S * K * </w:t>
-      </w:r>
-      <w:r>
-        <w:rPr>
-          <w:lang w:bidi="ar-EG"/>
-        </w:rPr>
-        <w:t>X</w:t>
-      </w:r>
-      <w:r>
-        <w:rPr>
-          <w:lang w:bidi="ar-EG"/>
-        </w:rPr>
-        <w:t xml:space="preserve"> * Z</w:t>
-      </w:r>
-    </w:p>
-    <w:p>
-      <w:pPr>
-        <w:pStyle w:val="ListParagraph"/>
-        <w:numPr>
-          <w:ilvl w:val="1"/>
-          <w:numId w:val="21"/>
-        </w:numPr>
-        <w:rPr>
-          <w:lang w:bidi="ar-EG"/>
-        </w:rPr>
-      </w:pPr>
-      <w:r>
-        <w:rPr>
-          <w:lang w:bidi="ar-EG"/>
-        </w:rPr>
-        <w:t xml:space="preserve">If S = Injection, then </w:t>
-      </w:r>
-      <w:r>
-        <w:rPr>
-          <w:lang w:bidi="ar-EG"/>
-        </w:rPr>
-        <w:t xml:space="preserve">(Injection Fixed Cost </w:t>
-      </w:r>
-      <w:r>
-        <w:rPr>
-          <w:lang w:bidi="ar-EG"/>
-        </w:rPr>
-        <w:t>[</w:t>
-      </w:r>
-      <w:proofErr w:type="spellStart"/>
-      <w:r>
-        <w:rPr>
-          <w:lang w:bidi="ar-EG"/>
-        </w:rPr>
-        <w:t>I</w:t>
-      </w:r>
-      <w:r>
-        <w:rPr>
-          <w:lang w:bidi="ar-EG"/>
-        </w:rPr>
-        <w:t>c</w:t>
-      </w:r>
-      <w:proofErr w:type="spellEnd"/>
-      <w:r>
-        <w:rPr>
-          <w:lang w:bidi="ar-EG"/>
-        </w:rPr>
-        <w:t>]</w:t>
-      </w:r>
-      <w:r>
-        <w:rPr>
-          <w:lang w:bidi="ar-EG"/>
-        </w:rPr>
-        <w:t>)</w:t>
-      </w:r>
-      <w:r>
-        <w:rPr>
-          <w:lang w:bidi="ar-EG"/>
-        </w:rPr>
-        <w:t xml:space="preserve"> = 2000</w:t>
-      </w:r>
-      <w:r>
-        <w:rPr>
-          <w:lang w:bidi="ar-EG"/>
-        </w:rPr>
-        <w:t xml:space="preserve"> which is an extra cost added after all calculations</w:t>
-      </w:r>
-    </w:p>
-    <w:p>
-      <w:pPr>
-        <w:pStyle w:val="ListParagraph"/>
-        <w:numPr>
-          <w:ilvl w:val="1"/>
-          <w:numId w:val="21"/>
-        </w:numPr>
-        <w:rPr>
-          <w:lang w:bidi="ar-EG"/>
-        </w:rPr>
-      </w:pPr>
-      <w:r>
-        <w:rPr>
-          <w:lang w:bidi="ar-EG"/>
-        </w:rPr>
-        <w:t>Margin [symbol in calculation formula ‘M] – value to be edited in admin panel, current value is 1.2</w:t>
-      </w:r>
-    </w:p>
-    <w:p>
-      <w:pPr>
-        <w:pStyle w:val="ListParagraph"/>
-        <w:numPr>
-          <w:ilvl w:val="1"/>
-          <w:numId w:val="21"/>
-        </w:numPr>
-        <w:rPr>
-          <w:lang w:bidi="ar-EG"/>
-        </w:rPr>
-      </w:pPr>
-      <w:r>
-        <w:rPr>
-          <w:lang w:bidi="ar-EG"/>
-        </w:rPr>
-        <w:t>Inflation factor</w:t>
-      </w:r>
-      <w:r>
-        <w:rPr>
-          <w:lang w:bidi="ar-EG"/>
-        </w:rPr>
-        <w:t xml:space="preserve"> </w:t>
-      </w:r>
-      <w:r>
-        <w:rPr>
-          <w:lang w:bidi="ar-EG"/>
-        </w:rPr>
-        <w:t>[symbol in calculation formula ‘Inf’] – value to be edited in admin panel, current value is 1.05</w:t>
-      </w:r>
-    </w:p>
-    <w:p>
-      <w:pPr>
-        <w:pStyle w:val="ListParagraph"/>
-        <w:numPr>
-          <w:ilvl w:val="1"/>
-          <w:numId w:val="21"/>
-        </w:numPr>
-        <w:rPr>
-          <w:lang w:bidi="ar-EG"/>
-        </w:rPr>
-      </w:pPr>
-      <w:r>
-        <w:rPr>
-          <w:lang w:bidi="ar-EG"/>
-        </w:rPr>
-        <w:lastRenderedPageBreak/>
-        <w:t>Flat Fees [symbol in calculation formula ‘FF’] – value to be edited in admin panel, current value is 250</w:t>
-      </w:r>
-    </w:p>
-    <w:p>
-      <w:pPr>
-        <w:pStyle w:val="ListParagraph"/>
-        <w:numPr>
-          <w:ilvl w:val="1"/>
-          <w:numId w:val="21"/>
-        </w:numPr>
-        <w:rPr>
-          <w:lang w:bidi="ar-EG"/>
-        </w:rPr>
-      </w:pPr>
-      <w:r>
-        <w:rPr>
-          <w:lang w:bidi="ar-EG"/>
-        </w:rPr>
-        <w:t>Foreign Exchange [symbol in calculation formula ‘FX’] – value to be edited in admin panel, current value is 54</w:t>
-      </w:r>
-    </w:p>
-    <w:p>
-      <w:pPr>
-        <w:pStyle w:val="ListParagraph"/>
-        <w:numPr>
-          <w:ilvl w:val="1"/>
-          <w:numId w:val="21"/>
-        </w:numPr>
-        <w:rPr>
-          <w:lang w:bidi="ar-EG"/>
-        </w:rPr>
-      </w:pPr>
-      <w:r>
-        <w:rPr>
-          <w:lang w:bidi="ar-EG"/>
-        </w:rPr>
-        <w:t>Weigh Factor [symbol in calculation formula ‘WF’] – value to be edited in admin panel, current value is 40</w:t>
-      </w:r>
-    </w:p>
-    <w:p>
-      <w:pPr>
-        <w:pStyle w:val="ListParagraph"/>
-        <w:numPr>
-          <w:ilvl w:val="1"/>
-          <w:numId w:val="21"/>
-        </w:numPr>
-        <w:rPr>
-          <w:lang w:bidi="ar-EG"/>
-        </w:rPr>
-      </w:pPr>
-      <w:r>
-        <w:rPr>
-          <w:lang w:bidi="ar-EG"/>
-        </w:rPr>
-        <w:t>Weight Cost [symbol in calculation formula ‘WC], WC = W * FX * WF / 1000</w:t>
-      </w:r>
-    </w:p>
-    <w:p>
-      <w:pPr>
-        <w:pStyle w:val="ListParagraph"/>
-        <w:numPr>
-          <w:ilvl w:val="1"/>
-          <w:numId w:val="21"/>
-        </w:numPr>
-        <w:rPr>
-          <w:lang w:bidi="ar-EG"/>
-        </w:rPr>
-      </w:pPr>
-    </w:p>
-    <w:p>
-      <w:pPr>
-        <w:pStyle w:val="ListParagraph"/>
-        <w:numPr>
-          <w:ilvl w:val="1"/>
-          <w:numId w:val="21"/>
-        </w:numPr>
-        <w:rPr>
-          <w:lang w:bidi="ar-EG"/>
-        </w:rPr>
-      </w:pPr>
-      <w:proofErr w:type="spellStart"/>
-      <w:r>
-        <w:rPr>
-          <w:lang w:bidi="ar-EG"/>
-        </w:rPr>
-        <w:t>Fx</w:t>
-      </w:r>
-      <w:proofErr w:type="spellEnd"/>
-      <w:r>
-        <w:rPr>
-          <w:lang w:bidi="ar-EG"/>
-        </w:rPr>
-        <w:t xml:space="preserve"> = 54 – editable in admin side</w:t>
-      </w:r>
-    </w:p>
-    <w:p>
-      <w:pPr>
-        <w:pStyle w:val="ListParagraph"/>
-        <w:numPr>
-          <w:ilvl w:val="1"/>
-          <w:numId w:val="21"/>
-        </w:numPr>
-        <w:rPr>
-          <w:lang w:bidi="ar-EG"/>
-        </w:rPr>
-      </w:pPr>
-      <w:r>
-        <w:rPr>
-          <w:lang w:bidi="ar-EG"/>
-        </w:rPr>
-        <w:t>There should be a list of all variables and their multipliers editable in the admin section.</w:t>
-      </w:r>
-    </w:p>
-    <w:p>
-      <w:pPr>
-        <w:pStyle w:val="ListParagraph"/>
-        <w:numPr>
-          <w:ilvl w:val="1"/>
-          <w:numId w:val="21"/>
-        </w:numPr>
-        <w:rPr>
-          <w:lang w:bidi="ar-EG"/>
-        </w:rPr>
-      </w:pPr>
-      <w:r>
-        <w:rPr>
-          <w:lang w:bidi="ar-EG"/>
-        </w:rPr>
-        <w:t>If X = 1, add 2000 to the total result</w:t>
-      </w:r>
-    </w:p>
-    <w:p>
-      <w:pPr>
-        <w:pStyle w:val="ListParagraph"/>
-        <w:numPr>
-          <w:ilvl w:val="1"/>
-          <w:numId w:val="21"/>
-        </w:numPr>
-        <w:rPr>
-          <w:lang w:bidi="ar-EG"/>
-        </w:rPr>
-      </w:pPr>
-      <w:r>
-        <w:rPr>
-          <w:lang w:bidi="ar-EG"/>
-        </w:rPr>
-        <w:t>Round the result up to the nearest 10</w:t>
-      </w:r>
-    </w:p>
-    <w:p>
-      <w:pPr>
-        <w:pStyle w:val="ListParagraph"/>
-        <w:numPr>
-          <w:ilvl w:val="0"/>
-          <w:numId w:val="21"/>
-        </w:numPr>
-        <w:rPr>
-          <w:lang w:bidi="ar-EG"/>
-        </w:rPr>
-      </w:pPr>
-      <w:r>
-        <w:rPr>
-          <w:lang w:bidi="ar-EG"/>
-        </w:rPr>
-        <w:t>Upon clicking calculate button;</w:t>
-      </w:r>
-    </w:p>
-    <w:p>
-      <w:pPr>
-        <w:pStyle w:val="ListParagraph"/>
-        <w:numPr>
-          <w:ilvl w:val="1"/>
-          <w:numId w:val="21"/>
-        </w:numPr>
-        <w:rPr>
-          <w:lang w:bidi="ar-EG"/>
-        </w:rPr>
-      </w:pPr>
-      <w:r>
-        <w:rPr>
-          <w:lang w:bidi="ar-EG"/>
-        </w:rPr>
-        <w:t>Calculate and show the Selling Price</w:t>
-      </w:r>
-    </w:p>
-    <w:p>
-      <w:pPr>
-        <w:pStyle w:val="ListParagraph"/>
-        <w:numPr>
-          <w:ilvl w:val="1"/>
-          <w:numId w:val="21"/>
-        </w:numPr>
-        <w:rPr>
-          <w:lang w:bidi="ar-EG"/>
-        </w:rPr>
-      </w:pPr>
-      <w:r>
-        <w:rPr>
-          <w:lang w:bidi="ar-EG"/>
-        </w:rPr>
-        <w:t>Register calculation inputs and output and user into history</w:t>
-      </w:r>
-    </w:p>
-    <w:p>
-      <w:pPr>
-        <w:pStyle w:val="ListParagraph"/>
-        <w:numPr>
-          <w:ilvl w:val="0"/>
-          <w:numId w:val="21"/>
-        </w:numPr>
-        <w:rPr>
-          <w:lang w:bidi="ar-EG"/>
-        </w:rPr>
-      </w:pPr>
-    </w:p>
-    <w:p>
-      <w:pPr>
-        <w:pStyle w:val="ListParagraph"/>
-        <w:numPr>
-          <w:ilvl w:val="0"/>
-          <w:numId w:val="20"/>
-        </w:numPr>
-      </w:pPr>
-      <w:r>
-        <w:t>Devices – identical to supplements section</w:t>
-      </w:r>
-      <w:r>
-        <w:t xml:space="preserve"> – but </w:t>
-      </w:r>
-    </w:p>
-    <w:p>
-      <w:pPr>
-        <w:pStyle w:val="ListParagraph"/>
-        <w:numPr>
-          <w:ilvl w:val="0"/>
-          <w:numId w:val="20"/>
-        </w:numPr>
-      </w:pPr>
-      <w:r>
-        <w:t>History – list of all calculation stamped by date, time and user</w:t>
-      </w:r>
-      <w:r>
-        <w:br/>
-      </w:r>
-      <w:r>
-        <w:br/>
-      </w:r>
-      <w:r>
-        <w:br/>
-      </w:r>
-    </w:p>
-    <w:p>
-      <w:pPr>
-        <w:pStyle w:val="ListParagraph"/>
-        <w:numPr>
-          <w:ilvl w:val="0"/>
-          <w:numId w:val="20"/>
-        </w:numPr>
-      </w:pPr>
-    </w:p>
-    <w:p>
-      <w:pPr>
-        <w:pStyle w:val="ListParagraph"/>
-        <w:numPr>
-          <w:ilvl w:val="0"/>
-          <w:numId w:val="20"/>
-        </w:numPr>
-      </w:pPr>
-    </w:p>
-    <w:p>
-      <w:pPr>
-        <w:pStyle w:val="ListParagraph"/>
-        <w:numPr>
-          <w:ilvl w:val="0"/>
-          <w:numId w:val="20"/>
-        </w:numPr>
-      </w:pPr>
-    </w:p>
-    <w:p>
-      <w:pPr>
-        <w:pStyle w:val="ListParagraph"/>
-        <w:numPr>
-          <w:ilvl w:val="0"/>
-          <w:numId w:val="20"/>
-        </w:numPr>
-      </w:pPr>
-    </w:p>
-    <w:p>
-      <w:pPr>
-        <w:pStyle w:val="ListParagraph"/>
-        <w:numPr>
-          <w:ilvl w:val="0"/>
-          <w:numId w:val="20"/>
-        </w:numPr>
-      </w:pPr>
-    </w:p>
-    <w:p>
-      <w:pPr>
-        <w:pStyle w:val="ListParagraph"/>
-        <w:numPr>
-          <w:ilvl w:val="2"/>
-          <w:numId w:val="20"/>
-        </w:numPr>
-        <w:rPr>
-          <w:lang w:bidi="ar-EG"/>
-        </w:rPr>
-      </w:pPr>
-      <w:r>
-        <w:rPr>
-          <w:lang w:bidi="ar-EG"/>
-        </w:rPr>
-        <w:t>Dosage Cost [symbol in calculation formula ‘GC’]</w:t>
-      </w:r>
-    </w:p>
-    <w:p>
-      <w:pPr>
-        <w:pStyle w:val="ListParagraph"/>
-        <w:numPr>
-          <w:ilvl w:val="2"/>
-          <w:numId w:val="20"/>
-        </w:numPr>
-        <w:rPr>
-          <w:lang w:bidi="ar-EG"/>
-        </w:rPr>
-      </w:pPr>
-      <w:r>
-        <w:rPr>
-          <w:lang w:bidi="ar-EG"/>
-        </w:rPr>
-        <w:t xml:space="preserve">if days equal 1 to </w:t>
-      </w:r>
-      <w:proofErr w:type="gramStart"/>
-      <w:r>
-        <w:rPr>
-          <w:lang w:bidi="ar-EG"/>
-        </w:rPr>
-        <w:t>30 ,</w:t>
-      </w:r>
-      <w:proofErr w:type="gramEnd"/>
-      <w:r>
-        <w:rPr>
-          <w:lang w:bidi="ar-EG"/>
-        </w:rPr>
-        <w:t xml:space="preserve"> then G = 3 then GC=0</w:t>
-      </w:r>
-    </w:p>
-    <w:p>
-      <w:pPr>
-        <w:pStyle w:val="ListParagraph"/>
-        <w:numPr>
-          <w:ilvl w:val="2"/>
-          <w:numId w:val="20"/>
-        </w:numPr>
-        <w:rPr>
-          <w:lang w:bidi="ar-EG"/>
-        </w:rPr>
-      </w:pPr>
-      <w:r>
-        <w:rPr>
-          <w:lang w:bidi="ar-EG"/>
-        </w:rPr>
-        <w:t xml:space="preserve">if days equal 31 to </w:t>
-      </w:r>
-      <w:proofErr w:type="gramStart"/>
-      <w:r>
-        <w:rPr>
-          <w:lang w:bidi="ar-EG"/>
-        </w:rPr>
-        <w:t>60 ,</w:t>
-      </w:r>
-      <w:proofErr w:type="gramEnd"/>
-      <w:r>
-        <w:rPr>
-          <w:lang w:bidi="ar-EG"/>
-        </w:rPr>
-        <w:t xml:space="preserve"> then G = 2</w:t>
-      </w:r>
-      <w:r>
-        <w:rPr>
-          <w:lang w:bidi="ar-EG"/>
-        </w:rPr>
-        <w:t xml:space="preserve"> </w:t>
-      </w:r>
-      <w:r>
-        <w:rPr>
-          <w:lang w:bidi="ar-EG"/>
-        </w:rPr>
-        <w:t>then GC=31</w:t>
-      </w:r>
-    </w:p>
-    <w:p>
-      <w:pPr>
-        <w:pStyle w:val="ListParagraph"/>
-        <w:numPr>
-          <w:ilvl w:val="2"/>
-          <w:numId w:val="20"/>
-        </w:numPr>
-        <w:rPr>
-          <w:lang w:bidi="ar-EG"/>
-        </w:rPr>
-      </w:pPr>
-      <w:r>
-        <w:rPr>
-          <w:lang w:bidi="ar-EG"/>
-        </w:rPr>
-        <w:t xml:space="preserve">if days more than </w:t>
-      </w:r>
-      <w:proofErr w:type="gramStart"/>
-      <w:r>
-        <w:rPr>
-          <w:lang w:bidi="ar-EG"/>
-        </w:rPr>
-        <w:t>60 ,</w:t>
-      </w:r>
-      <w:proofErr w:type="gramEnd"/>
-      <w:r>
-        <w:rPr>
-          <w:lang w:bidi="ar-EG"/>
-        </w:rPr>
-        <w:t xml:space="preserve"> then G = 1</w:t>
-      </w:r>
-      <w:r>
-        <w:rPr>
-          <w:lang w:bidi="ar-EG"/>
-        </w:rPr>
-        <w:t xml:space="preserve"> </w:t>
-      </w:r>
-      <w:r>
-        <w:rPr>
-          <w:lang w:bidi="ar-EG"/>
-        </w:rPr>
-        <w:t>then GC=62</w:t>
-      </w:r>
-    </w:p>
-    <w:p>
-      <w:pPr>
-        <w:pStyle w:val="ListParagraph"/>
-        <w:numPr>
-          <w:ilvl w:val="0"/>
-          <w:numId w:val="20"/>
-        </w:numPr>
-      </w:pPr>
-      <w:r>
-        <w:br/>
-      </w:r>
-      <w:r>
-        <w:br/>
-        <w:t>Expenses Module</w:t>
-      </w:r>
-    </w:p>
-    <w:p/>
     <w:sectPr>
       <w:pgSz w:w="12240" w:h="15840"/>
       <w:pgMar w:top="1440" w:right="1440" w:bottom="1440" w:left="1440" w:header="720" w:footer="720" w:gutter="0"/>
@@ -5302,6 +4314,119 @@
     </w:lvl>
   </w:abstractNum>
   <w:abstractNum w:abstractNumId="11" w15:restartNumberingAfterBreak="0">
+    <w:nsid w:val="3A1033EC"/>
+    <w:multiLevelType w:val="hybridMultilevel"/>
+    <w:tmpl w:val="C29696E8"/>
+    <w:lvl w:ilvl="0" w:tplc="70803C8A">
+      <w:start w:val="1"/>
+      <w:numFmt w:val="bullet"/>
+      <w:lvlText w:val="-"/>
+      <w:lvlJc w:val="left"/>
+      <w:pPr>
+        <w:ind w:left="720" w:hanging="360"/>
+      </w:pPr>
+      <w:rPr>
+        <w:rFonts w:ascii="Aptos" w:eastAsiaTheme="minorHAnsi" w:hAnsi="Aptos" w:cstheme="minorBidi" w:hint="default"/>
+      </w:rPr>
+    </w:lvl>
+    <w:lvl w:ilvl="1" w:tplc="04090003" w:tentative="1">
+      <w:start w:val="1"/>
+      <w:numFmt w:val="bullet"/>
+      <w:lvlText w:val="o"/>
+      <w:lvlJc w:val="left"/>
+      <w:pPr>
+        <w:ind w:left="1440" w:hanging="360"/>
+      </w:pPr>
+      <w:rPr>
+        <w:rFonts w:ascii="Courier New" w:hAnsi="Courier New" w:cs="Courier New" w:hint="default"/>
+      </w:rPr>
+    </w:lvl>
+    <w:lvl w:ilvl="2" w:tplc="04090005" w:tentative="1">
+      <w:start w:val="1"/>
+      <w:numFmt w:val="bullet"/>
+      <w:lvlText w:val=""/>
+      <w:lvlJc w:val="left"/>
+      <w:pPr>
+        <w:ind w:left="2160" w:hanging="360"/>
+      </w:pPr>
+      <w:rPr>
+        <w:rFonts w:ascii="Wingdings" w:hAnsi="Wingdings" w:hint="default"/>
+      </w:rPr>
+    </w:lvl>
+    <w:lvl w:ilvl="3" w:tplc="04090001" w:tentative="1">
+      <w:start w:val="1"/>
+      <w:numFmt w:val="bullet"/>
+      <w:lvlText w:val=""/>
+      <w:lvlJc w:val="left"/>
+      <w:pPr>
+        <w:ind w:left="2880" w:hanging="360"/>
+      </w:pPr>
+      <w:rPr>
+        <w:rFonts w:ascii="Symbol" w:hAnsi="Symbol" w:hint="default"/>
+      </w:rPr>
+    </w:lvl>
+    <w:lvl w:ilvl="4" w:tplc="04090003" w:tentative="1">
+      <w:start w:val="1"/>
+      <w:numFmt w:val="bullet"/>
+      <w:lvlText w:val="o"/>
+      <w:lvlJc w:val="left"/>
+      <w:pPr>
+        <w:ind w:left="3600" w:hanging="360"/>
+      </w:pPr>
+      <w:rPr>
+        <w:rFonts w:ascii="Courier New" w:hAnsi="Courier New" w:cs="Courier New" w:hint="default"/>
+      </w:rPr>
+    </w:lvl>
+    <w:lvl w:ilvl="5" w:tplc="04090005" w:tentative="1">
+      <w:start w:val="1"/>
+      <w:numFmt w:val="bullet"/>
+      <w:lvlText w:val=""/>
+      <w:lvlJc w:val="left"/>
+      <w:pPr>
+        <w:ind w:left="4320" w:hanging="360"/>
+      </w:pPr>
+      <w:rPr>
+        <w:rFonts w:ascii="Wingdings" w:hAnsi="Wingdings" w:hint="default"/>
+      </w:rPr>
+    </w:lvl>
+    <w:lvl w:ilvl="6" w:tplc="04090001" w:tentative="1">
+      <w:start w:val="1"/>
+      <w:numFmt w:val="bullet"/>
+      <w:lvlText w:val=""/>
+      <w:lvlJc w:val="left"/>
+      <w:pPr>
+        <w:ind w:left="5040" w:hanging="360"/>
+      </w:pPr>
+      <w:rPr>
+        <w:rFonts w:ascii="Symbol" w:hAnsi="Symbol" w:hint="default"/>
+      </w:rPr>
+    </w:lvl>
+    <w:lvl w:ilvl="7" w:tplc="04090003" w:tentative="1">
+      <w:start w:val="1"/>
+      <w:numFmt w:val="bullet"/>
+      <w:lvlText w:val="o"/>
+      <w:lvlJc w:val="left"/>
+      <w:pPr>
+        <w:ind w:left="5760" w:hanging="360"/>
+      </w:pPr>
+      <w:rPr>
+        <w:rFonts w:ascii="Courier New" w:hAnsi="Courier New" w:cs="Courier New" w:hint="default"/>
+      </w:rPr>
+    </w:lvl>
+    <w:lvl w:ilvl="8" w:tplc="04090005" w:tentative="1">
+      <w:start w:val="1"/>
+      <w:numFmt w:val="bullet"/>
+      <w:lvlText w:val=""/>
+      <w:lvlJc w:val="left"/>
+      <w:pPr>
+        <w:ind w:left="6480" w:hanging="360"/>
+      </w:pPr>
+      <w:rPr>
+        <w:rFonts w:ascii="Wingdings" w:hAnsi="Wingdings" w:hint="default"/>
+      </w:rPr>
+    </w:lvl>
+  </w:abstractNum>
+  <w:abstractNum w:abstractNumId="12" w15:restartNumberingAfterBreak="0">
     <w:nsid w:val="3BAD0B6B"/>
     <w:multiLevelType w:val="hybridMultilevel"/>
     <w:tmpl w:val="A0928DC6"/>
@@ -5414,7 +4539,7 @@
       </w:rPr>
     </w:lvl>
   </w:abstractNum>
-  <w:abstractNum w:abstractNumId="12" w15:restartNumberingAfterBreak="0">
+  <w:abstractNum w:abstractNumId="13" w15:restartNumberingAfterBreak="0">
     <w:nsid w:val="3FF54E8A"/>
     <w:multiLevelType w:val="hybridMultilevel"/>
     <w:tmpl w:val="5E344400"/>
@@ -5503,7 +4628,7 @@
       </w:pPr>
     </w:lvl>
   </w:abstractNum>
-  <w:abstractNum w:abstractNumId="13" w15:restartNumberingAfterBreak="0">
+  <w:abstractNum w:abstractNumId="14" w15:restartNumberingAfterBreak="0">
     <w:nsid w:val="42CF3E2F"/>
     <w:multiLevelType w:val="hybridMultilevel"/>
     <w:tmpl w:val="E6D65468"/>
@@ -5616,7 +4741,7 @@
       </w:rPr>
     </w:lvl>
   </w:abstractNum>
-  <w:abstractNum w:abstractNumId="14" w15:restartNumberingAfterBreak="0">
+  <w:abstractNum w:abstractNumId="15" w15:restartNumberingAfterBreak="0">
     <w:nsid w:val="45EC2CC5"/>
     <w:multiLevelType w:val="hybridMultilevel"/>
     <w:tmpl w:val="978C5BB8"/>
@@ -5705,7 +4830,7 @@
       </w:pPr>
     </w:lvl>
   </w:abstractNum>
-  <w:abstractNum w:abstractNumId="15" w15:restartNumberingAfterBreak="0">
+  <w:abstractNum w:abstractNumId="16" w15:restartNumberingAfterBreak="0">
     <w:nsid w:val="48732311"/>
     <w:multiLevelType w:val="hybridMultilevel"/>
     <w:tmpl w:val="03565E9C"/>
@@ -5818,7 +4943,7 @@
       </w:rPr>
     </w:lvl>
   </w:abstractNum>
-  <w:abstractNum w:abstractNumId="16" w15:restartNumberingAfterBreak="0">
+  <w:abstractNum w:abstractNumId="17" w15:restartNumberingAfterBreak="0">
     <w:nsid w:val="54395ECA"/>
     <w:multiLevelType w:val="hybridMultilevel"/>
     <w:tmpl w:val="4DB6B126"/>
@@ -5907,7 +5032,7 @@
       </w:pPr>
     </w:lvl>
   </w:abstractNum>
-  <w:abstractNum w:abstractNumId="17" w15:restartNumberingAfterBreak="0">
+  <w:abstractNum w:abstractNumId="18" w15:restartNumberingAfterBreak="0">
     <w:nsid w:val="5EC321D4"/>
     <w:multiLevelType w:val="hybridMultilevel"/>
     <w:tmpl w:val="6E3ED2EA"/>
@@ -5996,7 +5121,7 @@
       </w:pPr>
     </w:lvl>
   </w:abstractNum>
-  <w:abstractNum w:abstractNumId="18" w15:restartNumberingAfterBreak="0">
+  <w:abstractNum w:abstractNumId="19" w15:restartNumberingAfterBreak="0">
     <w:nsid w:val="5F517413"/>
     <w:multiLevelType w:val="hybridMultilevel"/>
     <w:tmpl w:val="7CB0D35A"/>
@@ -6109,7 +5234,7 @@
       </w:rPr>
     </w:lvl>
   </w:abstractNum>
-  <w:abstractNum w:abstractNumId="19" w15:restartNumberingAfterBreak="0">
+  <w:abstractNum w:abstractNumId="20" w15:restartNumberingAfterBreak="0">
     <w:nsid w:val="5F772985"/>
     <w:multiLevelType w:val="hybridMultilevel"/>
     <w:tmpl w:val="20525B26"/>
@@ -6195,7 +5320,7 @@
       </w:pPr>
     </w:lvl>
   </w:abstractNum>
-  <w:abstractNum w:abstractNumId="20" w15:restartNumberingAfterBreak="0">
+  <w:abstractNum w:abstractNumId="21" w15:restartNumberingAfterBreak="0">
     <w:nsid w:val="64B413BB"/>
     <w:multiLevelType w:val="hybridMultilevel"/>
     <w:tmpl w:val="96A6D232"/>
@@ -6284,7 +5409,7 @@
       </w:pPr>
     </w:lvl>
   </w:abstractNum>
-  <w:abstractNum w:abstractNumId="21" w15:restartNumberingAfterBreak="0">
+  <w:abstractNum w:abstractNumId="22" w15:restartNumberingAfterBreak="0">
     <w:nsid w:val="6A7C5CB3"/>
     <w:multiLevelType w:val="hybridMultilevel"/>
     <w:tmpl w:val="5C9C4FC4"/>
@@ -6396,7 +5521,7 @@
       </w:rPr>
     </w:lvl>
   </w:abstractNum>
-  <w:abstractNum w:abstractNumId="22" w15:restartNumberingAfterBreak="0">
+  <w:abstractNum w:abstractNumId="23" w15:restartNumberingAfterBreak="0">
     <w:nsid w:val="702E6DD6"/>
     <w:multiLevelType w:val="hybridMultilevel"/>
     <w:tmpl w:val="04B4B522"/>
@@ -6485,7 +5610,7 @@
       </w:pPr>
     </w:lvl>
   </w:abstractNum>
-  <w:abstractNum w:abstractNumId="23" w15:restartNumberingAfterBreak="0">
+  <w:abstractNum w:abstractNumId="24" w15:restartNumberingAfterBreak="0">
     <w:nsid w:val="71173C80"/>
     <w:multiLevelType w:val="hybridMultilevel"/>
     <w:tmpl w:val="8EE696F2"/>
@@ -6598,7 +5723,7 @@
       </w:rPr>
     </w:lvl>
   </w:abstractNum>
-  <w:abstractNum w:abstractNumId="24" w15:restartNumberingAfterBreak="0">
+  <w:abstractNum w:abstractNumId="25" w15:restartNumberingAfterBreak="0">
     <w:nsid w:val="7D9D3417"/>
     <w:multiLevelType w:val="hybridMultilevel"/>
     <w:tmpl w:val="03367ED8"/>
@@ -6688,7 +5813,7 @@
     </w:lvl>
   </w:abstractNum>
   <w:num w:numId="1" w16cid:durableId="1193694031">
-    <w:abstractNumId w:val="21"/>
+    <w:abstractNumId w:val="22"/>
   </w:num>
   <w:num w:numId="2" w16cid:durableId="1230458739">
     <w:abstractNumId w:val="1"/>
@@ -6697,7 +5822,7 @@
     <w:abstractNumId w:val="2"/>
   </w:num>
   <w:num w:numId="4" w16cid:durableId="878856215">
-    <w:abstractNumId w:val="19"/>
+    <w:abstractNumId w:val="20"/>
   </w:num>
   <w:num w:numId="5" w16cid:durableId="1894077811">
     <w:abstractNumId w:val="6"/>
@@ -6706,10 +5831,10 @@
     <w:abstractNumId w:val="5"/>
   </w:num>
   <w:num w:numId="7" w16cid:durableId="1913928248">
-    <w:abstractNumId w:val="18"/>
+    <w:abstractNumId w:val="19"/>
   </w:num>
   <w:num w:numId="8" w16cid:durableId="1499349636">
-    <w:abstractNumId w:val="13"/>
+    <w:abstractNumId w:val="14"/>
   </w:num>
   <w:num w:numId="9" w16cid:durableId="1114789797">
     <w:abstractNumId w:val="0"/>
@@ -6721,46 +5846,49 @@
     <w:abstractNumId w:val="10"/>
   </w:num>
   <w:num w:numId="12" w16cid:durableId="2131852888">
-    <w:abstractNumId w:val="20"/>
+    <w:abstractNumId w:val="21"/>
   </w:num>
   <w:num w:numId="13" w16cid:durableId="2088113893">
-    <w:abstractNumId w:val="15"/>
+    <w:abstractNumId w:val="16"/>
   </w:num>
   <w:num w:numId="14" w16cid:durableId="848449906">
-    <w:abstractNumId w:val="11"/>
+    <w:abstractNumId w:val="12"/>
   </w:num>
   <w:num w:numId="15" w16cid:durableId="1511139773">
-    <w:abstractNumId w:val="22"/>
+    <w:abstractNumId w:val="23"/>
   </w:num>
   <w:num w:numId="16" w16cid:durableId="148637161">
-    <w:abstractNumId w:val="24"/>
+    <w:abstractNumId w:val="25"/>
   </w:num>
   <w:num w:numId="17" w16cid:durableId="1011494376">
-    <w:abstractNumId w:val="14"/>
+    <w:abstractNumId w:val="15"/>
   </w:num>
   <w:num w:numId="18" w16cid:durableId="1846704498">
     <w:abstractNumId w:val="3"/>
   </w:num>
   <w:num w:numId="19" w16cid:durableId="1249265432">
-    <w:abstractNumId w:val="17"/>
+    <w:abstractNumId w:val="18"/>
   </w:num>
   <w:num w:numId="20" w16cid:durableId="1135560392">
     <w:abstractNumId w:val="9"/>
   </w:num>
   <w:num w:numId="21" w16cid:durableId="1421294308">
-    <w:abstractNumId w:val="16"/>
+    <w:abstractNumId w:val="17"/>
   </w:num>
   <w:num w:numId="22" w16cid:durableId="44064616">
     <w:abstractNumId w:val="8"/>
   </w:num>
   <w:num w:numId="23" w16cid:durableId="763112585">
-    <w:abstractNumId w:val="23"/>
+    <w:abstractNumId w:val="24"/>
   </w:num>
   <w:num w:numId="24" w16cid:durableId="492573669">
     <w:abstractNumId w:val="4"/>
   </w:num>
   <w:num w:numId="25" w16cid:durableId="1278292986">
-    <w:abstractNumId w:val="12"/>
+    <w:abstractNumId w:val="13"/>
+  </w:num>
+  <w:num w:numId="26" w16cid:durableId="1263995368">
+    <w:abstractNumId w:val="11"/>
   </w:num>
 </w:numbering>
 </file>

</xml_diff>